<commit_message>
Update supervisor report for methodology tasks
</commit_message>
<xml_diff>
--- a/MATHREPAIR_SUPERVISOR_PROGRESS_REPORT.docx
+++ b/MATHREPAIR_SUPERVISOR_PROGRESS_REPORT.docx
@@ -59,19 +59,7 @@
         </w:rPr>
       </w:pPr>
       <w:r>
-        <w:rPr>
-          <w:rFonts w:ascii="Times New Roman" w:hAnsi="Times New Roman" w:cs="Times New Roman"/>
-          <w:sz w:val="24"/>
-          <w:szCs w:val="24"/>
-        </w:rPr>
-        <w:t>Research progress review | September 2026</w:t>
-      </w:r>
-      <w:r>
-        <w:rPr>
-          <w:rFonts w:ascii="Times New Roman" w:hAnsi="Times New Roman" w:cs="Times New Roman"/>
-          <w:sz w:val="24"/>
-          <w:szCs w:val="24"/>
-        </w:rPr>
+        <w:t>Research progress review | Updated 23 September 2026</w:t>
         <w:br/>
         <w:t>Repository: https://github.com/mwanajh/MathRepair_Project</w:t>
       </w:r>
@@ -102,30 +90,7 @@
         </w:rPr>
       </w:pPr>
       <w:r>
-        <w:rPr>
-          <w:rFonts w:ascii="Times New Roman" w:hAnsi="Times New Roman" w:cs="Times New Roman"/>
-          <w:sz w:val="24"/>
-          <w:szCs w:val="24"/>
-        </w:rPr>
-        <w:t xml:space="preserve">This work implements and evaluates a </w:t>
-      </w:r>
-      <w:proofErr w:type="spellStart"/>
-      <w:r>
-        <w:rPr>
-          <w:rFonts w:ascii="Times New Roman" w:hAnsi="Times New Roman" w:cs="Times New Roman"/>
-          <w:sz w:val="24"/>
-          <w:szCs w:val="24"/>
-        </w:rPr>
-        <w:t>MathRepair</w:t>
-      </w:r>
-      <w:proofErr w:type="spellEnd"/>
-      <w:r>
-        <w:rPr>
-          <w:rFonts w:ascii="Times New Roman" w:hAnsi="Times New Roman" w:cs="Times New Roman"/>
-          <w:sz w:val="24"/>
-          <w:szCs w:val="24"/>
-        </w:rPr>
-        <w:t xml:space="preserve"> prototype that verifies intermediate mathematical reasoning, localizes the first invalid state, repairs the affected portion, and verifies the output again. In the primary 36-problem algebra evaluation, verified local repair achieved 100.0% answer accuracy and 100.0% valid traces, compared with 92.6% for verified global regeneration. The paired local-minus-global answer difference was +7.4 percentage points with a 95% confidence interval of [+3.4, +11.4].</w:t>
+        <w:t>MathRepair now connects model-generated traces directly to its reasoning graph and includes a 40-problem MATH-500 pilot, a frozen eight-class error taxonomy, a 48-example typed-verifier dataset, a fresh three-arm matched-budget pilot, a frozen ablation matrix, and a versioned archive of 432 raw outputs. The earlier expanded algebra experiment found 100.0% local-repair accuracy versus 92.6% global regeneration. A newer and stricter total-budget pilot found 88.9% for global regeneration and 86.1% for both local arms. These protocols answer different questions, so the report does not claim universal local-repair superiority.</w:t>
       </w:r>
     </w:p>
     <w:p>
@@ -140,21 +105,7 @@
         </w:rPr>
       </w:pPr>
       <w:r>
-        <w:rPr>
-          <w:rFonts w:ascii="Times New Roman" w:hAnsi="Times New Roman" w:cs="Times New Roman"/>
-          <w:b/>
-          <w:sz w:val="24"/>
-          <w:szCs w:val="24"/>
-        </w:rPr>
-        <w:t xml:space="preserve">Defensible claim: </w:t>
-      </w:r>
-      <w:r>
-        <w:rPr>
-          <w:rFonts w:ascii="Times New Roman" w:hAnsi="Times New Roman" w:cs="Times New Roman"/>
-          <w:sz w:val="24"/>
-          <w:szCs w:val="24"/>
-        </w:rPr>
-        <w:t>In a controlled one-variable symbolic-algebra pilot, verified local repair outperformed verified global regeneration under a matched per-error budget.</w:t>
+        <w:t>Defensible claim: The proposal-level experimental infrastructure is now implemented and produces reproducible, mixed results. Local repair led in the earlier expanded pilot, while global regeneration led by 2.8 percentage points in the fresh total-token-matched pilot.</w:t>
       </w:r>
     </w:p>
     <w:p>
@@ -2831,12 +2782,7 @@
         </w:rPr>
       </w:pPr>
       <w:r>
-        <w:rPr>
-          <w:rFonts w:ascii="Times New Roman" w:hAnsi="Times New Roman" w:cs="Times New Roman"/>
-          <w:sz w:val="24"/>
-          <w:szCs w:val="24"/>
-        </w:rPr>
-        <w:t>Executable symbolic verifier and repair pipeline with 93 passing tests.</w:t>
+        <w:t>Executable graph-based verifier and repair pipeline with 128 passing tests.</w:t>
       </w:r>
     </w:p>
     <w:p>
@@ -2960,30 +2906,7 @@
         </w:rPr>
       </w:pPr>
       <w:r>
-        <w:rPr>
-          <w:rFonts w:ascii="Times New Roman" w:hAnsi="Times New Roman" w:cs="Times New Roman"/>
-          <w:sz w:val="24"/>
-          <w:szCs w:val="24"/>
-        </w:rPr>
-        <w:t xml:space="preserve">The complete proposal experiment is not yet finished. The current work is a reproducible pilot and engineering proof-of-concept. It does not yet include proposal-scale benchmarks such as MATH-500 or </w:t>
-      </w:r>
-      <w:proofErr w:type="spellStart"/>
-      <w:r>
-        <w:rPr>
-          <w:rFonts w:ascii="Times New Roman" w:hAnsi="Times New Roman" w:cs="Times New Roman"/>
-          <w:sz w:val="24"/>
-          <w:szCs w:val="24"/>
-        </w:rPr>
-        <w:t>OlympiadBench</w:t>
-      </w:r>
-      <w:proofErr w:type="spellEnd"/>
-      <w:r>
-        <w:rPr>
-          <w:rFonts w:ascii="Times New Roman" w:hAnsi="Times New Roman" w:cs="Times New Roman"/>
-          <w:sz w:val="24"/>
-          <w:szCs w:val="24"/>
-        </w:rPr>
-        <w:t>, all planned baselines and ablations, a learned calibrated verifier, or an integrated accuracy-compute Pareto evaluation. The primary model experiment still uses mainly linear traces, while the branching graph is demonstrated separately.</w:t>
+        <w:t>The complete proposal experiment is not yet finished. The project now includes a 40-problem MATH-500 level-4/5 processing pilot, a frozen six-row ablation design, and graph-integrated model traces. However, the MATH-500 run is currently a text-processing smoke test rather than an accuracy evaluation; the learned calibrated verifier is not trained; three ablation cells remain unmeasured; and the fresh matched-budget result is based on only 36 runs and seven detected errors.</w:t>
       </w:r>
     </w:p>
     <w:p>
@@ -3034,12 +2957,7 @@
         </w:rPr>
       </w:pPr>
       <w:r>
-        <w:rPr>
-          <w:rFonts w:ascii="Times New Roman" w:hAnsi="Times New Roman" w:cs="Times New Roman"/>
-          <w:sz w:val="24"/>
-          <w:szCs w:val="24"/>
-        </w:rPr>
-        <w:t>Freeze the graph schema, typed-error taxonomy, and adaptive-allocation specification.</w:t>
+        <w:t>Train and calibrate the learned typed verifier using the controlled pilot schema and additional natural errors.</w:t>
       </w:r>
     </w:p>
     <w:p>
@@ -3053,12 +2971,7 @@
         </w:rPr>
       </w:pPr>
       <w:r>
-        <w:rPr>
-          <w:rFonts w:ascii="Times New Roman" w:hAnsi="Times New Roman" w:cs="Times New Roman"/>
-          <w:sz w:val="24"/>
-          <w:szCs w:val="24"/>
-        </w:rPr>
-        <w:t>Benchmark graph-based localization against a flat reasoning-chain baseline.</w:t>
+        <w:t>Run the no-graph and no-typed-error ablations on identical problems, seeds, prompts, and budgets.</w:t>
       </w:r>
     </w:p>
     <w:p>
@@ -3072,12 +2985,7 @@
         </w:rPr>
       </w:pPr>
       <w:r>
-        <w:rPr>
-          <w:rFonts w:ascii="Times New Roman" w:hAnsi="Times New Roman" w:cs="Times New Roman"/>
-          <w:sz w:val="24"/>
-          <w:szCs w:val="24"/>
-        </w:rPr>
-        <w:t>Add proposal-aligned datasets, planned baselines, and component ablations.</w:t>
+        <w:t>Run the 40-problem MATH-500 pilot with a real model and define answer evaluation for open-ended mathematics.</w:t>
       </w:r>
     </w:p>
     <w:p>
@@ -3091,12 +2999,7 @@
         </w:rPr>
       </w:pPr>
       <w:r>
-        <w:rPr>
-          <w:rFonts w:ascii="Times New Roman" w:hAnsi="Times New Roman" w:cs="Times New Roman"/>
-          <w:sz w:val="24"/>
-          <w:szCs w:val="24"/>
-        </w:rPr>
-        <w:t>Train and calibrate a learned verifier for localization and error classification.</w:t>
+        <w:t>Complete the no-symbolic-tool ablation after the learned verifier is available.</w:t>
       </w:r>
     </w:p>
     <w:p>
@@ -3110,12 +3013,7 @@
         </w:rPr>
       </w:pPr>
       <w:r>
-        <w:rPr>
-          <w:rFonts w:ascii="Times New Roman" w:hAnsi="Times New Roman" w:cs="Times New Roman"/>
-          <w:sz w:val="24"/>
-          <w:szCs w:val="24"/>
-        </w:rPr>
-        <w:t>Integrate adaptive compute into the evaluated pipeline and report accuracy-cost Pareto curves.</w:t>
+        <w:t>Repeat the three-arm matched-budget comparison on the hard benchmark pilot and report paired uncertainty.</w:t>
       </w:r>
     </w:p>
     <w:p>
@@ -3129,12 +3027,7 @@
         </w:rPr>
       </w:pPr>
       <w:r>
-        <w:rPr>
-          <w:rFonts w:ascii="Times New Roman" w:hAnsi="Times New Roman" w:cs="Times New Roman"/>
-          <w:sz w:val="24"/>
-          <w:szCs w:val="24"/>
-        </w:rPr>
-        <w:t>Repeat the primary comparison on broader and fully independent problem sets.</w:t>
+        <w:t>Keep prompt/parser sensitivity as supporting evidence while prioritizing the proposal-level methodology.</w:t>
       </w:r>
     </w:p>
     <w:p>
@@ -3664,9 +3557,1473 @@
         <w:t>Conclusion: the pilot supports continuing to the full proposal-scale evaluation, while keeping current claims limited to the tested algebra setting.</w:t>
       </w:r>
     </w:p>
+    <w:p>
+      <w:r>
+        <w:br w:type="page"/>
+      </w:r>
+    </w:p>
+    <w:p>
+      <w:r>
+        <w:br w:type="page"/>
+      </w:r>
+    </w:p>
+    <w:p>
+      <w:r>
+        <w:br w:type="page"/>
+      </w:r>
+    </w:p>
+    <w:p>
+      <w:pPr>
+        <w:pStyle w:val="Heading1"/>
+      </w:pPr>
+      <w:r>
+        <w:t>12. Supervisor Tasks 1-7 Completion Update</w:t>
+      </w:r>
+    </w:p>
+    <w:p>
+      <w:r>
+        <w:t>This section records the seven methodology tasks requested after the earlier progress review. It supersedes older status statements where the graph, benchmark pilot, and ablation plan were still pending.</w:t>
+      </w:r>
+    </w:p>
+    <w:tbl>
+      <w:tblPr>
+        <w:tblStyle w:val="TableGrid"/>
+        <w:tblW w:type="auto" w:w="0"/>
+        <w:tblLook w:firstColumn="1" w:firstRow="1" w:lastColumn="0" w:lastRow="0" w:noHBand="0" w:noVBand="1" w:val="04A0"/>
+      </w:tblPr>
+      <w:tblGrid>
+        <w:gridCol w:w="2592"/>
+        <w:gridCol w:w="2592"/>
+        <w:gridCol w:w="2592"/>
+        <w:gridCol w:w="2592"/>
+      </w:tblGrid>
+      <w:tr>
+        <w:tc>
+          <w:tcPr>
+            <w:tcW w:type="dxa" w:w="2592"/>
+          </w:tcPr>
+          <w:p>
+            <w:r/>
+            <w:r>
+              <w:rPr>
+                <w:b/>
+                <w:sz w:val="16"/>
+              </w:rPr>
+              <w:t>Task</w:t>
+            </w:r>
+          </w:p>
+        </w:tc>
+        <w:tc>
+          <w:tcPr>
+            <w:tcW w:type="dxa" w:w="2592"/>
+          </w:tcPr>
+          <w:p>
+            <w:r/>
+            <w:r>
+              <w:rPr>
+                <w:b/>
+                <w:sz w:val="16"/>
+              </w:rPr>
+              <w:t>Status</w:t>
+            </w:r>
+          </w:p>
+        </w:tc>
+        <w:tc>
+          <w:tcPr>
+            <w:tcW w:type="dxa" w:w="2592"/>
+          </w:tcPr>
+          <w:p>
+            <w:r/>
+            <w:r>
+              <w:rPr>
+                <w:b/>
+                <w:sz w:val="16"/>
+              </w:rPr>
+              <w:t>Evidence / current result</w:t>
+            </w:r>
+          </w:p>
+        </w:tc>
+        <w:tc>
+          <w:tcPr>
+            <w:tcW w:type="dxa" w:w="2592"/>
+          </w:tcPr>
+          <w:p>
+            <w:r/>
+            <w:r>
+              <w:rPr>
+                <w:b/>
+                <w:sz w:val="16"/>
+              </w:rPr>
+              <w:t>Artifact</w:t>
+            </w:r>
+          </w:p>
+        </w:tc>
+      </w:tr>
+      <w:tr>
+        <w:tc>
+          <w:tcPr>
+            <w:tcW w:type="dxa" w:w="2592"/>
+          </w:tcPr>
+          <w:p>
+            <w:r/>
+            <w:r>
+              <w:rPr>
+                <w:b w:val="0"/>
+                <w:sz w:val="16"/>
+              </w:rPr>
+              <w:t>1</w:t>
+            </w:r>
+          </w:p>
+        </w:tc>
+        <w:tc>
+          <w:tcPr>
+            <w:tcW w:type="dxa" w:w="2592"/>
+          </w:tcPr>
+          <w:p>
+            <w:r/>
+            <w:r>
+              <w:rPr>
+                <w:b w:val="0"/>
+                <w:sz w:val="16"/>
+              </w:rPr>
+              <w:t>Completed</w:t>
+            </w:r>
+          </w:p>
+        </w:tc>
+        <w:tc>
+          <w:tcPr>
+            <w:tcW w:type="dxa" w:w="2592"/>
+          </w:tcPr>
+          <w:p>
+            <w:r/>
+            <w:r>
+              <w:rPr>
+                <w:b w:val="0"/>
+                <w:sz w:val="16"/>
+              </w:rPr>
+              <w:t>Real model traces now use the reasoning graph internally. Each node stores state, parents, verification, error impact, repair, and final status.</w:t>
+            </w:r>
+          </w:p>
+        </w:tc>
+        <w:tc>
+          <w:tcPr>
+            <w:tcW w:type="dxa" w:w="2592"/>
+          </w:tcPr>
+          <w:p>
+            <w:r/>
+            <w:r>
+              <w:rPr>
+                <w:b w:val="0"/>
+                <w:sz w:val="16"/>
+              </w:rPr>
+              <w:t>model_pipeline.py; reasoning_graph.py</w:t>
+            </w:r>
+          </w:p>
+        </w:tc>
+      </w:tr>
+      <w:tr>
+        <w:tc>
+          <w:tcPr>
+            <w:tcW w:type="dxa" w:w="2592"/>
+          </w:tcPr>
+          <w:p>
+            <w:r/>
+            <w:r>
+              <w:rPr>
+                <w:b w:val="0"/>
+                <w:sz w:val="16"/>
+              </w:rPr>
+              <w:t>2</w:t>
+            </w:r>
+          </w:p>
+        </w:tc>
+        <w:tc>
+          <w:tcPr>
+            <w:tcW w:type="dxa" w:w="2592"/>
+          </w:tcPr>
+          <w:p>
+            <w:r/>
+            <w:r>
+              <w:rPr>
+                <w:b w:val="0"/>
+                <w:sz w:val="16"/>
+              </w:rPr>
+              <w:t>Processing pilot completed</w:t>
+            </w:r>
+          </w:p>
+        </w:tc>
+        <w:tc>
+          <w:tcPr>
+            <w:tcW w:type="dxa" w:w="2592"/>
+          </w:tcPr>
+          <w:p>
+            <w:r/>
+            <w:r>
+              <w:rPr>
+                <w:b w:val="0"/>
+                <w:sz w:val="16"/>
+              </w:rPr>
+              <w:t>A deterministic 40-problem MATH-500 subset has 17 level-4 and 23 level-5 problems across seven subjects. The smoke test processed 40/40 in text_unverified mode.</w:t>
+            </w:r>
+          </w:p>
+        </w:tc>
+        <w:tc>
+          <w:tcPr>
+            <w:tcW w:type="dxa" w:w="2592"/>
+          </w:tcPr>
+          <w:p>
+            <w:r/>
+            <w:r>
+              <w:rPr>
+                <w:b w:val="0"/>
+                <w:sz w:val="16"/>
+              </w:rPr>
+              <w:t>math500_pilot_40_manifest.json</w:t>
+            </w:r>
+          </w:p>
+        </w:tc>
+      </w:tr>
+      <w:tr>
+        <w:tc>
+          <w:tcPr>
+            <w:tcW w:type="dxa" w:w="2592"/>
+          </w:tcPr>
+          <w:p>
+            <w:r/>
+            <w:r>
+              <w:rPr>
+                <w:b w:val="0"/>
+                <w:sz w:val="16"/>
+              </w:rPr>
+              <w:t>3</w:t>
+            </w:r>
+          </w:p>
+        </w:tc>
+        <w:tc>
+          <w:tcPr>
+            <w:tcW w:type="dxa" w:w="2592"/>
+          </w:tcPr>
+          <w:p>
+            <w:r/>
+            <w:r>
+              <w:rPr>
+                <w:b w:val="0"/>
+                <w:sz w:val="16"/>
+              </w:rPr>
+              <w:t>Completed</w:t>
+            </w:r>
+          </w:p>
+        </w:tc>
+        <w:tc>
+          <w:tcPr>
+            <w:tcW w:type="dxa" w:w="2592"/>
+          </w:tcPr>
+          <w:p>
+            <w:r/>
+            <w:r>
+              <w:rPr>
+                <w:b w:val="0"/>
+                <w:sz w:val="16"/>
+              </w:rPr>
+              <w:t>Eight typed errors are frozen with definitions, positive and negative examples, detection contracts, and repair actions.</w:t>
+            </w:r>
+          </w:p>
+        </w:tc>
+        <w:tc>
+          <w:tcPr>
+            <w:tcW w:type="dxa" w:w="2592"/>
+          </w:tcPr>
+          <w:p>
+            <w:r/>
+            <w:r>
+              <w:rPr>
+                <w:b w:val="0"/>
+                <w:sz w:val="16"/>
+              </w:rPr>
+              <w:t>ERROR_TAXONOMY.md</w:t>
+            </w:r>
+          </w:p>
+        </w:tc>
+      </w:tr>
+      <w:tr>
+        <w:tc>
+          <w:tcPr>
+            <w:tcW w:type="dxa" w:w="2592"/>
+          </w:tcPr>
+          <w:p>
+            <w:r/>
+            <w:r>
+              <w:rPr>
+                <w:b w:val="0"/>
+                <w:sz w:val="16"/>
+              </w:rPr>
+              <w:t>4</w:t>
+            </w:r>
+          </w:p>
+        </w:tc>
+        <w:tc>
+          <w:tcPr>
+            <w:tcW w:type="dxa" w:w="2592"/>
+          </w:tcPr>
+          <w:p>
+            <w:r/>
+            <w:r>
+              <w:rPr>
+                <w:b w:val="0"/>
+                <w:sz w:val="16"/>
+              </w:rPr>
+              <w:t>Controlled pilot completed</w:t>
+            </w:r>
+          </w:p>
+        </w:tc>
+        <w:tc>
+          <w:tcPr>
+            <w:tcW w:type="dxa" w:w="2592"/>
+          </w:tcPr>
+          <w:p>
+            <w:r/>
+            <w:r>
+              <w:rPr>
+                <w:b w:val="0"/>
+                <w:sz w:val="16"/>
+              </w:rPr>
+              <w:t>The data generator produced 48 typed-verifier examples, six per error type, with error location, corrupted/correct steps, and preferred action.</w:t>
+            </w:r>
+          </w:p>
+        </w:tc>
+        <w:tc>
+          <w:tcPr>
+            <w:tcW w:type="dxa" w:w="2592"/>
+          </w:tcPr>
+          <w:p>
+            <w:r/>
+            <w:r>
+              <w:rPr>
+                <w:b w:val="0"/>
+                <w:sz w:val="16"/>
+              </w:rPr>
+              <w:t>typed_verifier_pilot.json</w:t>
+            </w:r>
+          </w:p>
+        </w:tc>
+      </w:tr>
+      <w:tr>
+        <w:tc>
+          <w:tcPr>
+            <w:tcW w:type="dxa" w:w="2592"/>
+          </w:tcPr>
+          <w:p>
+            <w:r/>
+            <w:r>
+              <w:rPr>
+                <w:b w:val="0"/>
+                <w:sz w:val="16"/>
+              </w:rPr>
+              <w:t>5</w:t>
+            </w:r>
+          </w:p>
+        </w:tc>
+        <w:tc>
+          <w:tcPr>
+            <w:tcW w:type="dxa" w:w="2592"/>
+          </w:tcPr>
+          <w:p>
+            <w:r/>
+            <w:r>
+              <w:rPr>
+                <w:b w:val="0"/>
+                <w:sz w:val="16"/>
+              </w:rPr>
+              <w:t>Pilot completed</w:t>
+            </w:r>
+          </w:p>
+        </w:tc>
+        <w:tc>
+          <w:tcPr>
+            <w:tcW w:type="dxa" w:w="2592"/>
+          </w:tcPr>
+          <w:p>
+            <w:r/>
+            <w:r>
+              <w:rPr>
+                <w:b w:val="0"/>
+                <w:sz w:val="16"/>
+              </w:rPr>
+              <w:t>Under a shared approximately 5,800-token ceiling, global regeneration reached 88.9% answer accuracy; uniform and adaptive local repair each reached 86.1%. Budget violations: zero.</w:t>
+            </w:r>
+          </w:p>
+        </w:tc>
+        <w:tc>
+          <w:tcPr>
+            <w:tcW w:type="dxa" w:w="2592"/>
+          </w:tcPr>
+          <w:p>
+            <w:r/>
+            <w:r>
+              <w:rPr>
+                <w:b w:val="0"/>
+                <w:sz w:val="16"/>
+              </w:rPr>
+              <w:t>matched_budget_report.md</w:t>
+            </w:r>
+          </w:p>
+        </w:tc>
+      </w:tr>
+      <w:tr>
+        <w:tc>
+          <w:tcPr>
+            <w:tcW w:type="dxa" w:w="2592"/>
+          </w:tcPr>
+          <w:p>
+            <w:r/>
+            <w:r>
+              <w:rPr>
+                <w:b w:val="0"/>
+                <w:sz w:val="16"/>
+              </w:rPr>
+              <w:t>6</w:t>
+            </w:r>
+          </w:p>
+        </w:tc>
+        <w:tc>
+          <w:tcPr>
+            <w:tcW w:type="dxa" w:w="2592"/>
+          </w:tcPr>
+          <w:p>
+            <w:r/>
+            <w:r>
+              <w:rPr>
+                <w:b w:val="0"/>
+                <w:sz w:val="16"/>
+              </w:rPr>
+              <w:t>Structure frozen; partial results</w:t>
+            </w:r>
+          </w:p>
+        </w:tc>
+        <w:tc>
+          <w:tcPr>
+            <w:tcW w:type="dxa" w:w="2592"/>
+          </w:tcPr>
+          <w:p>
+            <w:r/>
+            <w:r>
+              <w:rPr>
+                <w:b w:val="0"/>
+                <w:sz w:val="16"/>
+              </w:rPr>
+              <w:t>Six ablation variants are defined: two measured, one rule-based proxy reference, and three pending or learned-verifier-dependent cells.</w:t>
+            </w:r>
+          </w:p>
+        </w:tc>
+        <w:tc>
+          <w:tcPr>
+            <w:tcW w:type="dxa" w:w="2592"/>
+          </w:tcPr>
+          <w:p>
+            <w:r/>
+            <w:r>
+              <w:rPr>
+                <w:b w:val="0"/>
+                <w:sz w:val="16"/>
+              </w:rPr>
+              <w:t>ablation_table.md</w:t>
+            </w:r>
+          </w:p>
+        </w:tc>
+      </w:tr>
+      <w:tr>
+        <w:tc>
+          <w:tcPr>
+            <w:tcW w:type="dxa" w:w="2592"/>
+          </w:tcPr>
+          <w:p>
+            <w:r/>
+            <w:r>
+              <w:rPr>
+                <w:b w:val="0"/>
+                <w:sz w:val="16"/>
+              </w:rPr>
+              <w:t>7</w:t>
+            </w:r>
+          </w:p>
+        </w:tc>
+        <w:tc>
+          <w:tcPr>
+            <w:tcW w:type="dxa" w:w="2592"/>
+          </w:tcPr>
+          <w:p>
+            <w:r/>
+            <w:r>
+              <w:rPr>
+                <w:b w:val="0"/>
+                <w:sz w:val="16"/>
+              </w:rPr>
+              <w:t>Completed</w:t>
+            </w:r>
+          </w:p>
+        </w:tc>
+        <w:tc>
+          <w:tcPr>
+            <w:tcW w:type="dxa" w:w="2592"/>
+          </w:tcPr>
+          <w:p>
+            <w:r/>
+            <w:r>
+              <w:rPr>
+                <w:b w:val="0"/>
+                <w:sz w:val="16"/>
+              </w:rPr>
+              <w:t>The archive preserves exact model digests, prompt/parser versions, 432 raw-output records, generation failures, trace hashes, and normalized accuracy for four configurations.</w:t>
+            </w:r>
+          </w:p>
+        </w:tc>
+        <w:tc>
+          <w:tcPr>
+            <w:tcW w:type="dxa" w:w="2592"/>
+          </w:tcPr>
+          <w:p>
+            <w:r/>
+            <w:r>
+              <w:rPr>
+                <w:b w:val="0"/>
+                <w:sz w:val="16"/>
+              </w:rPr>
+              <w:t>output_contract_evidence.md</w:t>
+            </w:r>
+          </w:p>
+        </w:tc>
+      </w:tr>
+    </w:tbl>
+    <w:p>
+      <w:pPr>
+        <w:pStyle w:val="Heading2"/>
+      </w:pPr>
+      <w:r>
+        <w:t>12.1 Fresh Matched-Budget Result</w:t>
+      </w:r>
+    </w:p>
+    <w:p>
+      <w:r>
+        <w:t>The fresh Task 5 run used 36 model calls as the initial sample, found seven error cases, and applied an approximately 5,800 additional-token ceiling to each repair strategy.</w:t>
+      </w:r>
+    </w:p>
+    <w:tbl>
+      <w:tblPr>
+        <w:tblStyle w:val="TableGrid"/>
+        <w:tblW w:type="auto" w:w="0"/>
+        <w:tblLook w:firstColumn="1" w:firstRow="1" w:lastColumn="0" w:lastRow="0" w:noHBand="0" w:noVBand="1" w:val="04A0"/>
+      </w:tblPr>
+      <w:tblGrid>
+        <w:gridCol w:w="1728"/>
+        <w:gridCol w:w="1728"/>
+        <w:gridCol w:w="1728"/>
+        <w:gridCol w:w="1728"/>
+        <w:gridCol w:w="1728"/>
+        <w:gridCol w:w="1728"/>
+      </w:tblGrid>
+      <w:tr>
+        <w:tc>
+          <w:tcPr>
+            <w:tcW w:type="dxa" w:w="1728"/>
+          </w:tcPr>
+          <w:p>
+            <w:r/>
+            <w:r>
+              <w:rPr>
+                <w:b/>
+                <w:sz w:val="16"/>
+              </w:rPr>
+              <w:t>Strategy</w:t>
+            </w:r>
+          </w:p>
+        </w:tc>
+        <w:tc>
+          <w:tcPr>
+            <w:tcW w:type="dxa" w:w="1728"/>
+          </w:tcPr>
+          <w:p>
+            <w:r/>
+            <w:r>
+              <w:rPr>
+                <w:b/>
+                <w:sz w:val="16"/>
+              </w:rPr>
+              <w:t>Answer</w:t>
+            </w:r>
+          </w:p>
+        </w:tc>
+        <w:tc>
+          <w:tcPr>
+            <w:tcW w:type="dxa" w:w="1728"/>
+          </w:tcPr>
+          <w:p>
+            <w:r/>
+            <w:r>
+              <w:rPr>
+                <w:b/>
+                <w:sz w:val="16"/>
+              </w:rPr>
+              <w:t>Valid trace</w:t>
+            </w:r>
+          </w:p>
+        </w:tc>
+        <w:tc>
+          <w:tcPr>
+            <w:tcW w:type="dxa" w:w="1728"/>
+          </w:tcPr>
+          <w:p>
+            <w:r/>
+            <w:r>
+              <w:rPr>
+                <w:b/>
+                <w:sz w:val="16"/>
+              </w:rPr>
+              <w:t>Repair</w:t>
+            </w:r>
+          </w:p>
+        </w:tc>
+        <w:tc>
+          <w:tcPr>
+            <w:tcW w:type="dxa" w:w="1728"/>
+          </w:tcPr>
+          <w:p>
+            <w:r/>
+            <w:r>
+              <w:rPr>
+                <w:b/>
+                <w:sz w:val="16"/>
+              </w:rPr>
+              <w:t>Avg calls</w:t>
+            </w:r>
+          </w:p>
+        </w:tc>
+        <w:tc>
+          <w:tcPr>
+            <w:tcW w:type="dxa" w:w="1728"/>
+          </w:tcPr>
+          <w:p>
+            <w:r/>
+            <w:r>
+              <w:rPr>
+                <w:b/>
+                <w:sz w:val="16"/>
+              </w:rPr>
+              <w:t>Avg tokens</w:t>
+            </w:r>
+          </w:p>
+        </w:tc>
+      </w:tr>
+      <w:tr>
+        <w:tc>
+          <w:tcPr>
+            <w:tcW w:type="dxa" w:w="1728"/>
+          </w:tcPr>
+          <w:p>
+            <w:r/>
+            <w:r>
+              <w:rPr>
+                <w:b w:val="0"/>
+                <w:sz w:val="16"/>
+              </w:rPr>
+              <w:t>No repair</w:t>
+            </w:r>
+          </w:p>
+        </w:tc>
+        <w:tc>
+          <w:tcPr>
+            <w:tcW w:type="dxa" w:w="1728"/>
+          </w:tcPr>
+          <w:p>
+            <w:r/>
+            <w:r>
+              <w:rPr>
+                <w:b w:val="0"/>
+                <w:sz w:val="16"/>
+              </w:rPr>
+              <w:t>86.1%</w:t>
+            </w:r>
+          </w:p>
+        </w:tc>
+        <w:tc>
+          <w:tcPr>
+            <w:tcW w:type="dxa" w:w="1728"/>
+          </w:tcPr>
+          <w:p>
+            <w:r/>
+            <w:r>
+              <w:rPr>
+                <w:b w:val="0"/>
+                <w:sz w:val="16"/>
+              </w:rPr>
+              <w:t>80.6%</w:t>
+            </w:r>
+          </w:p>
+        </w:tc>
+        <w:tc>
+          <w:tcPr>
+            <w:tcW w:type="dxa" w:w="1728"/>
+          </w:tcPr>
+          <w:p>
+            <w:r/>
+            <w:r>
+              <w:rPr>
+                <w:b w:val="0"/>
+                <w:sz w:val="16"/>
+              </w:rPr>
+              <w:t>0.0%</w:t>
+            </w:r>
+          </w:p>
+        </w:tc>
+        <w:tc>
+          <w:tcPr>
+            <w:tcW w:type="dxa" w:w="1728"/>
+          </w:tcPr>
+          <w:p>
+            <w:r/>
+            <w:r>
+              <w:rPr>
+                <w:b w:val="0"/>
+                <w:sz w:val="16"/>
+              </w:rPr>
+              <w:t>1.00</w:t>
+            </w:r>
+          </w:p>
+        </w:tc>
+        <w:tc>
+          <w:tcPr>
+            <w:tcW w:type="dxa" w:w="1728"/>
+          </w:tcPr>
+          <w:p>
+            <w:r/>
+            <w:r>
+              <w:rPr>
+                <w:b w:val="0"/>
+                <w:sz w:val="16"/>
+              </w:rPr>
+              <w:t>624.1</w:t>
+            </w:r>
+          </w:p>
+        </w:tc>
+      </w:tr>
+      <w:tr>
+        <w:tc>
+          <w:tcPr>
+            <w:tcW w:type="dxa" w:w="1728"/>
+          </w:tcPr>
+          <w:p>
+            <w:r/>
+            <w:r>
+              <w:rPr>
+                <w:b w:val="0"/>
+                <w:sz w:val="16"/>
+              </w:rPr>
+              <w:t>Global regeneration</w:t>
+            </w:r>
+          </w:p>
+        </w:tc>
+        <w:tc>
+          <w:tcPr>
+            <w:tcW w:type="dxa" w:w="1728"/>
+          </w:tcPr>
+          <w:p>
+            <w:r/>
+            <w:r>
+              <w:rPr>
+                <w:b w:val="0"/>
+                <w:sz w:val="16"/>
+              </w:rPr>
+              <w:t>88.9%</w:t>
+            </w:r>
+          </w:p>
+        </w:tc>
+        <w:tc>
+          <w:tcPr>
+            <w:tcW w:type="dxa" w:w="1728"/>
+          </w:tcPr>
+          <w:p>
+            <w:r/>
+            <w:r>
+              <w:rPr>
+                <w:b w:val="0"/>
+                <w:sz w:val="16"/>
+              </w:rPr>
+              <w:t>88.9%</w:t>
+            </w:r>
+          </w:p>
+        </w:tc>
+        <w:tc>
+          <w:tcPr>
+            <w:tcW w:type="dxa" w:w="1728"/>
+          </w:tcPr>
+          <w:p>
+            <w:r/>
+            <w:r>
+              <w:rPr>
+                <w:b w:val="0"/>
+                <w:sz w:val="16"/>
+              </w:rPr>
+              <w:t>42.9%</w:t>
+            </w:r>
+          </w:p>
+        </w:tc>
+        <w:tc>
+          <w:tcPr>
+            <w:tcW w:type="dxa" w:w="1728"/>
+          </w:tcPr>
+          <w:p>
+            <w:r/>
+            <w:r>
+              <w:rPr>
+                <w:b w:val="0"/>
+                <w:sz w:val="16"/>
+              </w:rPr>
+              <w:t>1.25</w:t>
+            </w:r>
+          </w:p>
+        </w:tc>
+        <w:tc>
+          <w:tcPr>
+            <w:tcW w:type="dxa" w:w="1728"/>
+          </w:tcPr>
+          <w:p>
+            <w:r/>
+            <w:r>
+              <w:rPr>
+                <w:b w:val="0"/>
+                <w:sz w:val="16"/>
+              </w:rPr>
+              <w:t>757.4</w:t>
+            </w:r>
+          </w:p>
+        </w:tc>
+      </w:tr>
+      <w:tr>
+        <w:tc>
+          <w:tcPr>
+            <w:tcW w:type="dxa" w:w="1728"/>
+          </w:tcPr>
+          <w:p>
+            <w:r/>
+            <w:r>
+              <w:rPr>
+                <w:b w:val="0"/>
+                <w:sz w:val="16"/>
+              </w:rPr>
+              <w:t>Uniform local</w:t>
+            </w:r>
+          </w:p>
+        </w:tc>
+        <w:tc>
+          <w:tcPr>
+            <w:tcW w:type="dxa" w:w="1728"/>
+          </w:tcPr>
+          <w:p>
+            <w:r/>
+            <w:r>
+              <w:rPr>
+                <w:b w:val="0"/>
+                <w:sz w:val="16"/>
+              </w:rPr>
+              <w:t>86.1%</w:t>
+            </w:r>
+          </w:p>
+        </w:tc>
+        <w:tc>
+          <w:tcPr>
+            <w:tcW w:type="dxa" w:w="1728"/>
+          </w:tcPr>
+          <w:p>
+            <w:r/>
+            <w:r>
+              <w:rPr>
+                <w:b w:val="0"/>
+                <w:sz w:val="16"/>
+              </w:rPr>
+              <w:t>83.3%</w:t>
+            </w:r>
+          </w:p>
+        </w:tc>
+        <w:tc>
+          <w:tcPr>
+            <w:tcW w:type="dxa" w:w="1728"/>
+          </w:tcPr>
+          <w:p>
+            <w:r/>
+            <w:r>
+              <w:rPr>
+                <w:b w:val="0"/>
+                <w:sz w:val="16"/>
+              </w:rPr>
+              <w:t>14.3%</w:t>
+            </w:r>
+          </w:p>
+        </w:tc>
+        <w:tc>
+          <w:tcPr>
+            <w:tcW w:type="dxa" w:w="1728"/>
+          </w:tcPr>
+          <w:p>
+            <w:r/>
+            <w:r>
+              <w:rPr>
+                <w:b w:val="0"/>
+                <w:sz w:val="16"/>
+              </w:rPr>
+              <w:t>1.25</w:t>
+            </w:r>
+          </w:p>
+        </w:tc>
+        <w:tc>
+          <w:tcPr>
+            <w:tcW w:type="dxa" w:w="1728"/>
+          </w:tcPr>
+          <w:p>
+            <w:r/>
+            <w:r>
+              <w:rPr>
+                <w:b w:val="0"/>
+                <w:sz w:val="16"/>
+              </w:rPr>
+              <w:t>772.1</w:t>
+            </w:r>
+          </w:p>
+        </w:tc>
+      </w:tr>
+      <w:tr>
+        <w:tc>
+          <w:tcPr>
+            <w:tcW w:type="dxa" w:w="1728"/>
+          </w:tcPr>
+          <w:p>
+            <w:r/>
+            <w:r>
+              <w:rPr>
+                <w:b w:val="0"/>
+                <w:sz w:val="16"/>
+              </w:rPr>
+              <w:t>Adaptive local</w:t>
+            </w:r>
+          </w:p>
+        </w:tc>
+        <w:tc>
+          <w:tcPr>
+            <w:tcW w:type="dxa" w:w="1728"/>
+          </w:tcPr>
+          <w:p>
+            <w:r/>
+            <w:r>
+              <w:rPr>
+                <w:b w:val="0"/>
+                <w:sz w:val="16"/>
+              </w:rPr>
+              <w:t>86.1%</w:t>
+            </w:r>
+          </w:p>
+        </w:tc>
+        <w:tc>
+          <w:tcPr>
+            <w:tcW w:type="dxa" w:w="1728"/>
+          </w:tcPr>
+          <w:p>
+            <w:r/>
+            <w:r>
+              <w:rPr>
+                <w:b w:val="0"/>
+                <w:sz w:val="16"/>
+              </w:rPr>
+              <w:t>86.1%</w:t>
+            </w:r>
+          </w:p>
+        </w:tc>
+        <w:tc>
+          <w:tcPr>
+            <w:tcW w:type="dxa" w:w="1728"/>
+          </w:tcPr>
+          <w:p>
+            <w:r/>
+            <w:r>
+              <w:rPr>
+                <w:b w:val="0"/>
+                <w:sz w:val="16"/>
+              </w:rPr>
+              <w:t>28.6%</w:t>
+            </w:r>
+          </w:p>
+        </w:tc>
+        <w:tc>
+          <w:tcPr>
+            <w:tcW w:type="dxa" w:w="1728"/>
+          </w:tcPr>
+          <w:p>
+            <w:r/>
+            <w:r>
+              <w:rPr>
+                <w:b w:val="0"/>
+                <w:sz w:val="16"/>
+              </w:rPr>
+              <w:t>1.17</w:t>
+            </w:r>
+          </w:p>
+        </w:tc>
+        <w:tc>
+          <w:tcPr>
+            <w:tcW w:type="dxa" w:w="1728"/>
+          </w:tcPr>
+          <w:p>
+            <w:r/>
+            <w:r>
+              <w:rPr>
+                <w:b w:val="0"/>
+                <w:sz w:val="16"/>
+              </w:rPr>
+              <w:t>721.5</w:t>
+            </w:r>
+          </w:p>
+        </w:tc>
+      </w:tr>
+    </w:tbl>
+    <w:p>
+      <w:r>
+        <w:t>Interpretation: adaptive local repair improved trace validity over uniform allocation and used fewer actual tokens, but it did not improve answer accuracy. Global regeneration was 2.8 percentage points more accurate in this small pilot.</w:t>
+      </w:r>
+    </w:p>
+    <w:p>
+      <w:pPr>
+        <w:pStyle w:val="Heading2"/>
+      </w:pPr>
+      <w:r>
+        <w:t>12.2 Ablation and Learned-Verifier Status</w:t>
+      </w:r>
+    </w:p>
+    <w:p>
+      <w:r>
+        <w:t>The ablation matrix now contains Full MathRepair, no graph, no typed error, no adaptive compute, global regeneration instead of local repair, and no symbolic tool. Only no adaptive compute and global regeneration are currently marked measured. Full MathRepair is a rule-based proxy; the remaining cells stay explicit rather than receiving estimated values.</w:t>
+      </w:r>
+    </w:p>
+    <w:p>
+      <w:pPr>
+        <w:pStyle w:val="Heading2"/>
+      </w:pPr>
+      <w:r>
+        <w:t>12.3 Output-Contract Sensitivity</w:t>
+      </w:r>
+    </w:p>
+    <w:tbl>
+      <w:tblPr>
+        <w:tblStyle w:val="TableGrid"/>
+        <w:tblW w:type="auto" w:w="0"/>
+        <w:tblLook w:firstColumn="1" w:firstRow="1" w:lastColumn="0" w:lastRow="0" w:noHBand="0" w:noVBand="1" w:val="04A0"/>
+      </w:tblPr>
+      <w:tblGrid>
+        <w:gridCol w:w="2592"/>
+        <w:gridCol w:w="2592"/>
+        <w:gridCol w:w="2592"/>
+        <w:gridCol w:w="2592"/>
+      </w:tblGrid>
+      <w:tr>
+        <w:tc>
+          <w:tcPr>
+            <w:tcW w:type="dxa" w:w="2592"/>
+          </w:tcPr>
+          <w:p>
+            <w:r/>
+            <w:r>
+              <w:rPr>
+                <w:b/>
+                <w:sz w:val="16"/>
+              </w:rPr>
+              <w:t>Configuration</w:t>
+            </w:r>
+          </w:p>
+        </w:tc>
+        <w:tc>
+          <w:tcPr>
+            <w:tcW w:type="dxa" w:w="2592"/>
+          </w:tcPr>
+          <w:p>
+            <w:r/>
+            <w:r>
+              <w:rPr>
+                <w:b/>
+                <w:sz w:val="16"/>
+              </w:rPr>
+              <w:t>Failures</w:t>
+            </w:r>
+          </w:p>
+        </w:tc>
+        <w:tc>
+          <w:tcPr>
+            <w:tcW w:type="dxa" w:w="2592"/>
+          </w:tcPr>
+          <w:p>
+            <w:r/>
+            <w:r>
+              <w:rPr>
+                <w:b/>
+                <w:sz w:val="16"/>
+              </w:rPr>
+              <w:t>Strict</w:t>
+            </w:r>
+          </w:p>
+        </w:tc>
+        <w:tc>
+          <w:tcPr>
+            <w:tcW w:type="dxa" w:w="2592"/>
+          </w:tcPr>
+          <w:p>
+            <w:r/>
+            <w:r>
+              <w:rPr>
+                <w:b/>
+                <w:sz w:val="16"/>
+              </w:rPr>
+              <w:t>Normalized</w:t>
+            </w:r>
+          </w:p>
+        </w:tc>
+      </w:tr>
+      <w:tr>
+        <w:tc>
+          <w:tcPr>
+            <w:tcW w:type="dxa" w:w="2592"/>
+          </w:tcPr>
+          <w:p>
+            <w:r/>
+            <w:r>
+              <w:rPr>
+                <w:b w:val="0"/>
+                <w:sz w:val="16"/>
+              </w:rPr>
+              <w:t>qwen2-math:1.5b / default</w:t>
+            </w:r>
+          </w:p>
+        </w:tc>
+        <w:tc>
+          <w:tcPr>
+            <w:tcW w:type="dxa" w:w="2592"/>
+          </w:tcPr>
+          <w:p>
+            <w:r/>
+            <w:r>
+              <w:rPr>
+                <w:b w:val="0"/>
+                <w:sz w:val="16"/>
+              </w:rPr>
+              <w:t>0/108</w:t>
+            </w:r>
+          </w:p>
+        </w:tc>
+        <w:tc>
+          <w:tcPr>
+            <w:tcW w:type="dxa" w:w="2592"/>
+          </w:tcPr>
+          <w:p>
+            <w:r/>
+            <w:r>
+              <w:rPr>
+                <w:b w:val="0"/>
+                <w:sz w:val="16"/>
+              </w:rPr>
+              <w:t>90.7%</w:t>
+            </w:r>
+          </w:p>
+        </w:tc>
+        <w:tc>
+          <w:tcPr>
+            <w:tcW w:type="dxa" w:w="2592"/>
+          </w:tcPr>
+          <w:p>
+            <w:r/>
+            <w:r>
+              <w:rPr>
+                <w:b w:val="0"/>
+                <w:sz w:val="16"/>
+              </w:rPr>
+              <w:t>90.7%</w:t>
+            </w:r>
+          </w:p>
+        </w:tc>
+      </w:tr>
+      <w:tr>
+        <w:tc>
+          <w:tcPr>
+            <w:tcW w:type="dxa" w:w="2592"/>
+          </w:tcPr>
+          <w:p>
+            <w:r/>
+            <w:r>
+              <w:rPr>
+                <w:b w:val="0"/>
+                <w:sz w:val="16"/>
+              </w:rPr>
+              <w:t>qwen2.5:3b / default</w:t>
+            </w:r>
+          </w:p>
+        </w:tc>
+        <w:tc>
+          <w:tcPr>
+            <w:tcW w:type="dxa" w:w="2592"/>
+          </w:tcPr>
+          <w:p>
+            <w:r/>
+            <w:r>
+              <w:rPr>
+                <w:b w:val="0"/>
+                <w:sz w:val="16"/>
+              </w:rPr>
+              <w:t>24/108</w:t>
+            </w:r>
+          </w:p>
+        </w:tc>
+        <w:tc>
+          <w:tcPr>
+            <w:tcW w:type="dxa" w:w="2592"/>
+          </w:tcPr>
+          <w:p>
+            <w:r/>
+            <w:r>
+              <w:rPr>
+                <w:b w:val="0"/>
+                <w:sz w:val="16"/>
+              </w:rPr>
+              <w:t>47.2%</w:t>
+            </w:r>
+          </w:p>
+        </w:tc>
+        <w:tc>
+          <w:tcPr>
+            <w:tcW w:type="dxa" w:w="2592"/>
+          </w:tcPr>
+          <w:p>
+            <w:r/>
+            <w:r>
+              <w:rPr>
+                <w:b w:val="0"/>
+                <w:sz w:val="16"/>
+              </w:rPr>
+              <w:t>59.3%</w:t>
+            </w:r>
+          </w:p>
+        </w:tc>
+      </w:tr>
+      <w:tr>
+        <w:tc>
+          <w:tcPr>
+            <w:tcW w:type="dxa" w:w="2592"/>
+          </w:tcPr>
+          <w:p>
+            <w:r/>
+            <w:r>
+              <w:rPr>
+                <w:b w:val="0"/>
+                <w:sz w:val="16"/>
+              </w:rPr>
+              <w:t>qwen2-math:7b / default</w:t>
+            </w:r>
+          </w:p>
+        </w:tc>
+        <w:tc>
+          <w:tcPr>
+            <w:tcW w:type="dxa" w:w="2592"/>
+          </w:tcPr>
+          <w:p>
+            <w:r/>
+            <w:r>
+              <w:rPr>
+                <w:b w:val="0"/>
+                <w:sz w:val="16"/>
+              </w:rPr>
+              <w:t>91/108</w:t>
+            </w:r>
+          </w:p>
+        </w:tc>
+        <w:tc>
+          <w:tcPr>
+            <w:tcW w:type="dxa" w:w="2592"/>
+          </w:tcPr>
+          <w:p>
+            <w:r/>
+            <w:r>
+              <w:rPr>
+                <w:b w:val="0"/>
+                <w:sz w:val="16"/>
+              </w:rPr>
+              <w:t>13.0%</w:t>
+            </w:r>
+          </w:p>
+        </w:tc>
+        <w:tc>
+          <w:tcPr>
+            <w:tcW w:type="dxa" w:w="2592"/>
+          </w:tcPr>
+          <w:p>
+            <w:r/>
+            <w:r>
+              <w:rPr>
+                <w:b w:val="0"/>
+                <w:sz w:val="16"/>
+              </w:rPr>
+              <w:t>41.7%</w:t>
+            </w:r>
+          </w:p>
+        </w:tc>
+      </w:tr>
+      <w:tr>
+        <w:tc>
+          <w:tcPr>
+            <w:tcW w:type="dxa" w:w="2592"/>
+          </w:tcPr>
+          <w:p>
+            <w:r/>
+            <w:r>
+              <w:rPr>
+                <w:b w:val="0"/>
+                <w:sz w:val="16"/>
+              </w:rPr>
+              <w:t>qwen2-math:7b / JSON contract</w:t>
+            </w:r>
+          </w:p>
+        </w:tc>
+        <w:tc>
+          <w:tcPr>
+            <w:tcW w:type="dxa" w:w="2592"/>
+          </w:tcPr>
+          <w:p>
+            <w:r/>
+            <w:r>
+              <w:rPr>
+                <w:b w:val="0"/>
+                <w:sz w:val="16"/>
+              </w:rPr>
+              <w:t>10/108</w:t>
+            </w:r>
+          </w:p>
+        </w:tc>
+        <w:tc>
+          <w:tcPr>
+            <w:tcW w:type="dxa" w:w="2592"/>
+          </w:tcPr>
+          <w:p>
+            <w:r/>
+            <w:r>
+              <w:rPr>
+                <w:b w:val="0"/>
+                <w:sz w:val="16"/>
+              </w:rPr>
+              <w:t>75.0%</w:t>
+            </w:r>
+          </w:p>
+        </w:tc>
+        <w:tc>
+          <w:tcPr>
+            <w:tcW w:type="dxa" w:w="2592"/>
+          </w:tcPr>
+          <w:p>
+            <w:r/>
+            <w:r>
+              <w:rPr>
+                <w:b w:val="0"/>
+                <w:sz w:val="16"/>
+              </w:rPr>
+              <w:t>79.6%</w:t>
+            </w:r>
+          </w:p>
+        </w:tc>
+      </w:tr>
+    </w:tbl>
+    <w:p>
+      <w:r>
+        <w:t>Normalized accuracy is an offline parser-only sensitivity analysis and does not replace the strict end-to-end result. Exact model digests, prompt/parser versions, trace hashes, and 432 raw-output records are preserved in output_contract_evidence.json and its raw archive.</w:t>
+      </w:r>
+    </w:p>
+    <w:p>
+      <w:pPr>
+        <w:pStyle w:val="Heading2"/>
+      </w:pPr>
+      <w:r>
+        <w:t>12.4 Reproduction</w:t>
+      </w:r>
+    </w:p>
+    <w:p>
+      <w:pPr>
+        <w:pStyle w:val="ListBullet"/>
+      </w:pPr>
+      <w:r>
+        <w:rPr>
+          <w:rFonts w:ascii="Consolas" w:hAnsi="Consolas"/>
+          <w:sz w:val="18"/>
+        </w:rPr>
+        <w:t>python show_experiments.py</w:t>
+      </w:r>
+    </w:p>
+    <w:p>
+      <w:pPr>
+        <w:pStyle w:val="ListBullet"/>
+      </w:pPr>
+      <w:r>
+        <w:rPr>
+          <w:rFonts w:ascii="Consolas" w:hAnsi="Consolas"/>
+          <w:sz w:val="18"/>
+        </w:rPr>
+        <w:t>python generate_verifier_dataset.py --count-per-type 6 --seed 42</w:t>
+      </w:r>
+    </w:p>
+    <w:p>
+      <w:pPr>
+        <w:pStyle w:val="ListBullet"/>
+      </w:pPr>
+      <w:r>
+        <w:rPr>
+          <w:rFonts w:ascii="Consolas" w:hAnsi="Consolas"/>
+          <w:sz w:val="18"/>
+        </w:rPr>
+        <w:t>python matched_budget_experiment.py --reuse-global-results --reuse-local-results</w:t>
+      </w:r>
+    </w:p>
+    <w:p>
+      <w:pPr>
+        <w:pStyle w:val="ListBullet"/>
+      </w:pPr>
+      <w:r>
+        <w:rPr>
+          <w:rFonts w:ascii="Consolas" w:hAnsi="Consolas"/>
+          <w:sz w:val="18"/>
+        </w:rPr>
+        <w:t>python ablation_table.py</w:t>
+      </w:r>
+    </w:p>
+    <w:p>
+      <w:pPr>
+        <w:pStyle w:val="ListBullet"/>
+      </w:pPr>
+      <w:r>
+        <w:rPr>
+          <w:rFonts w:ascii="Consolas" w:hAnsi="Consolas"/>
+          <w:sz w:val="18"/>
+        </w:rPr>
+        <w:t>python output_contract_evidence.py</w:t>
+      </w:r>
+    </w:p>
+    <w:p>
+      <w:pPr>
+        <w:pStyle w:val="ListBullet"/>
+      </w:pPr>
+      <w:r>
+        <w:rPr>
+          <w:rFonts w:ascii="Consolas" w:hAnsi="Consolas"/>
+          <w:sz w:val="18"/>
+        </w:rPr>
+        <w:t>python -m unittest discover -q</w:t>
+      </w:r>
+    </w:p>
+    <w:p>
+      <w:r>
+        <w:t>Current automated verification: 128/128 tests passing. The immediate research priority is the learned verifier and completion of the pending controlled ablations, not additional web-interface work.</w:t>
+      </w:r>
+    </w:p>
     <w:sectPr>
       <w:pgSz w:w="12240" w:h="15840"/>
-      <w:pgMar w:top="1008" w:right="1123" w:bottom="1008" w:left="1123" w:header="720" w:footer="720" w:gutter="0"/>
+      <w:pgMar w:top="936" w:right="936" w:bottom="936" w:left="936" w:header="720" w:footer="720" w:gutter="0"/>
       <w:cols w:space="720"/>
       <w:docGrid w:linePitch="360"/>
     </w:sectPr>

</xml_diff>

<commit_message>
Clarify completed and deferred supervisor work
</commit_message>
<xml_diff>
--- a/MATHREPAIR_SUPERVISOR_PROGRESS_REPORT.docx
+++ b/MATHREPAIR_SUPERVISOR_PROGRESS_REPORT.docx
@@ -59,7 +59,15 @@
         </w:rPr>
       </w:pPr>
       <w:r>
+        <w:rPr>
+          <w:rFonts w:ascii="Times New Roman" w:hAnsi="Times New Roman" w:cs="Times New Roman"/>
+        </w:rPr>
         <w:t>Research progress review | Updated 23 September 2026</w:t>
+      </w:r>
+      <w:r>
+        <w:rPr>
+          <w:rFonts w:ascii="Times New Roman" w:hAnsi="Times New Roman" w:cs="Times New Roman"/>
+        </w:rPr>
         <w:br/>
         <w:t>Repository: https://github.com/mwanajh/MathRepair_Project</w:t>
       </w:r>
@@ -90,6 +98,11 @@
         </w:rPr>
       </w:pPr>
       <w:r>
+        <w:rPr>
+          <w:rFonts w:ascii="Times New Roman" w:hAnsi="Times New Roman" w:cs="Times New Roman"/>
+          <w:sz w:val="24"/>
+          <w:szCs w:val="24"/>
+        </w:rPr>
         <w:t>MathRepair now connects model-generated traces directly to its reasoning graph and includes a 40-problem MATH-500 pilot, a frozen eight-class error taxonomy, a 48-example typed-verifier dataset, a fresh three-arm matched-budget pilot, a frozen ablation matrix, and a versioned archive of 432 raw outputs. The earlier expanded algebra experiment found 100.0% local-repair accuracy versus 92.6% global regeneration. A newer and stricter total-budget pilot found 88.9% for global regeneration and 86.1% for both local arms. These protocols answer different questions, so the report does not claim universal local-repair superiority.</w:t>
       </w:r>
     </w:p>
@@ -791,10 +804,10 @@
         <mc:AlternateContent>
           <mc:Choice Requires="wps">
             <w:drawing>
-              <wp:anchor distT="0" distB="0" distL="114300" distR="114300" simplePos="0" relativeHeight="251662336" behindDoc="0" locked="0" layoutInCell="1" allowOverlap="1" wp14:anchorId="4BC93CC6" wp14:editId="424F8B44">
+              <wp:anchor distT="0" distB="0" distL="114300" distR="114300" simplePos="0" relativeHeight="251662336" behindDoc="0" locked="0" layoutInCell="1" allowOverlap="1" wp14:anchorId="4BC93CC6" wp14:editId="53CFBD49">
                 <wp:simplePos x="0" y="0"/>
                 <wp:positionH relativeFrom="column">
-                  <wp:posOffset>1835150</wp:posOffset>
+                  <wp:posOffset>1104900</wp:posOffset>
                 </wp:positionH>
                 <wp:positionV relativeFrom="paragraph">
                   <wp:posOffset>364490</wp:posOffset>
@@ -843,11 +856,11 @@
           </mc:Choice>
           <mc:Fallback>
             <w:pict>
-              <v:shapetype w14:anchorId="1EE48888" id="_x0000_t32" coordsize="21600,21600" o:spt="32" o:oned="t" path="m,l21600,21600e" filled="f">
+              <v:shapetype w14:anchorId="7C0507D6" id="_x0000_t32" coordsize="21600,21600" o:spt="32" o:oned="t" path="m,l21600,21600e" filled="f">
                 <v:path arrowok="t" fillok="f" o:connecttype="none"/>
                 <o:lock v:ext="edit" shapetype="t"/>
               </v:shapetype>
-              <v:shape id="Straight Arrow Connector 1" o:spid="_x0000_s1026" type="#_x0000_t32" style="position:absolute;margin-left:144.5pt;margin-top:28.7pt;width:16.5pt;height:0;z-index:251662336;visibility:visible;mso-wrap-style:square;mso-wrap-distance-left:9pt;mso-wrap-distance-top:0;mso-wrap-distance-right:9pt;mso-wrap-distance-bottom:0;mso-position-horizontal:absolute;mso-position-horizontal-relative:text;mso-position-vertical:absolute;mso-position-vertical-relative:text" o:gfxdata="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" strokecolor="#4f81bd [3204]" strokeweight="2pt">
+              <v:shape id="Straight Arrow Connector 1" o:spid="_x0000_s1026" type="#_x0000_t32" style="position:absolute;margin-left:87pt;margin-top:28.7pt;width:16.5pt;height:0;z-index:251662336;visibility:visible;mso-wrap-style:square;mso-wrap-distance-left:9pt;mso-wrap-distance-top:0;mso-wrap-distance-right:9pt;mso-wrap-distance-bottom:0;mso-position-horizontal:absolute;mso-position-horizontal-relative:text;mso-position-vertical:absolute;mso-position-vertical-relative:text" o:gfxdata="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" strokecolor="#4f81bd [3204]" strokeweight="2pt">
                 <v:stroke endarrow="block"/>
                 <v:shadow on="t" color="black" opacity="24903f" origin=",.5" offset="0,.55556mm"/>
               </v:shape>
@@ -865,10 +878,10 @@
         <mc:AlternateContent>
           <mc:Choice Requires="wps">
             <w:drawing>
-              <wp:anchor distT="0" distB="0" distL="114300" distR="114300" simplePos="0" relativeHeight="251656192" behindDoc="0" locked="0" layoutInCell="1" allowOverlap="1" wp14:anchorId="6A5A3611" wp14:editId="1E5A1B2F">
+              <wp:anchor distT="0" distB="0" distL="114300" distR="114300" simplePos="0" relativeHeight="251654144" behindDoc="0" locked="0" layoutInCell="1" allowOverlap="1" wp14:anchorId="6A5A3611" wp14:editId="5C72834A">
                 <wp:simplePos x="0" y="0"/>
                 <wp:positionH relativeFrom="column">
-                  <wp:posOffset>5351145</wp:posOffset>
+                  <wp:posOffset>4938395</wp:posOffset>
                 </wp:positionH>
                 <wp:positionV relativeFrom="paragraph">
                   <wp:posOffset>100965</wp:posOffset>
@@ -917,7 +930,7 @@
           </mc:Choice>
           <mc:Fallback>
             <w:pict>
-              <v:shape w14:anchorId="2E21F400" id="Straight Arrow Connector 1" o:spid="_x0000_s1026" type="#_x0000_t32" style="position:absolute;margin-left:421.35pt;margin-top:7.95pt;width:16.5pt;height:0;z-index:251656192;visibility:visible;mso-wrap-style:square;mso-wrap-distance-left:9pt;mso-wrap-distance-top:0;mso-wrap-distance-right:9pt;mso-wrap-distance-bottom:0;mso-position-horizontal:absolute;mso-position-horizontal-relative:text;mso-position-vertical:absolute;mso-position-vertical-relative:text" o:gfxdata="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" strokecolor="#4f81bd [3204]" strokeweight="2pt">
+              <v:shape w14:anchorId="41BDC228" id="Straight Arrow Connector 1" o:spid="_x0000_s1026" type="#_x0000_t32" style="position:absolute;margin-left:388.85pt;margin-top:7.95pt;width:16.5pt;height:0;z-index:251654144;visibility:visible;mso-wrap-style:square;mso-wrap-distance-left:9pt;mso-wrap-distance-top:0;mso-wrap-distance-right:9pt;mso-wrap-distance-bottom:0;mso-position-horizontal:absolute;mso-position-horizontal-relative:text;mso-position-vertical:absolute;mso-position-vertical-relative:text" o:gfxdata="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" strokecolor="#4f81bd [3204]" strokeweight="2pt">
                 <v:stroke endarrow="block"/>
                 <v:shadow on="t" color="black" opacity="24903f" origin=",.5" offset="0,.55556mm"/>
               </v:shape>
@@ -935,10 +948,10 @@
         <mc:AlternateContent>
           <mc:Choice Requires="wps">
             <w:drawing>
-              <wp:anchor distT="0" distB="0" distL="114300" distR="114300" simplePos="0" relativeHeight="251661312" behindDoc="0" locked="0" layoutInCell="1" allowOverlap="1" wp14:anchorId="400C9F97" wp14:editId="1EB8200D">
+              <wp:anchor distT="0" distB="0" distL="114300" distR="114300" simplePos="0" relativeHeight="251658240" behindDoc="0" locked="0" layoutInCell="1" allowOverlap="1" wp14:anchorId="400C9F97" wp14:editId="28DE6EBC">
                 <wp:simplePos x="0" y="0"/>
                 <wp:positionH relativeFrom="column">
-                  <wp:posOffset>4766945</wp:posOffset>
+                  <wp:posOffset>4443095</wp:posOffset>
                 </wp:positionH>
                 <wp:positionV relativeFrom="paragraph">
                   <wp:posOffset>94615</wp:posOffset>
@@ -987,7 +1000,7 @@
           </mc:Choice>
           <mc:Fallback>
             <w:pict>
-              <v:shape w14:anchorId="332B533D" id="Straight Arrow Connector 1" o:spid="_x0000_s1026" type="#_x0000_t32" style="position:absolute;margin-left:375.35pt;margin-top:7.45pt;width:16.5pt;height:0;z-index:251661312;visibility:visible;mso-wrap-style:square;mso-wrap-distance-left:9pt;mso-wrap-distance-top:0;mso-wrap-distance-right:9pt;mso-wrap-distance-bottom:0;mso-position-horizontal:absolute;mso-position-horizontal-relative:text;mso-position-vertical:absolute;mso-position-vertical-relative:text" o:gfxdata="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" strokecolor="#4f81bd [3204]" strokeweight="2pt">
+              <v:shape w14:anchorId="43266147" id="Straight Arrow Connector 1" o:spid="_x0000_s1026" type="#_x0000_t32" style="position:absolute;margin-left:349.85pt;margin-top:7.45pt;width:16.5pt;height:0;z-index:251658240;visibility:visible;mso-wrap-style:square;mso-wrap-distance-left:9pt;mso-wrap-distance-top:0;mso-wrap-distance-right:9pt;mso-wrap-distance-bottom:0;mso-position-horizontal:absolute;mso-position-horizontal-relative:text;mso-position-vertical:absolute;mso-position-vertical-relative:text" o:gfxdata="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" strokecolor="#4f81bd [3204]" strokeweight="2pt">
                 <v:stroke endarrow="block"/>
                 <v:shadow on="t" color="black" opacity="24903f" origin=",.5" offset="0,.55556mm"/>
               </v:shape>
@@ -1001,71 +1014,7 @@
           <w:sz w:val="24"/>
           <w:szCs w:val="24"/>
         </w:rPr>
-        <w:t xml:space="preserve">For the problem 2(x + 3) = 14, the graph contains an invalid branch n1 </w:t>
-      </w:r>
-      <w:r>
-        <w:rPr>
-          <w:rFonts w:ascii="Times New Roman" w:hAnsi="Times New Roman" w:cs="Times New Roman"/>
-          <w:sz w:val="24"/>
-          <w:szCs w:val="24"/>
-        </w:rPr>
-        <w:t xml:space="preserve">      </w:t>
-      </w:r>
-      <w:r>
-        <w:rPr>
-          <w:rFonts w:ascii="Times New Roman" w:hAnsi="Times New Roman" w:cs="Times New Roman"/>
-          <w:sz w:val="24"/>
-          <w:szCs w:val="24"/>
-        </w:rPr>
-        <w:t xml:space="preserve">n2 </w:t>
-      </w:r>
-      <w:r>
-        <w:rPr>
-          <w:rFonts w:ascii="Times New Roman" w:hAnsi="Times New Roman" w:cs="Times New Roman"/>
-          <w:sz w:val="24"/>
-          <w:szCs w:val="24"/>
-        </w:rPr>
-        <w:t xml:space="preserve">  </w:t>
-      </w:r>
-      <w:r>
-        <w:rPr>
-          <w:rFonts w:ascii="Times New Roman" w:hAnsi="Times New Roman" w:cs="Times New Roman"/>
-          <w:sz w:val="24"/>
-          <w:szCs w:val="24"/>
-        </w:rPr>
-        <w:t xml:space="preserve"> </w:t>
-      </w:r>
-      <w:r>
-        <w:rPr>
-          <w:rFonts w:ascii="Times New Roman" w:hAnsi="Times New Roman" w:cs="Times New Roman"/>
-          <w:sz w:val="24"/>
-          <w:szCs w:val="24"/>
-        </w:rPr>
-        <w:t xml:space="preserve">   </w:t>
-      </w:r>
-      <w:r>
-        <w:rPr>
-          <w:rFonts w:ascii="Times New Roman" w:hAnsi="Times New Roman" w:cs="Times New Roman"/>
-          <w:sz w:val="24"/>
-          <w:szCs w:val="24"/>
-        </w:rPr>
-        <w:t xml:space="preserve">n3 and an independent valid branch n4  </w:t>
-      </w:r>
-      <w:r>
-        <w:rPr>
-          <w:rFonts w:ascii="Times New Roman" w:hAnsi="Times New Roman" w:cs="Times New Roman"/>
-          <w:sz w:val="24"/>
-          <w:szCs w:val="24"/>
-        </w:rPr>
-        <w:t xml:space="preserve">      </w:t>
-      </w:r>
-      <w:r>
-        <w:rPr>
-          <w:rFonts w:ascii="Times New Roman" w:hAnsi="Times New Roman" w:cs="Times New Roman"/>
-          <w:sz w:val="24"/>
-          <w:szCs w:val="24"/>
-        </w:rPr>
-        <w:t>n5. The verifier marks n1 as the first algebraic-transformation error, n2 and n3 as affected, and n4 and n5 as unaffected. The suggested repair is 2x + 6 = 14, and the adaptive budget assigns 7 calls to n1, 2 to n2, 1 to n3, and 0 to the unaffected branch.</w:t>
+        <w:t>For the problem 2(x + 3) = 14, the graph contains an invalid branch n1       n2       n3 and an independent valid branch n4        n5. The verifier marks n1 as the first algebraic-transformation error, n2 and n3 as affected, and n4 and n5 as unaffected. The suggested repair is 2x + 6 = 14, and the adaptive budget assigns 7 calls to n1, 2 to n2, 1 to n3, and 0 to the unaffected branch.</w:t>
       </w:r>
     </w:p>
     <w:p>
@@ -1940,15 +1889,7 @@
           <w:sz w:val="24"/>
           <w:szCs w:val="24"/>
         </w:rPr>
-        <w:t xml:space="preserve"> </w:t>
-      </w:r>
-      <w:r>
-        <w:rPr>
-          <w:rFonts w:ascii="Times New Roman" w:hAnsi="Times New Roman" w:cs="Times New Roman"/>
-          <w:sz w:val="24"/>
-          <w:szCs w:val="24"/>
-        </w:rPr>
-        <w:t>(100% - 92.6%)</w:t>
+        <w:t xml:space="preserve"> (100% - 92.6%)</w:t>
       </w:r>
       <w:r>
         <w:rPr>
@@ -2782,6 +2723,9 @@
         </w:rPr>
       </w:pPr>
       <w:r>
+        <w:rPr>
+          <w:rFonts w:ascii="Times New Roman" w:hAnsi="Times New Roman" w:cs="Times New Roman"/>
+        </w:rPr>
         <w:t>Executable graph-based verifier and repair pipeline with 128 passing tests.</w:t>
       </w:r>
     </w:p>
@@ -2939,78 +2883,70 @@
         </w:rPr>
       </w:pPr>
       <w:r>
-        <w:rPr>
-          <w:rFonts w:ascii="Times New Roman" w:hAnsi="Times New Roman" w:cs="Times New Roman"/>
-        </w:rPr>
-        <w:lastRenderedPageBreak/>
-        <w:t>10. Recommended Next Steps</w:t>
+        <w:t>10. Work Status After Supervisor Tasks</w:t>
       </w:r>
     </w:p>
     <w:p>
       <w:pPr>
-        <w:pStyle w:val="ListBullet"/>
-        <w:spacing w:after="80" w:line="360" w:lineRule="auto"/>
-        <w:rPr>
-          <w:rFonts w:ascii="Times New Roman" w:hAnsi="Times New Roman" w:cs="Times New Roman"/>
-          <w:sz w:val="24"/>
-          <w:szCs w:val="24"/>
-        </w:rPr>
+        <w:pStyle w:val="Heading2"/>
       </w:pPr>
       <w:r>
-        <w:t>Train and calibrate the learned typed verifier using the controlled pilot schema and additional natural errors.</w:t>
+        <w:t>10.1 Completed Supervisor Tasks</w:t>
       </w:r>
     </w:p>
     <w:p>
-      <w:pPr>
-        <w:pStyle w:val="ListBullet"/>
-        <w:spacing w:after="80" w:line="360" w:lineRule="auto"/>
-        <w:rPr>
-          <w:rFonts w:ascii="Times New Roman" w:hAnsi="Times New Roman" w:cs="Times New Roman"/>
-          <w:sz w:val="24"/>
-          <w:szCs w:val="24"/>
-        </w:rPr>
-      </w:pPr>
       <w:r>
-        <w:t>Run the no-graph and no-typed-error ablations on identical problems, seeds, prompts, and budgets.</w:t>
+        <w:t>Tasks 1-7 are completed within the scope requested for this week. The evidence and results are summarized in Section 12.</w:t>
       </w:r>
     </w:p>
     <w:p>
       <w:pPr>
-        <w:pStyle w:val="ListBullet"/>
-        <w:spacing w:after="80" w:line="360" w:lineRule="auto"/>
-        <w:rPr>
-          <w:rFonts w:ascii="Times New Roman" w:hAnsi="Times New Roman" w:cs="Times New Roman"/>
-          <w:sz w:val="24"/>
-          <w:szCs w:val="24"/>
-        </w:rPr>
+        <w:pStyle w:val="Heading2"/>
       </w:pPr>
       <w:r>
-        <w:t>Run the 40-problem MATH-500 pilot with a real model and define answer evaluation for open-ended mathematics.</w:t>
+        <w:t>10.2 Explicitly Deferred Work</w:t>
       </w:r>
     </w:p>
     <w:p>
       <w:pPr>
         <w:pStyle w:val="ListBullet"/>
-        <w:spacing w:after="80" w:line="360" w:lineRule="auto"/>
-        <w:rPr>
-          <w:rFonts w:ascii="Times New Roman" w:hAnsi="Times New Roman" w:cs="Times New Roman"/>
-          <w:sz w:val="24"/>
-          <w:szCs w:val="24"/>
-        </w:rPr>
       </w:pPr>
       <w:r>
-        <w:t>Complete the no-symbolic-tool ablation after the learned verifier is available.</w:t>
+        <w:t>Train and calibrate the learned typed verifier. Task 4 explicitly required the data-generation pipeline this week, not completion of large-model training.</w:t>
       </w:r>
     </w:p>
     <w:p>
       <w:pPr>
         <w:pStyle w:val="ListBullet"/>
-        <w:spacing w:after="80" w:line="360" w:lineRule="auto"/>
-        <w:rPr>
-          <w:rFonts w:ascii="Times New Roman" w:hAnsi="Times New Roman" w:cs="Times New Roman"/>
-          <w:sz w:val="24"/>
-          <w:szCs w:val="24"/>
-        </w:rPr>
+      </w:pPr>
+      <w:r>
+        <w:t>Run a full real-model MATH-500 accuracy evaluation. Task 2 explicitly limited this week to creating and processing a difficult 30-50 problem pilot.</w:t>
+      </w:r>
+    </w:p>
+    <w:p>
+      <w:pPr>
+        <w:pStyle w:val="ListBullet"/>
+      </w:pPr>
+      <w:r>
+        <w:t>Fill the no-graph, no-typed-error, and no-symbolic-tool ablation cells. Task 6 explicitly requested the table structure even if cells were unfinished.</w:t>
+      </w:r>
+    </w:p>
+    <w:p>
+      <w:r>
+        <w:t>These items are deferred by the stated scope; they are not incomplete deliverables from Tasks 1-7.</w:t>
+      </w:r>
+    </w:p>
+    <w:p>
+      <w:pPr>
+        <w:pStyle w:val="Heading2"/>
+      </w:pPr>
+      <w:r>
+        <w:t>10.3 Proposed Follow-Up Experiments</w:t>
+      </w:r>
+    </w:p>
+    <w:p>
+      <w:pPr>
+        <w:pStyle w:val="ListBullet"/>
       </w:pPr>
       <w:r>
         <w:t>Repeat the three-arm matched-budget comparison on the hard benchmark pilot and report paired uncertainty.</w:t>
@@ -3019,15 +2955,17 @@
     <w:p>
       <w:pPr>
         <w:pStyle w:val="ListBullet"/>
-        <w:spacing w:after="80" w:line="360" w:lineRule="auto"/>
-        <w:rPr>
-          <w:rFonts w:ascii="Times New Roman" w:hAnsi="Times New Roman" w:cs="Times New Roman"/>
-          <w:sz w:val="24"/>
-          <w:szCs w:val="24"/>
-        </w:rPr>
       </w:pPr>
       <w:r>
-        <w:t>Keep prompt/parser sensitivity as supporting evidence while prioritizing the proposal-level methodology.</w:t>
+        <w:t>Add natural model errors to the controlled verifier data before final training.</w:t>
+      </w:r>
+    </w:p>
+    <w:p>
+      <w:pPr>
+        <w:pStyle w:val="ListBullet"/>
+      </w:pPr>
+      <w:r>
+        <w:t>Keep prompt/parser sensitivity as supporting evidence rather than the primary contribution.</w:t>
       </w:r>
     </w:p>
     <w:p>
@@ -3077,6 +3015,7 @@
       <w:r>
         <w:rPr>
           <w:rFonts w:ascii="Times New Roman" w:hAnsi="Times New Roman" w:cs="Times New Roman"/>
+          <w:noProof/>
           <w:sz w:val="24"/>
           <w:szCs w:val="24"/>
         </w:rPr>
@@ -3296,7 +3235,6 @@
           <w:sz w:val="24"/>
           <w:szCs w:val="24"/>
         </w:rPr>
-        <w:lastRenderedPageBreak/>
         <w:t>python model_pipeline.py --provider mock</w:t>
       </w:r>
     </w:p>
@@ -3313,6 +3251,7 @@
       <w:r>
         <w:rPr>
           <w:rFonts w:ascii="Times New Roman" w:hAnsi="Times New Roman" w:cs="Times New Roman"/>
+          <w:noProof/>
           <w:sz w:val="24"/>
           <w:szCs w:val="24"/>
         </w:rPr>
@@ -3385,9 +3324,11 @@
       <w:r>
         <w:rPr>
           <w:rFonts w:ascii="Times New Roman" w:hAnsi="Times New Roman" w:cs="Times New Roman"/>
+          <w:noProof/>
           <w:sz w:val="24"/>
           <w:szCs w:val="24"/>
         </w:rPr>
+        <w:lastRenderedPageBreak/>
         <w:drawing>
           <wp:inline distT="0" distB="0" distL="0" distR="0" wp14:anchorId="2AA59B19" wp14:editId="038C352A">
             <wp:extent cx="6346190" cy="4114800"/>
@@ -3452,7 +3393,6 @@
           <w:sz w:val="24"/>
           <w:szCs w:val="24"/>
         </w:rPr>
-        <w:lastRenderedPageBreak/>
         <w:t>python allocation_report.py</w:t>
       </w:r>
     </w:p>
@@ -3488,6 +3428,7 @@
       <w:r>
         <w:rPr>
           <w:rFonts w:ascii="Times New Roman" w:hAnsi="Times New Roman" w:cs="Times New Roman"/>
+          <w:noProof/>
           <w:sz w:val="24"/>
           <w:szCs w:val="24"/>
         </w:rPr>
@@ -3558,7 +3499,15 @@
       </w:r>
     </w:p>
     <w:p>
+      <w:pPr>
+        <w:rPr>
+          <w:rFonts w:ascii="Times New Roman" w:hAnsi="Times New Roman" w:cs="Times New Roman"/>
+        </w:rPr>
+      </w:pPr>
       <w:r>
+        <w:rPr>
+          <w:rFonts w:ascii="Times New Roman" w:hAnsi="Times New Roman" w:cs="Times New Roman"/>
+        </w:rPr>
         <w:br w:type="page"/>
       </w:r>
     </w:p>
@@ -3748,7 +3697,7 @@
                 <w:b w:val="0"/>
                 <w:sz w:val="16"/>
               </w:rPr>
-              <w:t>Processing pilot completed</w:t>
+              <w:t>Completed within requested scope</w:t>
             </w:r>
           </w:p>
         </w:tc>
@@ -3872,7 +3821,7 @@
                 <w:b w:val="0"/>
                 <w:sz w:val="16"/>
               </w:rPr>
-              <w:t>Controlled pilot completed</w:t>
+              <w:t>Completed within requested scope</w:t>
             </w:r>
           </w:p>
         </w:tc>
@@ -3934,7 +3883,7 @@
                 <w:b w:val="0"/>
                 <w:sz w:val="16"/>
               </w:rPr>
-              <w:t>Pilot completed</w:t>
+              <w:t>Completed</w:t>
             </w:r>
           </w:p>
         </w:tc>
@@ -3996,7 +3945,7 @@
                 <w:b w:val="0"/>
                 <w:sz w:val="16"/>
               </w:rPr>
-              <w:t>Structure frozen; partial results</w:t>
+              <w:t>Completed within requested scope</w:t>
             </w:r>
           </w:p>
         </w:tc>
@@ -4011,7 +3960,7 @@
                 <w:b w:val="0"/>
                 <w:sz w:val="16"/>
               </w:rPr>
-              <w:t>Six ablation variants are defined: two measured, one rule-based proxy reference, and three pending or learned-verifier-dependent cells.</w:t>
+              <w:t>The requested six-row structure is frozen. As explicitly allowed, two rows are measured, one is a rule-based proxy reference, and three future cells remain unfilled.</w:t>
             </w:r>
           </w:p>
         </w:tc>
@@ -5018,7 +4967,7 @@
     </w:p>
     <w:p>
       <w:r>
-        <w:t>Current automated verification: 128/128 tests passing. The immediate research priority is the learned verifier and completion of the pending controlled ablations, not additional web-interface work.</w:t>
+        <w:t>Current automated verification: 129/129 tests passing. The immediate research priority is the learned verifier and completion of the pending controlled ablations, not additional web-interface work.</w:t>
       </w:r>
     </w:p>
     <w:sectPr>
@@ -5037,9 +4986,6 @@
     <w:p>
       <w:pPr>
         <w:spacing w:line="240" w:lineRule="auto"/>
-        <w:rPr>
-          <w:rFonts w:hint="eastAsia"/>
-        </w:rPr>
       </w:pPr>
       <w:r>
         <w:separator/>
@@ -5050,9 +4996,6 @@
     <w:p>
       <w:pPr>
         <w:spacing w:line="240" w:lineRule="auto"/>
-        <w:rPr>
-          <w:rFonts w:hint="eastAsia"/>
-        </w:rPr>
       </w:pPr>
       <w:r>
         <w:continuationSeparator/>
@@ -5068,9 +5011,6 @@
     <w:p>
       <w:pPr>
         <w:spacing w:after="0"/>
-        <w:rPr>
-          <w:rFonts w:hint="eastAsia"/>
-        </w:rPr>
       </w:pPr>
       <w:r>
         <w:separator/>
@@ -5081,9 +5021,6 @@
     <w:p>
       <w:pPr>
         <w:spacing w:after="0"/>
-        <w:rPr>
-          <w:rFonts w:hint="eastAsia"/>
-        </w:rPr>
       </w:pPr>
       <w:r>
         <w:continuationSeparator/>

</xml_diff>

<commit_message>
Align experimental design with supervisor tasks
</commit_message>
<xml_diff>
--- a/MATHREPAIR_SUPERVISOR_PROGRESS_REPORT.docx
+++ b/MATHREPAIR_SUPERVISOR_PROGRESS_REPORT.docx
@@ -10,7 +10,6 @@
           <w:rFonts w:ascii="Times New Roman" w:hAnsi="Times New Roman" w:cs="Times New Roman"/>
         </w:rPr>
       </w:pPr>
-      <w:proofErr w:type="spellStart"/>
       <w:r>
         <w:rPr>
           <w:rFonts w:ascii="Times New Roman" w:hAnsi="Times New Roman" w:cs="Times New Roman"/>
@@ -18,17 +17,7 @@
           <w:color w:val="173248"/>
           <w:sz w:val="48"/>
         </w:rPr>
-        <w:t>MathRepair</w:t>
-      </w:r>
-      <w:proofErr w:type="spellEnd"/>
-      <w:r>
-        <w:rPr>
-          <w:rFonts w:ascii="Times New Roman" w:hAnsi="Times New Roman" w:cs="Times New Roman"/>
-          <w:b/>
-          <w:color w:val="173248"/>
-          <w:sz w:val="48"/>
-        </w:rPr>
-        <w:t xml:space="preserve"> Supervisor Progress Report</w:t>
+        <w:t>MathRepair Supervisor Progress Report</w:t>
       </w:r>
     </w:p>
     <w:p>
@@ -856,7 +845,7 @@
           </mc:Choice>
           <mc:Fallback>
             <w:pict>
-              <v:shapetype w14:anchorId="7C0507D6" id="_x0000_t32" coordsize="21600,21600" o:spt="32" o:oned="t" path="m,l21600,21600e" filled="f">
+              <v:shapetype w14:anchorId="219B5A62" id="_x0000_t32" coordsize="21600,21600" o:spt="32" o:oned="t" path="m,l21600,21600e" filled="f">
                 <v:path arrowok="t" fillok="f" o:connecttype="none"/>
                 <o:lock v:ext="edit" shapetype="t"/>
               </v:shapetype>
@@ -930,7 +919,7 @@
           </mc:Choice>
           <mc:Fallback>
             <w:pict>
-              <v:shape w14:anchorId="41BDC228" id="Straight Arrow Connector 1" o:spid="_x0000_s1026" type="#_x0000_t32" style="position:absolute;margin-left:388.85pt;margin-top:7.95pt;width:16.5pt;height:0;z-index:251654144;visibility:visible;mso-wrap-style:square;mso-wrap-distance-left:9pt;mso-wrap-distance-top:0;mso-wrap-distance-right:9pt;mso-wrap-distance-bottom:0;mso-position-horizontal:absolute;mso-position-horizontal-relative:text;mso-position-vertical:absolute;mso-position-vertical-relative:text" o:gfxdata="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" strokecolor="#4f81bd [3204]" strokeweight="2pt">
+              <v:shape w14:anchorId="7C4A771B" id="Straight Arrow Connector 1" o:spid="_x0000_s1026" type="#_x0000_t32" style="position:absolute;margin-left:388.85pt;margin-top:7.95pt;width:16.5pt;height:0;z-index:251654144;visibility:visible;mso-wrap-style:square;mso-wrap-distance-left:9pt;mso-wrap-distance-top:0;mso-wrap-distance-right:9pt;mso-wrap-distance-bottom:0;mso-position-horizontal:absolute;mso-position-horizontal-relative:text;mso-position-vertical:absolute;mso-position-vertical-relative:text" o:gfxdata="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" strokecolor="#4f81bd [3204]" strokeweight="2pt">
                 <v:stroke endarrow="block"/>
                 <v:shadow on="t" color="black" opacity="24903f" origin=",.5" offset="0,.55556mm"/>
               </v:shape>
@@ -1000,7 +989,7 @@
           </mc:Choice>
           <mc:Fallback>
             <w:pict>
-              <v:shape w14:anchorId="43266147" id="Straight Arrow Connector 1" o:spid="_x0000_s1026" type="#_x0000_t32" style="position:absolute;margin-left:349.85pt;margin-top:7.45pt;width:16.5pt;height:0;z-index:251658240;visibility:visible;mso-wrap-style:square;mso-wrap-distance-left:9pt;mso-wrap-distance-top:0;mso-wrap-distance-right:9pt;mso-wrap-distance-bottom:0;mso-position-horizontal:absolute;mso-position-horizontal-relative:text;mso-position-vertical:absolute;mso-position-vertical-relative:text" o:gfxdata="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" strokecolor="#4f81bd [3204]" strokeweight="2pt">
+              <v:shape w14:anchorId="22E6E9AA" id="Straight Arrow Connector 1" o:spid="_x0000_s1026" type="#_x0000_t32" style="position:absolute;margin-left:349.85pt;margin-top:7.45pt;width:16.5pt;height:0;z-index:251658240;visibility:visible;mso-wrap-style:square;mso-wrap-distance-left:9pt;mso-wrap-distance-top:0;mso-wrap-distance-right:9pt;mso-wrap-distance-bottom:0;mso-position-horizontal:absolute;mso-position-horizontal-relative:text;mso-position-vertical:absolute;mso-position-vertical-relative:text" o:gfxdata="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" strokecolor="#4f81bd [3204]" strokeweight="2pt">
                 <v:stroke endarrow="block"/>
                 <v:shadow on="t" color="black" opacity="24903f" origin=",.5" offset="0,.55556mm"/>
               </v:shape>
@@ -1092,47 +1081,44 @@
         </w:rPr>
       </w:pPr>
       <w:r>
-        <w:rPr>
-          <w:rFonts w:ascii="Times New Roman" w:hAnsi="Times New Roman" w:cs="Times New Roman"/>
-        </w:rPr>
-        <w:lastRenderedPageBreak/>
-        <w:t>5. Experimental Design</w:t>
+        <w:t>5. Experimental Design and Protocol Separation</w:t>
+      </w:r>
+    </w:p>
+    <w:p>
+      <w:pPr/>
+      <w:r>
+        <w:t>The report contains two complementary experimental protocols. They use different budget definitions and must not be pooled into one performance claim.</w:t>
+      </w:r>
+    </w:p>
+    <w:p>
+      <w:pPr>
+        <w:pStyle w:val="Heading2"/>
+      </w:pPr>
+      <w:r>
+        <w:t>5.1 Earlier Expanded Repeated-Seed Evaluation</w:t>
       </w:r>
     </w:p>
     <w:tbl>
       <w:tblPr>
         <w:tblStyle w:val="TableGrid"/>
-        <w:tblW w:w="0" w:type="auto"/>
-        <w:tblLook w:val="04A0" w:firstRow="1" w:lastRow="0" w:firstColumn="1" w:lastColumn="0" w:noHBand="0" w:noVBand="1"/>
+        <w:tblW w:type="auto" w:w="0"/>
+        <w:tblLook w:firstColumn="1" w:firstRow="1" w:lastColumn="0" w:lastRow="0" w:noHBand="0" w:noVBand="1" w:val="04A0"/>
       </w:tblPr>
       <w:tblGrid>
-        <w:gridCol w:w="1908"/>
-        <w:gridCol w:w="8086"/>
+        <w:gridCol w:w="5184"/>
+        <w:gridCol w:w="5184"/>
       </w:tblGrid>
       <w:tr>
         <w:tc>
           <w:tcPr>
-            <w:tcW w:w="1908" w:type="dxa"/>
-            <w:shd w:val="clear" w:color="auto" w:fill="173248"/>
-            <w:vAlign w:val="center"/>
-          </w:tcPr>
-          <w:p>
-            <w:pPr>
-              <w:spacing w:line="360" w:lineRule="auto"/>
-              <w:jc w:val="center"/>
-              <w:rPr>
-                <w:rFonts w:ascii="Times New Roman" w:hAnsi="Times New Roman" w:cs="Times New Roman"/>
-                <w:sz w:val="24"/>
-                <w:szCs w:val="24"/>
-              </w:rPr>
-            </w:pPr>
-            <w:r>
-              <w:rPr>
-                <w:rFonts w:ascii="Times New Roman" w:hAnsi="Times New Roman" w:cs="Times New Roman"/>
+            <w:tcW w:type="dxa" w:w="5184"/>
+          </w:tcPr>
+          <w:p>
+            <w:r/>
+            <w:r>
+              <w:rPr>
                 <w:b/>
-                <w:color w:val="FFFFFF"/>
-                <w:sz w:val="24"/>
-                <w:szCs w:val="24"/>
+                <w:sz w:val="16"/>
               </w:rPr>
               <w:t>Field</w:t>
             </w:r>
@@ -1140,27 +1126,14 @@
         </w:tc>
         <w:tc>
           <w:tcPr>
-            <w:tcW w:w="8086" w:type="dxa"/>
-            <w:shd w:val="clear" w:color="auto" w:fill="173248"/>
-            <w:vAlign w:val="center"/>
-          </w:tcPr>
-          <w:p>
-            <w:pPr>
-              <w:spacing w:line="360" w:lineRule="auto"/>
-              <w:jc w:val="center"/>
-              <w:rPr>
-                <w:rFonts w:ascii="Times New Roman" w:hAnsi="Times New Roman" w:cs="Times New Roman"/>
-                <w:sz w:val="24"/>
-                <w:szCs w:val="24"/>
-              </w:rPr>
-            </w:pPr>
-            <w:r>
-              <w:rPr>
-                <w:rFonts w:ascii="Times New Roman" w:hAnsi="Times New Roman" w:cs="Times New Roman"/>
+            <w:tcW w:type="dxa" w:w="5184"/>
+          </w:tcPr>
+          <w:p>
+            <w:r/>
+            <w:r>
+              <w:rPr>
                 <w:b/>
-                <w:color w:val="FFFFFF"/>
-                <w:sz w:val="24"/>
-                <w:szCs w:val="24"/>
+                <w:sz w:val="16"/>
               </w:rPr>
               <w:t>Protocol</w:t>
             </w:r>
@@ -1170,68 +1143,31 @@
       <w:tr>
         <w:tc>
           <w:tcPr>
-            <w:tcW w:w="1908" w:type="dxa"/>
-            <w:vAlign w:val="center"/>
-          </w:tcPr>
-          <w:p>
-            <w:pPr>
-              <w:spacing w:line="360" w:lineRule="auto"/>
-              <w:rPr>
-                <w:rFonts w:ascii="Times New Roman" w:hAnsi="Times New Roman" w:cs="Times New Roman"/>
-                <w:sz w:val="24"/>
-                <w:szCs w:val="24"/>
-              </w:rPr>
-            </w:pPr>
-            <w:r>
-              <w:rPr>
-                <w:rFonts w:ascii="Times New Roman" w:hAnsi="Times New Roman" w:cs="Times New Roman"/>
-                <w:b/>
-                <w:sz w:val="24"/>
-                <w:szCs w:val="24"/>
-              </w:rPr>
-              <w:t>Primary model</w:t>
-            </w:r>
-          </w:p>
-        </w:tc>
-        <w:tc>
-          <w:tcPr>
-            <w:tcW w:w="8086" w:type="dxa"/>
-            <w:vAlign w:val="center"/>
-          </w:tcPr>
-          <w:p>
-            <w:pPr>
-              <w:spacing w:line="360" w:lineRule="auto"/>
-              <w:rPr>
-                <w:rFonts w:ascii="Times New Roman" w:hAnsi="Times New Roman" w:cs="Times New Roman"/>
-                <w:sz w:val="24"/>
-                <w:szCs w:val="24"/>
-              </w:rPr>
-            </w:pPr>
-            <w:r>
-              <w:rPr>
-                <w:rFonts w:ascii="Times New Roman" w:hAnsi="Times New Roman" w:cs="Times New Roman"/>
-                <w:sz w:val="24"/>
-                <w:szCs w:val="24"/>
-              </w:rPr>
-              <w:t xml:space="preserve">qwen2-math:1.5b through the local </w:t>
-            </w:r>
-            <w:proofErr w:type="spellStart"/>
-            <w:r>
-              <w:rPr>
-                <w:rFonts w:ascii="Times New Roman" w:hAnsi="Times New Roman" w:cs="Times New Roman"/>
-                <w:sz w:val="24"/>
-                <w:szCs w:val="24"/>
-              </w:rPr>
-              <w:t>Ollama</w:t>
-            </w:r>
-            <w:proofErr w:type="spellEnd"/>
-            <w:r>
-              <w:rPr>
-                <w:rFonts w:ascii="Times New Roman" w:hAnsi="Times New Roman" w:cs="Times New Roman"/>
-                <w:sz w:val="24"/>
-                <w:szCs w:val="24"/>
-              </w:rPr>
-              <w:t xml:space="preserve"> API</w:t>
+            <w:tcW w:type="dxa" w:w="5184"/>
+          </w:tcPr>
+          <w:p>
+            <w:r/>
+            <w:r>
+              <w:rPr>
+                <w:b w:val="0"/>
+                <w:sz w:val="16"/>
+              </w:rPr>
+              <w:t>Purpose</w:t>
+            </w:r>
+          </w:p>
+        </w:tc>
+        <w:tc>
+          <w:tcPr>
+            <w:tcW w:type="dxa" w:w="5184"/>
+          </w:tcPr>
+          <w:p>
+            <w:r/>
+            <w:r>
+              <w:rPr>
+                <w:b w:val="0"/>
+                <w:sz w:val="16"/>
+              </w:rPr>
+              <w:t>Earlier evidence for local versus global repair on symbolic algebra.</w:t>
             </w:r>
           </w:p>
         </w:tc>
@@ -1239,50 +1175,31 @@
       <w:tr>
         <w:tc>
           <w:tcPr>
-            <w:tcW w:w="1908" w:type="dxa"/>
-            <w:vAlign w:val="center"/>
-          </w:tcPr>
-          <w:p>
-            <w:pPr>
-              <w:spacing w:line="360" w:lineRule="auto"/>
-              <w:rPr>
-                <w:rFonts w:ascii="Times New Roman" w:hAnsi="Times New Roman" w:cs="Times New Roman"/>
-                <w:sz w:val="24"/>
-                <w:szCs w:val="24"/>
-              </w:rPr>
-            </w:pPr>
-            <w:r>
-              <w:rPr>
-                <w:rFonts w:ascii="Times New Roman" w:hAnsi="Times New Roman" w:cs="Times New Roman"/>
-                <w:b/>
-                <w:sz w:val="24"/>
-                <w:szCs w:val="24"/>
-              </w:rPr>
-              <w:t>Task</w:t>
-            </w:r>
-          </w:p>
-        </w:tc>
-        <w:tc>
-          <w:tcPr>
-            <w:tcW w:w="8086" w:type="dxa"/>
-            <w:vAlign w:val="center"/>
-          </w:tcPr>
-          <w:p>
-            <w:pPr>
-              <w:spacing w:line="360" w:lineRule="auto"/>
-              <w:rPr>
-                <w:rFonts w:ascii="Times New Roman" w:hAnsi="Times New Roman" w:cs="Times New Roman"/>
-                <w:sz w:val="24"/>
-                <w:szCs w:val="24"/>
-              </w:rPr>
-            </w:pPr>
-            <w:r>
-              <w:rPr>
-                <w:rFonts w:ascii="Times New Roman" w:hAnsi="Times New Roman" w:cs="Times New Roman"/>
-                <w:sz w:val="24"/>
-                <w:szCs w:val="24"/>
-              </w:rPr>
-              <w:t>One-variable symbolic algebra</w:t>
+            <w:tcW w:type="dxa" w:w="5184"/>
+          </w:tcPr>
+          <w:p>
+            <w:r/>
+            <w:r>
+              <w:rPr>
+                <w:b w:val="0"/>
+                <w:sz w:val="16"/>
+              </w:rPr>
+              <w:t>Model</w:t>
+            </w:r>
+          </w:p>
+        </w:tc>
+        <w:tc>
+          <w:tcPr>
+            <w:tcW w:type="dxa" w:w="5184"/>
+          </w:tcPr>
+          <w:p>
+            <w:r/>
+            <w:r>
+              <w:rPr>
+                <w:b w:val="0"/>
+                <w:sz w:val="16"/>
+              </w:rPr>
+              <w:t>qwen2-math:1.5b through the local Ollama API.</w:t>
             </w:r>
           </w:p>
         </w:tc>
@@ -1290,50 +1207,31 @@
       <w:tr>
         <w:tc>
           <w:tcPr>
-            <w:tcW w:w="1908" w:type="dxa"/>
-            <w:vAlign w:val="center"/>
-          </w:tcPr>
-          <w:p>
-            <w:pPr>
-              <w:spacing w:line="360" w:lineRule="auto"/>
-              <w:rPr>
-                <w:rFonts w:ascii="Times New Roman" w:hAnsi="Times New Roman" w:cs="Times New Roman"/>
-                <w:sz w:val="24"/>
-                <w:szCs w:val="24"/>
-              </w:rPr>
-            </w:pPr>
-            <w:r>
-              <w:rPr>
-                <w:rFonts w:ascii="Times New Roman" w:hAnsi="Times New Roman" w:cs="Times New Roman"/>
-                <w:b/>
-                <w:sz w:val="24"/>
-                <w:szCs w:val="24"/>
-              </w:rPr>
-              <w:t>Expanded set</w:t>
-            </w:r>
-          </w:p>
-        </w:tc>
-        <w:tc>
-          <w:tcPr>
-            <w:tcW w:w="8086" w:type="dxa"/>
-            <w:vAlign w:val="center"/>
-          </w:tcPr>
-          <w:p>
-            <w:pPr>
-              <w:spacing w:line="360" w:lineRule="auto"/>
-              <w:rPr>
-                <w:rFonts w:ascii="Times New Roman" w:hAnsi="Times New Roman" w:cs="Times New Roman"/>
-                <w:sz w:val="24"/>
-                <w:szCs w:val="24"/>
-              </w:rPr>
-            </w:pPr>
-            <w:r>
-              <w:rPr>
-                <w:rFonts w:ascii="Times New Roman" w:hAnsi="Times New Roman" w:cs="Times New Roman"/>
-                <w:sz w:val="24"/>
-                <w:szCs w:val="24"/>
-              </w:rPr>
-              <w:t>36 problems, including 18 earlier held-out and 18 new problems</w:t>
+            <w:tcW w:type="dxa" w:w="5184"/>
+          </w:tcPr>
+          <w:p>
+            <w:r/>
+            <w:r>
+              <w:rPr>
+                <w:b w:val="0"/>
+                <w:sz w:val="16"/>
+              </w:rPr>
+              <w:t>Dataset</w:t>
+            </w:r>
+          </w:p>
+        </w:tc>
+        <w:tc>
+          <w:tcPr>
+            <w:tcW w:type="dxa" w:w="5184"/>
+          </w:tcPr>
+          <w:p>
+            <w:r/>
+            <w:r>
+              <w:rPr>
+                <w:b w:val="0"/>
+                <w:sz w:val="16"/>
+              </w:rPr>
+              <w:t>36 algebra problems: 18 earlier held-out and 18 new.</w:t>
             </w:r>
           </w:p>
         </w:tc>
@@ -1341,24 +1239,14 @@
       <w:tr>
         <w:tc>
           <w:tcPr>
-            <w:tcW w:w="1908" w:type="dxa"/>
-            <w:vAlign w:val="center"/>
-          </w:tcPr>
-          <w:p>
-            <w:pPr>
-              <w:spacing w:line="360" w:lineRule="auto"/>
-              <w:rPr>
-                <w:rFonts w:ascii="Times New Roman" w:hAnsi="Times New Roman" w:cs="Times New Roman"/>
-                <w:sz w:val="24"/>
-                <w:szCs w:val="24"/>
-              </w:rPr>
-            </w:pPr>
-            <w:r>
-              <w:rPr>
-                <w:rFonts w:ascii="Times New Roman" w:hAnsi="Times New Roman" w:cs="Times New Roman"/>
-                <w:b/>
-                <w:sz w:val="24"/>
-                <w:szCs w:val="24"/>
+            <w:tcW w:type="dxa" w:w="5184"/>
+          </w:tcPr>
+          <w:p>
+            <w:r/>
+            <w:r>
+              <w:rPr>
+                <w:b w:val="0"/>
+                <w:sz w:val="16"/>
               </w:rPr>
               <w:t>Trials</w:t>
             </w:r>
@@ -1366,25 +1254,16 @@
         </w:tc>
         <w:tc>
           <w:tcPr>
-            <w:tcW w:w="8086" w:type="dxa"/>
-            <w:vAlign w:val="center"/>
-          </w:tcPr>
-          <w:p>
-            <w:pPr>
-              <w:spacing w:line="360" w:lineRule="auto"/>
-              <w:rPr>
-                <w:rFonts w:ascii="Times New Roman" w:hAnsi="Times New Roman" w:cs="Times New Roman"/>
-                <w:sz w:val="24"/>
-                <w:szCs w:val="24"/>
-              </w:rPr>
-            </w:pPr>
-            <w:r>
-              <w:rPr>
-                <w:rFonts w:ascii="Times New Roman" w:hAnsi="Times New Roman" w:cs="Times New Roman"/>
-                <w:sz w:val="24"/>
-                <w:szCs w:val="24"/>
-              </w:rPr>
-              <w:t>3 seeds; 108 planned runs in total</w:t>
+            <w:tcW w:type="dxa" w:w="5184"/>
+          </w:tcPr>
+          <w:p>
+            <w:r/>
+            <w:r>
+              <w:rPr>
+                <w:b w:val="0"/>
+                <w:sz w:val="16"/>
+              </w:rPr>
+              <w:t>Three seeds and 36 runs per seed; 108 completed runs.</w:t>
             </w:r>
           </w:p>
         </w:tc>
@@ -1392,24 +1271,14 @@
       <w:tr>
         <w:tc>
           <w:tcPr>
-            <w:tcW w:w="1908" w:type="dxa"/>
-            <w:vAlign w:val="center"/>
-          </w:tcPr>
-          <w:p>
-            <w:pPr>
-              <w:spacing w:line="360" w:lineRule="auto"/>
-              <w:rPr>
-                <w:rFonts w:ascii="Times New Roman" w:hAnsi="Times New Roman" w:cs="Times New Roman"/>
-                <w:sz w:val="24"/>
-                <w:szCs w:val="24"/>
-              </w:rPr>
-            </w:pPr>
-            <w:r>
-              <w:rPr>
-                <w:rFonts w:ascii="Times New Roman" w:hAnsi="Times New Roman" w:cs="Times New Roman"/>
-                <w:b/>
-                <w:sz w:val="24"/>
-                <w:szCs w:val="24"/>
+            <w:tcW w:type="dxa" w:w="5184"/>
+          </w:tcPr>
+          <w:p>
+            <w:r/>
+            <w:r>
+              <w:rPr>
+                <w:b w:val="0"/>
+                <w:sz w:val="16"/>
               </w:rPr>
               <w:t>Strategies</w:t>
             </w:r>
@@ -1417,25 +1286,16 @@
         </w:tc>
         <w:tc>
           <w:tcPr>
-            <w:tcW w:w="8086" w:type="dxa"/>
-            <w:vAlign w:val="center"/>
-          </w:tcPr>
-          <w:p>
-            <w:pPr>
-              <w:spacing w:line="360" w:lineRule="auto"/>
-              <w:rPr>
-                <w:rFonts w:ascii="Times New Roman" w:hAnsi="Times New Roman" w:cs="Times New Roman"/>
-                <w:sz w:val="24"/>
-                <w:szCs w:val="24"/>
-              </w:rPr>
-            </w:pPr>
-            <w:r>
-              <w:rPr>
-                <w:rFonts w:ascii="Times New Roman" w:hAnsi="Times New Roman" w:cs="Times New Roman"/>
-                <w:sz w:val="24"/>
-                <w:szCs w:val="24"/>
-              </w:rPr>
-              <w:t>No repair, verified global regeneration, verified local repair</w:t>
+            <w:tcW w:type="dxa" w:w="5184"/>
+          </w:tcPr>
+          <w:p>
+            <w:r/>
+            <w:r>
+              <w:rPr>
+                <w:b w:val="0"/>
+                <w:sz w:val="16"/>
+              </w:rPr>
+              <w:t>No repair, verified global regeneration, and verified local repair.</w:t>
             </w:r>
           </w:p>
         </w:tc>
@@ -1443,24 +1303,46 @@
       <w:tr>
         <w:tc>
           <w:tcPr>
-            <w:tcW w:w="1908" w:type="dxa"/>
-            <w:vAlign w:val="center"/>
-          </w:tcPr>
-          <w:p>
-            <w:pPr>
-              <w:spacing w:line="360" w:lineRule="auto"/>
-              <w:rPr>
-                <w:rFonts w:ascii="Times New Roman" w:hAnsi="Times New Roman" w:cs="Times New Roman"/>
-                <w:sz w:val="24"/>
-                <w:szCs w:val="24"/>
-              </w:rPr>
-            </w:pPr>
-            <w:r>
-              <w:rPr>
-                <w:rFonts w:ascii="Times New Roman" w:hAnsi="Times New Roman" w:cs="Times New Roman"/>
-                <w:b/>
-                <w:sz w:val="24"/>
-                <w:szCs w:val="24"/>
+            <w:tcW w:type="dxa" w:w="5184"/>
+          </w:tcPr>
+          <w:p>
+            <w:r/>
+            <w:r>
+              <w:rPr>
+                <w:b w:val="0"/>
+                <w:sz w:val="16"/>
+              </w:rPr>
+              <w:t>Budget</w:t>
+            </w:r>
+          </w:p>
+        </w:tc>
+        <w:tc>
+          <w:tcPr>
+            <w:tcW w:type="dxa" w:w="5184"/>
+          </w:tcPr>
+          <w:p>
+            <w:r/>
+            <w:r>
+              <w:rPr>
+                <w:b w:val="0"/>
+                <w:sz w:val="16"/>
+              </w:rPr>
+              <w:t>Matched per detected-error case under the earlier protocol.</w:t>
+            </w:r>
+          </w:p>
+        </w:tc>
+      </w:tr>
+      <w:tr>
+        <w:tc>
+          <w:tcPr>
+            <w:tcW w:type="dxa" w:w="5184"/>
+          </w:tcPr>
+          <w:p>
+            <w:r/>
+            <w:r>
+              <w:rPr>
+                <w:b w:val="0"/>
+                <w:sz w:val="16"/>
               </w:rPr>
               <w:t>Metrics</w:t>
             </w:r>
@@ -1468,30 +1350,341 @@
         </w:tc>
         <w:tc>
           <w:tcPr>
-            <w:tcW w:w="8086" w:type="dxa"/>
-            <w:vAlign w:val="center"/>
-          </w:tcPr>
-          <w:p>
-            <w:pPr>
-              <w:spacing w:line="360" w:lineRule="auto"/>
-              <w:rPr>
-                <w:rFonts w:ascii="Times New Roman" w:hAnsi="Times New Roman" w:cs="Times New Roman"/>
-                <w:sz w:val="24"/>
-                <w:szCs w:val="24"/>
-              </w:rPr>
-            </w:pPr>
-            <w:r>
-              <w:rPr>
-                <w:rFonts w:ascii="Times New Roman" w:hAnsi="Times New Roman" w:cs="Times New Roman"/>
-                <w:sz w:val="24"/>
-                <w:szCs w:val="24"/>
-              </w:rPr>
-              <w:t>Answer accuracy, valid traces, repair success, calls, tokens, and paired confidence intervals</w:t>
+            <w:tcW w:type="dxa" w:w="5184"/>
+          </w:tcPr>
+          <w:p>
+            <w:r/>
+            <w:r>
+              <w:rPr>
+                <w:b w:val="0"/>
+                <w:sz w:val="16"/>
+              </w:rPr>
+              <w:t>Answer accuracy, valid-trace rate, calls, tokens, and paired confidence intervals.</w:t>
             </w:r>
           </w:p>
         </w:tc>
       </w:tr>
     </w:tbl>
+    <w:p>
+      <w:pPr>
+        <w:pStyle w:val="Heading2"/>
+      </w:pPr>
+      <w:r>
+        <w:t>5.2 Supervisor Task 1-7 Methodology</w:t>
+      </w:r>
+    </w:p>
+    <w:tbl>
+      <w:tblPr>
+        <w:tblStyle w:val="TableGrid"/>
+        <w:tblW w:type="auto" w:w="0"/>
+        <w:tblLook w:firstColumn="1" w:firstRow="1" w:lastColumn="0" w:lastRow="0" w:noHBand="0" w:noVBand="1" w:val="04A0"/>
+      </w:tblPr>
+      <w:tblGrid>
+        <w:gridCol w:w="5184"/>
+        <w:gridCol w:w="5184"/>
+      </w:tblGrid>
+      <w:tr>
+        <w:tc>
+          <w:tcPr>
+            <w:tcW w:type="dxa" w:w="5184"/>
+          </w:tcPr>
+          <w:p>
+            <w:r/>
+            <w:r>
+              <w:rPr>
+                <w:b/>
+                <w:sz w:val="16"/>
+              </w:rPr>
+              <w:t>Field</w:t>
+            </w:r>
+          </w:p>
+        </w:tc>
+        <w:tc>
+          <w:tcPr>
+            <w:tcW w:type="dxa" w:w="5184"/>
+          </w:tcPr>
+          <w:p>
+            <w:r/>
+            <w:r>
+              <w:rPr>
+                <w:b/>
+                <w:sz w:val="16"/>
+              </w:rPr>
+              <w:t>Protocol</w:t>
+            </w:r>
+          </w:p>
+        </w:tc>
+      </w:tr>
+      <w:tr>
+        <w:tc>
+          <w:tcPr>
+            <w:tcW w:type="dxa" w:w="5184"/>
+          </w:tcPr>
+          <w:p>
+            <w:r/>
+            <w:r>
+              <w:rPr>
+                <w:b w:val="0"/>
+                <w:sz w:val="16"/>
+              </w:rPr>
+              <w:t>Internal representation</w:t>
+            </w:r>
+          </w:p>
+        </w:tc>
+        <w:tc>
+          <w:tcPr>
+            <w:tcW w:type="dxa" w:w="5184"/>
+          </w:tcPr>
+          <w:p>
+            <w:r/>
+            <w:r>
+              <w:rPr>
+                <w:b w:val="0"/>
+                <w:sz w:val="16"/>
+              </w:rPr>
+              <w:t>Model traces are verified and repaired as reasoning graphs with node state, parents, error impact, repair, and final status.</w:t>
+            </w:r>
+          </w:p>
+        </w:tc>
+      </w:tr>
+      <w:tr>
+        <w:tc>
+          <w:tcPr>
+            <w:tcW w:type="dxa" w:w="5184"/>
+          </w:tcPr>
+          <w:p>
+            <w:r/>
+            <w:r>
+              <w:rPr>
+                <w:b w:val="0"/>
+                <w:sz w:val="16"/>
+              </w:rPr>
+              <w:t>Hard pilot</w:t>
+            </w:r>
+          </w:p>
+        </w:tc>
+        <w:tc>
+          <w:tcPr>
+            <w:tcW w:type="dxa" w:w="5184"/>
+          </w:tcPr>
+          <w:p>
+            <w:r/>
+            <w:r>
+              <w:rPr>
+                <w:b w:val="0"/>
+                <w:sz w:val="16"/>
+              </w:rPr>
+              <w:t>A deterministic 40-problem MATH-500 subset: 17 level-4 and 23 level-5 problems across seven subjects; processing check only.</w:t>
+            </w:r>
+          </w:p>
+        </w:tc>
+      </w:tr>
+      <w:tr>
+        <w:tc>
+          <w:tcPr>
+            <w:tcW w:type="dxa" w:w="5184"/>
+          </w:tcPr>
+          <w:p>
+            <w:r/>
+            <w:r>
+              <w:rPr>
+                <w:b w:val="0"/>
+                <w:sz w:val="16"/>
+              </w:rPr>
+              <w:t>Typed errors</w:t>
+            </w:r>
+          </w:p>
+        </w:tc>
+        <w:tc>
+          <w:tcPr>
+            <w:tcW w:type="dxa" w:w="5184"/>
+          </w:tcPr>
+          <w:p>
+            <w:r/>
+            <w:r>
+              <w:rPr>
+                <w:b w:val="0"/>
+                <w:sz w:val="16"/>
+              </w:rPr>
+              <w:t>Eight frozen error classes with definitions, examples, detection contracts, and allowed repair actions.</w:t>
+            </w:r>
+          </w:p>
+        </w:tc>
+      </w:tr>
+      <w:tr>
+        <w:tc>
+          <w:tcPr>
+            <w:tcW w:type="dxa" w:w="5184"/>
+          </w:tcPr>
+          <w:p>
+            <w:r/>
+            <w:r>
+              <w:rPr>
+                <w:b w:val="0"/>
+                <w:sz w:val="16"/>
+              </w:rPr>
+              <w:t>Verifier supervision</w:t>
+            </w:r>
+          </w:p>
+        </w:tc>
+        <w:tc>
+          <w:tcPr>
+            <w:tcW w:type="dxa" w:w="5184"/>
+          </w:tcPr>
+          <w:p>
+            <w:r/>
+            <w:r>
+              <w:rPr>
+                <w:b w:val="0"/>
+                <w:sz w:val="16"/>
+              </w:rPr>
+              <w:t>48 controlled corrupted/correct trace pairs, balanced at six examples per error type.</w:t>
+            </w:r>
+          </w:p>
+        </w:tc>
+      </w:tr>
+      <w:tr>
+        <w:tc>
+          <w:tcPr>
+            <w:tcW w:type="dxa" w:w="5184"/>
+          </w:tcPr>
+          <w:p>
+            <w:r/>
+            <w:r>
+              <w:rPr>
+                <w:b w:val="0"/>
+                <w:sz w:val="16"/>
+              </w:rPr>
+              <w:t>Fresh matched budget</w:t>
+            </w:r>
+          </w:p>
+        </w:tc>
+        <w:tc>
+          <w:tcPr>
+            <w:tcW w:type="dxa" w:w="5184"/>
+          </w:tcPr>
+          <w:p>
+            <w:r/>
+            <w:r>
+              <w:rPr>
+                <w:b w:val="0"/>
+                <w:sz w:val="16"/>
+              </w:rPr>
+              <w:t>Thirty-six initial runs and seven detected-error cases; global, uniform-local, and adaptive-local arms share an approximately 5,800 additional-token ceiling.</w:t>
+            </w:r>
+          </w:p>
+        </w:tc>
+      </w:tr>
+      <w:tr>
+        <w:tc>
+          <w:tcPr>
+            <w:tcW w:type="dxa" w:w="5184"/>
+          </w:tcPr>
+          <w:p>
+            <w:r/>
+            <w:r>
+              <w:rPr>
+                <w:b w:val="0"/>
+                <w:sz w:val="16"/>
+              </w:rPr>
+              <w:t>Ablations</w:t>
+            </w:r>
+          </w:p>
+        </w:tc>
+        <w:tc>
+          <w:tcPr>
+            <w:tcW w:type="dxa" w:w="5184"/>
+          </w:tcPr>
+          <w:p>
+            <w:r/>
+            <w:r>
+              <w:rPr>
+                <w:b w:val="0"/>
+                <w:sz w:val="16"/>
+              </w:rPr>
+              <w:t>Six frozen variants with explicit measured, proxy, planned, and learned-verifier-dependent evidence states.</w:t>
+            </w:r>
+          </w:p>
+        </w:tc>
+      </w:tr>
+      <w:tr>
+        <w:tc>
+          <w:tcPr>
+            <w:tcW w:type="dxa" w:w="5184"/>
+          </w:tcPr>
+          <w:p>
+            <w:r/>
+            <w:r>
+              <w:rPr>
+                <w:b w:val="0"/>
+                <w:sz w:val="16"/>
+              </w:rPr>
+              <w:t>Output contracts</w:t>
+            </w:r>
+          </w:p>
+        </w:tc>
+        <w:tc>
+          <w:tcPr>
+            <w:tcW w:type="dxa" w:w="5184"/>
+          </w:tcPr>
+          <w:p>
+            <w:r/>
+            <w:r>
+              <w:rPr>
+                <w:b w:val="0"/>
+                <w:sz w:val="16"/>
+              </w:rPr>
+              <w:t>Four saved configurations preserve model digests, prompt/parser versions, 432 raw outputs, failures, and strict/normalized accuracy.</w:t>
+            </w:r>
+          </w:p>
+        </w:tc>
+      </w:tr>
+      <w:tr>
+        <w:tc>
+          <w:tcPr>
+            <w:tcW w:type="dxa" w:w="5184"/>
+          </w:tcPr>
+          <w:p>
+            <w:r/>
+            <w:r>
+              <w:rPr>
+                <w:b w:val="0"/>
+                <w:sz w:val="16"/>
+              </w:rPr>
+              <w:t>Primary fresh metric</w:t>
+            </w:r>
+          </w:p>
+        </w:tc>
+        <w:tc>
+          <w:tcPr>
+            <w:tcW w:type="dxa" w:w="5184"/>
+          </w:tcPr>
+          <w:p>
+            <w:r/>
+            <w:r>
+              <w:rPr>
+                <w:b w:val="0"/>
+                <w:sz w:val="16"/>
+              </w:rPr>
+              <w:t>Answer accuracy over all scheduled runs; secondary metrics include valid traces, repair success, calls, tokens, and budget violations.</w:t>
+            </w:r>
+          </w:p>
+        </w:tc>
+      </w:tr>
+    </w:tbl>
+    <w:p>
+      <w:pPr>
+        <w:pStyle w:val="Heading2"/>
+      </w:pPr>
+      <w:r>
+        <w:t>5.3 Interpretation Boundary</w:t>
+      </w:r>
+    </w:p>
+    <w:p>
+      <w:r>
+        <w:t>The earlier expanded experiment reported 100.0% local repair versus 92.6% global regeneration. The stricter fresh total-token-matched pilot reported 86.1% adaptive local repair versus 88.9% global regeneration. Because the protocols answer different questions, neither result replaces the other and no universal superiority claim is made.</w:t>
+      </w:r>
+    </w:p>
     <w:p>
       <w:pPr>
         <w:pStyle w:val="Heading1"/>
@@ -1501,10 +1694,7 @@
         </w:rPr>
       </w:pPr>
       <w:r>
-        <w:rPr>
-          <w:rFonts w:ascii="Times New Roman" w:hAnsi="Times New Roman" w:cs="Times New Roman"/>
-        </w:rPr>
-        <w:t>6. Primary Results</w:t>
+        <w:t>6. Earlier Expanded Evaluation Results</w:t>
       </w:r>
     </w:p>
     <w:tbl>
@@ -2723,10 +2913,7 @@
         </w:rPr>
       </w:pPr>
       <w:r>
-        <w:rPr>
-          <w:rFonts w:ascii="Times New Roman" w:hAnsi="Times New Roman" w:cs="Times New Roman"/>
-        </w:rPr>
-        <w:t>Executable graph-based verifier and repair pipeline with 128 passing tests.</w:t>
+        <w:t>Executable graph-based verifier and repair pipeline with 129 passing tests.</w:t>
       </w:r>
     </w:p>
     <w:p>
@@ -3156,7 +3343,6 @@
     <w:p>
       <w:pPr>
         <w:spacing w:line="360" w:lineRule="auto"/>
-        <w:ind w:left="360"/>
         <w:rPr>
           <w:rFonts w:ascii="Times New Roman" w:hAnsi="Times New Roman" w:cs="Times New Roman"/>
           <w:sz w:val="24"/>
@@ -3174,67 +3360,13 @@
           <w:szCs w:val="24"/>
         </w:rPr>
       </w:pPr>
-    </w:p>
-    <w:p>
-      <w:pPr>
-        <w:spacing w:line="360" w:lineRule="auto"/>
-        <w:ind w:left="360"/>
-        <w:rPr>
-          <w:rFonts w:ascii="Times New Roman" w:hAnsi="Times New Roman" w:cs="Times New Roman"/>
-          <w:sz w:val="24"/>
-          <w:szCs w:val="24"/>
-        </w:rPr>
-      </w:pPr>
-    </w:p>
-    <w:p>
-      <w:pPr>
-        <w:spacing w:line="360" w:lineRule="auto"/>
-        <w:ind w:left="360"/>
-        <w:rPr>
-          <w:rFonts w:ascii="Times New Roman" w:hAnsi="Times New Roman" w:cs="Times New Roman"/>
-          <w:sz w:val="24"/>
-          <w:szCs w:val="24"/>
-        </w:rPr>
-      </w:pPr>
-    </w:p>
-    <w:p>
-      <w:pPr>
-        <w:spacing w:line="360" w:lineRule="auto"/>
-        <w:ind w:left="360"/>
-        <w:rPr>
-          <w:rFonts w:ascii="Times New Roman" w:hAnsi="Times New Roman" w:cs="Times New Roman"/>
-          <w:sz w:val="24"/>
-          <w:szCs w:val="24"/>
-        </w:rPr>
-      </w:pPr>
-    </w:p>
-    <w:p>
-      <w:pPr>
-        <w:spacing w:line="360" w:lineRule="auto"/>
-        <w:ind w:left="360"/>
-        <w:rPr>
-          <w:rFonts w:ascii="Times New Roman" w:hAnsi="Times New Roman" w:cs="Times New Roman"/>
-          <w:sz w:val="24"/>
-          <w:szCs w:val="24"/>
-        </w:rPr>
-      </w:pPr>
-    </w:p>
-    <w:p>
-      <w:pPr>
-        <w:spacing w:line="360" w:lineRule="auto"/>
-        <w:ind w:left="360"/>
-        <w:rPr>
-          <w:rFonts w:ascii="Times New Roman" w:hAnsi="Times New Roman" w:cs="Times New Roman"/>
-          <w:sz w:val="24"/>
-          <w:szCs w:val="24"/>
-        </w:rPr>
-      </w:pPr>
       <w:r>
         <w:rPr>
           <w:rFonts w:ascii="Times New Roman" w:hAnsi="Times New Roman" w:cs="Times New Roman"/>
           <w:sz w:val="24"/>
           <w:szCs w:val="24"/>
         </w:rPr>
+        <w:lastRenderedPageBreak/>
         <w:t>python model_pipeline.py --provider mock</w:t>
       </w:r>
     </w:p>
@@ -3328,7 +3460,6 @@
           <w:sz w:val="24"/>
           <w:szCs w:val="24"/>
         </w:rPr>
-        <w:lastRenderedPageBreak/>
         <w:drawing>
           <wp:inline distT="0" distB="0" distL="0" distR="0" wp14:anchorId="2AA59B19" wp14:editId="038C352A">
             <wp:extent cx="6346190" cy="4114800"/>
@@ -3393,6 +3524,7 @@
           <w:sz w:val="24"/>
           <w:szCs w:val="24"/>
         </w:rPr>
+        <w:lastRenderedPageBreak/>
         <w:t>python allocation_report.py</w:t>
       </w:r>
     </w:p>
@@ -3499,15 +3631,7 @@
       </w:r>
     </w:p>
     <w:p>
-      <w:pPr>
-        <w:rPr>
-          <w:rFonts w:ascii="Times New Roman" w:hAnsi="Times New Roman" w:cs="Times New Roman"/>
-        </w:rPr>
-      </w:pPr>
       <w:r>
-        <w:rPr>
-          <w:rFonts w:ascii="Times New Roman" w:hAnsi="Times New Roman" w:cs="Times New Roman"/>
-        </w:rPr>
         <w:br w:type="page"/>
       </w:r>
     </w:p>

</xml_diff>

<commit_message>
Align remaining supervisor report tables
</commit_message>
<xml_diff>
--- a/MATHREPAIR_SUPERVISOR_PROGRESS_REPORT.docx
+++ b/MATHREPAIR_SUPERVISOR_PROGRESS_REPORT.docx
@@ -10,6 +10,7 @@
           <w:rFonts w:ascii="Times New Roman" w:hAnsi="Times New Roman" w:cs="Times New Roman"/>
         </w:rPr>
       </w:pPr>
+      <w:proofErr w:type="spellStart"/>
       <w:r>
         <w:rPr>
           <w:rFonts w:ascii="Times New Roman" w:hAnsi="Times New Roman" w:cs="Times New Roman"/>
@@ -17,7 +18,17 @@
           <w:color w:val="173248"/>
           <w:sz w:val="48"/>
         </w:rPr>
-        <w:t>MathRepair Supervisor Progress Report</w:t>
+        <w:t>MathRepair</w:t>
+      </w:r>
+      <w:proofErr w:type="spellEnd"/>
+      <w:r>
+        <w:rPr>
+          <w:rFonts w:ascii="Times New Roman" w:hAnsi="Times New Roman" w:cs="Times New Roman"/>
+          <w:b/>
+          <w:color w:val="173248"/>
+          <w:sz w:val="48"/>
+        </w:rPr>
+        <w:t xml:space="preserve"> Supervisor Progress Report</w:t>
       </w:r>
     </w:p>
     <w:p>
@@ -86,13 +97,23 @@
           <w:szCs w:val="24"/>
         </w:rPr>
       </w:pPr>
+      <w:proofErr w:type="spellStart"/>
       <w:r>
         <w:rPr>
           <w:rFonts w:ascii="Times New Roman" w:hAnsi="Times New Roman" w:cs="Times New Roman"/>
           <w:sz w:val="24"/>
           <w:szCs w:val="24"/>
         </w:rPr>
-        <w:t>MathRepair now connects model-generated traces directly to its reasoning graph and includes a 40-problem MATH-500 pilot, a frozen eight-class error taxonomy, a 48-example typed-verifier dataset, a fresh three-arm matched-budget pilot, a frozen ablation matrix, and a versioned archive of 432 raw outputs. The earlier expanded algebra experiment found 100.0% local-repair accuracy versus 92.6% global regeneration. A newer and stricter total-budget pilot found 88.9% for global regeneration and 86.1% for both local arms. These protocols answer different questions, so the report does not claim universal local-repair superiority.</w:t>
+        <w:t>MathRepair</w:t>
+      </w:r>
+      <w:proofErr w:type="spellEnd"/>
+      <w:r>
+        <w:rPr>
+          <w:rFonts w:ascii="Times New Roman" w:hAnsi="Times New Roman" w:cs="Times New Roman"/>
+          <w:sz w:val="24"/>
+          <w:szCs w:val="24"/>
+        </w:rPr>
+        <w:t xml:space="preserve"> now connects model-generated traces directly to its reasoning graph and includes a 40-problem MATH-500 pilot, a frozen eight-class error taxonomy, a 48-example typed-verifier dataset, a fresh three-arm matched-budget pilot, a frozen ablation matrix, and a versioned archive of 432 raw outputs. The earlier expanded algebra experiment found 100.0% local-repair accuracy versus 92.6% global regeneration. A newer and stricter total-budget pilot found 88.9% for global regeneration and 86.1% for both local arms. These protocols answer different questions, so the report does not claim universal local-repair superiority.</w:t>
       </w:r>
     </w:p>
     <w:p>
@@ -444,23 +465,14 @@
       <w:tr>
         <w:tc>
           <w:tcPr>
-            <w:tcW w:w="2088" w:type="dxa"/>
-            <w:vAlign w:val="center"/>
-          </w:tcPr>
-          <w:p>
-            <w:pPr>
-              <w:spacing w:line="360" w:lineRule="auto"/>
-              <w:rPr>
-                <w:rFonts w:ascii="Times New Roman" w:hAnsi="Times New Roman" w:cs="Times New Roman"/>
-                <w:sz w:val="24"/>
-                <w:szCs w:val="24"/>
-              </w:rPr>
-            </w:pPr>
-            <w:r>
-              <w:rPr>
-                <w:rFonts w:ascii="Times New Roman" w:hAnsi="Times New Roman" w:cs="Times New Roman"/>
-                <w:sz w:val="24"/>
-                <w:szCs w:val="24"/>
+            <w:tcW w:type="dxa" w:w="2088"/>
+          </w:tcPr>
+          <w:p>
+            <w:r/>
+            <w:r>
+              <w:rPr>
+                <w:b w:val="0"/>
+                <w:sz w:val="16"/>
               </w:rPr>
               <w:t>Symbolic verifier</w:t>
             </w:r>
@@ -468,25 +480,16 @@
         </w:tc>
         <w:tc>
           <w:tcPr>
-            <w:tcW w:w="7906" w:type="dxa"/>
-            <w:vAlign w:val="center"/>
-          </w:tcPr>
-          <w:p>
-            <w:pPr>
-              <w:spacing w:line="360" w:lineRule="auto"/>
-              <w:rPr>
-                <w:rFonts w:ascii="Times New Roman" w:hAnsi="Times New Roman" w:cs="Times New Roman"/>
-                <w:sz w:val="24"/>
-                <w:szCs w:val="24"/>
-              </w:rPr>
-            </w:pPr>
-            <w:r>
-              <w:rPr>
-                <w:rFonts w:ascii="Times New Roman" w:hAnsi="Times New Roman" w:cs="Times New Roman"/>
-                <w:sz w:val="24"/>
-                <w:szCs w:val="24"/>
-              </w:rPr>
-              <w:t>Equation parsing, solution-set equivalence, supporting identities, arithmetic and sign errors</w:t>
+            <w:tcW w:type="dxa" w:w="7906"/>
+          </w:tcPr>
+          <w:p>
+            <w:r/>
+            <w:r>
+              <w:rPr>
+                <w:b w:val="0"/>
+                <w:sz w:val="16"/>
+              </w:rPr>
+              <w:t>Rule-based equation equivalence, supporting identities, arithmetic, sign, and algebraic-transformation checks; learned verifier remains deferred.</w:t>
             </w:r>
           </w:p>
         </w:tc>
@@ -494,65 +497,31 @@
       <w:tr>
         <w:tc>
           <w:tcPr>
-            <w:tcW w:w="2088" w:type="dxa"/>
-            <w:vAlign w:val="center"/>
-          </w:tcPr>
-          <w:p>
-            <w:pPr>
-              <w:spacing w:line="360" w:lineRule="auto"/>
-              <w:rPr>
-                <w:rFonts w:ascii="Times New Roman" w:hAnsi="Times New Roman" w:cs="Times New Roman"/>
-                <w:sz w:val="24"/>
-                <w:szCs w:val="24"/>
-              </w:rPr>
-            </w:pPr>
-            <w:r>
-              <w:rPr>
-                <w:rFonts w:ascii="Times New Roman" w:hAnsi="Times New Roman" w:cs="Times New Roman"/>
-                <w:sz w:val="24"/>
-                <w:szCs w:val="24"/>
-              </w:rPr>
-              <w:t>Repair policy</w:t>
-            </w:r>
-          </w:p>
-        </w:tc>
-        <w:tc>
-          <w:tcPr>
-            <w:tcW w:w="7906" w:type="dxa"/>
-            <w:vAlign w:val="center"/>
-          </w:tcPr>
-          <w:p>
-            <w:pPr>
-              <w:spacing w:line="360" w:lineRule="auto"/>
-              <w:rPr>
-                <w:rFonts w:ascii="Times New Roman" w:hAnsi="Times New Roman" w:cs="Times New Roman"/>
-                <w:sz w:val="24"/>
-                <w:szCs w:val="24"/>
-              </w:rPr>
-            </w:pPr>
-            <w:r>
-              <w:rPr>
-                <w:rFonts w:ascii="Times New Roman" w:hAnsi="Times New Roman" w:cs="Times New Roman"/>
-                <w:sz w:val="24"/>
-                <w:szCs w:val="24"/>
-              </w:rPr>
-              <w:t>TOOL_EXECUTE, BACKTRACK, REFORMALIZE,</w:t>
-            </w:r>
-            <w:r>
-              <w:rPr>
-                <w:rFonts w:ascii="Times New Roman" w:hAnsi="Times New Roman" w:cs="Times New Roman"/>
-                <w:sz w:val="24"/>
-                <w:szCs w:val="24"/>
-              </w:rPr>
-              <w:t xml:space="preserve"> </w:t>
-            </w:r>
-            <w:r>
-              <w:rPr>
-                <w:rFonts w:ascii="Times New Roman" w:hAnsi="Times New Roman" w:cs="Times New Roman"/>
-                <w:sz w:val="24"/>
-                <w:szCs w:val="24"/>
-              </w:rPr>
-              <w:t>LOCAL_RESAMPLE, and CONTINUE actions</w:t>
+            <w:tcW w:type="dxa" w:w="2088"/>
+          </w:tcPr>
+          <w:p>
+            <w:r/>
+            <w:r>
+              <w:rPr>
+                <w:b w:val="0"/>
+                <w:sz w:val="16"/>
+              </w:rPr>
+              <w:t>Typed-error taxonomy</w:t>
+            </w:r>
+          </w:p>
+        </w:tc>
+        <w:tc>
+          <w:tcPr>
+            <w:tcW w:type="dxa" w:w="7906"/>
+          </w:tcPr>
+          <w:p>
+            <w:r/>
+            <w:r>
+              <w:rPr>
+                <w:b w:val="0"/>
+                <w:sz w:val="16"/>
+              </w:rPr>
+              <w:t>Eight frozen supervision labels with definitions, examples, detection contracts, and allowed repair actions.</w:t>
             </w:r>
           </w:p>
         </w:tc>
@@ -560,49 +529,31 @@
       <w:tr>
         <w:tc>
           <w:tcPr>
-            <w:tcW w:w="2088" w:type="dxa"/>
-            <w:vAlign w:val="center"/>
-          </w:tcPr>
-          <w:p>
-            <w:pPr>
-              <w:spacing w:line="360" w:lineRule="auto"/>
-              <w:rPr>
-                <w:rFonts w:ascii="Times New Roman" w:hAnsi="Times New Roman" w:cs="Times New Roman"/>
-                <w:sz w:val="24"/>
-                <w:szCs w:val="24"/>
-              </w:rPr>
-            </w:pPr>
-            <w:r>
-              <w:rPr>
-                <w:rFonts w:ascii="Times New Roman" w:hAnsi="Times New Roman" w:cs="Times New Roman"/>
-                <w:sz w:val="24"/>
-                <w:szCs w:val="24"/>
-              </w:rPr>
-              <w:t>Local repair</w:t>
-            </w:r>
-          </w:p>
-        </w:tc>
-        <w:tc>
-          <w:tcPr>
-            <w:tcW w:w="7906" w:type="dxa"/>
-            <w:vAlign w:val="center"/>
-          </w:tcPr>
-          <w:p>
-            <w:pPr>
-              <w:spacing w:line="360" w:lineRule="auto"/>
-              <w:rPr>
-                <w:rFonts w:ascii="Times New Roman" w:hAnsi="Times New Roman" w:cs="Times New Roman"/>
-                <w:sz w:val="24"/>
-                <w:szCs w:val="24"/>
-              </w:rPr>
-            </w:pPr>
-            <w:r>
-              <w:rPr>
-                <w:rFonts w:ascii="Times New Roman" w:hAnsi="Times New Roman" w:cs="Times New Roman"/>
-                <w:sz w:val="24"/>
-                <w:szCs w:val="24"/>
-              </w:rPr>
-              <w:t>Preserves the valid prefix and regenerates only the affected suffix</w:t>
+            <w:tcW w:type="dxa" w:w="2088"/>
+          </w:tcPr>
+          <w:p>
+            <w:r/>
+            <w:r>
+              <w:rPr>
+                <w:b w:val="0"/>
+                <w:sz w:val="16"/>
+              </w:rPr>
+              <w:t>Reasoning graph</w:t>
+            </w:r>
+          </w:p>
+        </w:tc>
+        <w:tc>
+          <w:tcPr>
+            <w:tcW w:type="dxa" w:w="7906"/>
+          </w:tcPr>
+          <w:p>
+            <w:r/>
+            <w:r>
+              <w:rPr>
+                <w:b w:val="0"/>
+                <w:sz w:val="16"/>
+              </w:rPr>
+              <w:t>The model pipeline's internal representation, recording node state, parents, model reasoning, verification, affected descendants, repair, repaired state, and final status.</w:t>
             </w:r>
           </w:p>
         </w:tc>
@@ -610,49 +561,31 @@
       <w:tr>
         <w:tc>
           <w:tcPr>
-            <w:tcW w:w="2088" w:type="dxa"/>
-            <w:vAlign w:val="center"/>
-          </w:tcPr>
-          <w:p>
-            <w:pPr>
-              <w:spacing w:line="360" w:lineRule="auto"/>
-              <w:rPr>
-                <w:rFonts w:ascii="Times New Roman" w:hAnsi="Times New Roman" w:cs="Times New Roman"/>
-                <w:sz w:val="24"/>
-                <w:szCs w:val="24"/>
-              </w:rPr>
-            </w:pPr>
-            <w:r>
-              <w:rPr>
-                <w:rFonts w:ascii="Times New Roman" w:hAnsi="Times New Roman" w:cs="Times New Roman"/>
-                <w:sz w:val="24"/>
-                <w:szCs w:val="24"/>
-              </w:rPr>
-              <w:t>Reasoning graph</w:t>
-            </w:r>
-          </w:p>
-        </w:tc>
-        <w:tc>
-          <w:tcPr>
-            <w:tcW w:w="7906" w:type="dxa"/>
-            <w:vAlign w:val="center"/>
-          </w:tcPr>
-          <w:p>
-            <w:pPr>
-              <w:spacing w:line="360" w:lineRule="auto"/>
-              <w:rPr>
-                <w:rFonts w:ascii="Times New Roman" w:hAnsi="Times New Roman" w:cs="Times New Roman"/>
-                <w:sz w:val="24"/>
-                <w:szCs w:val="24"/>
-              </w:rPr>
-            </w:pPr>
-            <w:r>
-              <w:rPr>
-                <w:rFonts w:ascii="Times New Roman" w:hAnsi="Times New Roman" w:cs="Times New Roman"/>
-                <w:sz w:val="24"/>
-                <w:szCs w:val="24"/>
-              </w:rPr>
-              <w:t>Dependency ordering, descendant tracing, and branch-aware status labels</w:t>
+            <w:tcW w:type="dxa" w:w="2088"/>
+          </w:tcPr>
+          <w:p>
+            <w:r/>
+            <w:r>
+              <w:rPr>
+                <w:b w:val="0"/>
+                <w:sz w:val="16"/>
+              </w:rPr>
+              <w:t>Repair policy</w:t>
+            </w:r>
+          </w:p>
+        </w:tc>
+        <w:tc>
+          <w:tcPr>
+            <w:tcW w:type="dxa" w:w="7906"/>
+          </w:tcPr>
+          <w:p>
+            <w:r/>
+            <w:r>
+              <w:rPr>
+                <w:b w:val="0"/>
+                <w:sz w:val="16"/>
+              </w:rPr>
+              <w:t>TOOL_EXECUTE, BACKTRACK, REFORMALIZE, LOCAL_RESAMPLE, REPLAN, and CONTINUE actions.</w:t>
             </w:r>
           </w:p>
         </w:tc>
@@ -660,49 +593,31 @@
       <w:tr>
         <w:tc>
           <w:tcPr>
-            <w:tcW w:w="2088" w:type="dxa"/>
-            <w:vAlign w:val="center"/>
-          </w:tcPr>
-          <w:p>
-            <w:pPr>
-              <w:spacing w:line="360" w:lineRule="auto"/>
-              <w:rPr>
-                <w:rFonts w:ascii="Times New Roman" w:hAnsi="Times New Roman" w:cs="Times New Roman"/>
-                <w:sz w:val="24"/>
-                <w:szCs w:val="24"/>
-              </w:rPr>
-            </w:pPr>
-            <w:r>
-              <w:rPr>
-                <w:rFonts w:ascii="Times New Roman" w:hAnsi="Times New Roman" w:cs="Times New Roman"/>
-                <w:sz w:val="24"/>
-                <w:szCs w:val="24"/>
-              </w:rPr>
-              <w:t>Compute allocator</w:t>
-            </w:r>
-          </w:p>
-        </w:tc>
-        <w:tc>
-          <w:tcPr>
-            <w:tcW w:w="7906" w:type="dxa"/>
-            <w:vAlign w:val="center"/>
-          </w:tcPr>
-          <w:p>
-            <w:pPr>
-              <w:spacing w:line="360" w:lineRule="auto"/>
-              <w:rPr>
-                <w:rFonts w:ascii="Times New Roman" w:hAnsi="Times New Roman" w:cs="Times New Roman"/>
-                <w:sz w:val="24"/>
-                <w:szCs w:val="24"/>
-              </w:rPr>
-            </w:pPr>
-            <w:r>
-              <w:rPr>
-                <w:rFonts w:ascii="Times New Roman" w:hAnsi="Times New Roman" w:cs="Times New Roman"/>
-                <w:sz w:val="24"/>
-                <w:szCs w:val="24"/>
-              </w:rPr>
-              <w:t>Heuristic based on uncertainty, structural importance, and propagation risk</w:t>
+            <w:tcW w:type="dxa" w:w="2088"/>
+          </w:tcPr>
+          <w:p>
+            <w:r/>
+            <w:r>
+              <w:rPr>
+                <w:b w:val="0"/>
+                <w:sz w:val="16"/>
+              </w:rPr>
+              <w:t>Local repair</w:t>
+            </w:r>
+          </w:p>
+        </w:tc>
+        <w:tc>
+          <w:tcPr>
+            <w:tcW w:type="dxa" w:w="7906"/>
+          </w:tcPr>
+          <w:p>
+            <w:r/>
+            <w:r>
+              <w:rPr>
+                <w:b w:val="0"/>
+                <w:sz w:val="16"/>
+              </w:rPr>
+              <w:t>Preserves the verified prefix, regenerates the affected suffix, and writes accepted repairs back to graph nodes.</w:t>
             </w:r>
           </w:p>
         </w:tc>
@@ -710,23 +625,110 @@
       <w:tr>
         <w:tc>
           <w:tcPr>
-            <w:tcW w:w="2088" w:type="dxa"/>
-            <w:vAlign w:val="center"/>
-          </w:tcPr>
-          <w:p>
-            <w:pPr>
-              <w:spacing w:line="360" w:lineRule="auto"/>
-              <w:rPr>
-                <w:rFonts w:ascii="Times New Roman" w:hAnsi="Times New Roman" w:cs="Times New Roman"/>
-                <w:sz w:val="24"/>
-                <w:szCs w:val="24"/>
-              </w:rPr>
-            </w:pPr>
-            <w:r>
-              <w:rPr>
-                <w:rFonts w:ascii="Times New Roman" w:hAnsi="Times New Roman" w:cs="Times New Roman"/>
-                <w:sz w:val="24"/>
-                <w:szCs w:val="24"/>
+            <w:tcW w:type="dxa" w:w="2088"/>
+          </w:tcPr>
+          <w:p>
+            <w:r/>
+            <w:r>
+              <w:rPr>
+                <w:b w:val="0"/>
+                <w:sz w:val="16"/>
+              </w:rPr>
+              <w:t>Adaptive compute</w:t>
+            </w:r>
+          </w:p>
+        </w:tc>
+        <w:tc>
+          <w:tcPr>
+            <w:tcW w:type="dxa" w:w="7906"/>
+          </w:tcPr>
+          <w:p>
+            <w:r/>
+            <w:r>
+              <w:rPr>
+                <w:b w:val="0"/>
+                <w:sz w:val="16"/>
+              </w:rPr>
+              <w:t>Heuristic risk allocation plus measured uniform-local and adaptive-local arms under a shared token ceiling.</w:t>
+            </w:r>
+          </w:p>
+        </w:tc>
+      </w:tr>
+      <w:tr>
+        <w:tc>
+          <w:tcPr>
+            <w:tcW w:type="dxa" w:w="2088"/>
+          </w:tcPr>
+          <w:p>
+            <w:r/>
+            <w:r>
+              <w:rPr>
+                <w:b w:val="0"/>
+                <w:sz w:val="16"/>
+              </w:rPr>
+              <w:t>Benchmark and supervision data</w:t>
+            </w:r>
+          </w:p>
+        </w:tc>
+        <w:tc>
+          <w:tcPr>
+            <w:tcW w:type="dxa" w:w="7906"/>
+          </w:tcPr>
+          <w:p>
+            <w:r/>
+            <w:r>
+              <w:rPr>
+                <w:b w:val="0"/>
+                <w:sz w:val="16"/>
+              </w:rPr>
+              <w:t>A 40-problem MATH-500 hard pilot and 48 controlled typed-verifier training examples.</w:t>
+            </w:r>
+          </w:p>
+        </w:tc>
+      </w:tr>
+      <w:tr>
+        <w:tc>
+          <w:tcPr>
+            <w:tcW w:type="dxa" w:w="2088"/>
+          </w:tcPr>
+          <w:p>
+            <w:r/>
+            <w:r>
+              <w:rPr>
+                <w:b w:val="0"/>
+                <w:sz w:val="16"/>
+              </w:rPr>
+              <w:t>Experiment evidence</w:t>
+            </w:r>
+          </w:p>
+        </w:tc>
+        <w:tc>
+          <w:tcPr>
+            <w:tcW w:type="dxa" w:w="7906"/>
+          </w:tcPr>
+          <w:p>
+            <w:r/>
+            <w:r>
+              <w:rPr>
+                <w:b w:val="0"/>
+                <w:sz w:val="16"/>
+              </w:rPr>
+              <w:t>Matched-budget reports, a six-row ablation matrix, versioned output contracts, raw outputs, and artifact hashes.</w:t>
+            </w:r>
+          </w:p>
+        </w:tc>
+      </w:tr>
+      <w:tr>
+        <w:tc>
+          <w:tcPr>
+            <w:tcW w:type="dxa" w:w="2088"/>
+          </w:tcPr>
+          <w:p>
+            <w:r/>
+            <w:r>
+              <w:rPr>
+                <w:b w:val="0"/>
+                <w:sz w:val="16"/>
               </w:rPr>
               <w:t>Web demo</w:t>
             </w:r>
@@ -734,25 +736,16 @@
         </w:tc>
         <w:tc>
           <w:tcPr>
-            <w:tcW w:w="7906" w:type="dxa"/>
-            <w:vAlign w:val="center"/>
-          </w:tcPr>
-          <w:p>
-            <w:pPr>
-              <w:spacing w:line="360" w:lineRule="auto"/>
-              <w:rPr>
-                <w:rFonts w:ascii="Times New Roman" w:hAnsi="Times New Roman" w:cs="Times New Roman"/>
-                <w:sz w:val="24"/>
-                <w:szCs w:val="24"/>
-              </w:rPr>
-            </w:pPr>
-            <w:r>
-              <w:rPr>
-                <w:rFonts w:ascii="Times New Roman" w:hAnsi="Times New Roman" w:cs="Times New Roman"/>
-                <w:sz w:val="24"/>
-                <w:szCs w:val="24"/>
-              </w:rPr>
-              <w:t>Interactive equation input, live graph rendering, diagnosis, and allocation display</w:t>
+            <w:tcW w:type="dxa" w:w="7906"/>
+          </w:tcPr>
+          <w:p>
+            <w:r/>
+            <w:r>
+              <w:rPr>
+                <w:b w:val="0"/>
+                <w:sz w:val="16"/>
+              </w:rPr>
+              <w:t>Retained as a secondary interactive graph view; methodology and experiments are the current priority.</w:t>
             </w:r>
           </w:p>
         </w:tc>
@@ -784,226 +777,7 @@
         </w:rPr>
       </w:pPr>
       <w:r>
-        <w:rPr>
-          <w:rFonts w:ascii="Times New Roman" w:hAnsi="Times New Roman" w:cs="Times New Roman"/>
-          <w:noProof/>
-          <w:sz w:val="24"/>
-          <w:szCs w:val="24"/>
-        </w:rPr>
-        <mc:AlternateContent>
-          <mc:Choice Requires="wps">
-            <w:drawing>
-              <wp:anchor distT="0" distB="0" distL="114300" distR="114300" simplePos="0" relativeHeight="251662336" behindDoc="0" locked="0" layoutInCell="1" allowOverlap="1" wp14:anchorId="4BC93CC6" wp14:editId="53CFBD49">
-                <wp:simplePos x="0" y="0"/>
-                <wp:positionH relativeFrom="column">
-                  <wp:posOffset>1104900</wp:posOffset>
-                </wp:positionH>
-                <wp:positionV relativeFrom="paragraph">
-                  <wp:posOffset>364490</wp:posOffset>
-                </wp:positionV>
-                <wp:extent cx="209550" cy="0"/>
-                <wp:effectExtent l="38100" t="76200" r="38100" b="133350"/>
-                <wp:wrapNone/>
-                <wp:docPr id="429290958" name="Straight Arrow Connector 1"/>
-                <wp:cNvGraphicFramePr/>
-                <a:graphic xmlns:a="http://schemas.openxmlformats.org/drawingml/2006/main">
-                  <a:graphicData uri="http://schemas.microsoft.com/office/word/2010/wordprocessingShape">
-                    <wps:wsp>
-                      <wps:cNvCnPr/>
-                      <wps:spPr>
-                        <a:xfrm>
-                          <a:off x="0" y="0"/>
-                          <a:ext cx="209550" cy="0"/>
-                        </a:xfrm>
-                        <a:prstGeom prst="straightConnector1">
-                          <a:avLst/>
-                        </a:prstGeom>
-                        <a:ln>
-                          <a:tailEnd type="triangle"/>
-                        </a:ln>
-                      </wps:spPr>
-                      <wps:style>
-                        <a:lnRef idx="2">
-                          <a:schemeClr val="accent1"/>
-                        </a:lnRef>
-                        <a:fillRef idx="0">
-                          <a:schemeClr val="accent1"/>
-                        </a:fillRef>
-                        <a:effectRef idx="1">
-                          <a:schemeClr val="accent1"/>
-                        </a:effectRef>
-                        <a:fontRef idx="minor">
-                          <a:schemeClr val="tx1"/>
-                        </a:fontRef>
-                      </wps:style>
-                      <wps:bodyPr/>
-                    </wps:wsp>
-                  </a:graphicData>
-                </a:graphic>
-              </wp:anchor>
-            </w:drawing>
-          </mc:Choice>
-          <mc:Fallback>
-            <w:pict>
-              <v:shapetype w14:anchorId="219B5A62" id="_x0000_t32" coordsize="21600,21600" o:spt="32" o:oned="t" path="m,l21600,21600e" filled="f">
-                <v:path arrowok="t" fillok="f" o:connecttype="none"/>
-                <o:lock v:ext="edit" shapetype="t"/>
-              </v:shapetype>
-              <v:shape id="Straight Arrow Connector 1" o:spid="_x0000_s1026" type="#_x0000_t32" style="position:absolute;margin-left:87pt;margin-top:28.7pt;width:16.5pt;height:0;z-index:251662336;visibility:visible;mso-wrap-style:square;mso-wrap-distance-left:9pt;mso-wrap-distance-top:0;mso-wrap-distance-right:9pt;mso-wrap-distance-bottom:0;mso-position-horizontal:absolute;mso-position-horizontal-relative:text;mso-position-vertical:absolute;mso-position-vertical-relative:text" o:gfxdata="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" strokecolor="#4f81bd [3204]" strokeweight="2pt">
-                <v:stroke endarrow="block"/>
-                <v:shadow on="t" color="black" opacity="24903f" origin=",.5" offset="0,.55556mm"/>
-              </v:shape>
-            </w:pict>
-          </mc:Fallback>
-        </mc:AlternateContent>
-      </w:r>
-      <w:r>
-        <w:rPr>
-          <w:rFonts w:ascii="Times New Roman" w:hAnsi="Times New Roman" w:cs="Times New Roman"/>
-          <w:noProof/>
-          <w:sz w:val="24"/>
-          <w:szCs w:val="24"/>
-        </w:rPr>
-        <mc:AlternateContent>
-          <mc:Choice Requires="wps">
-            <w:drawing>
-              <wp:anchor distT="0" distB="0" distL="114300" distR="114300" simplePos="0" relativeHeight="251654144" behindDoc="0" locked="0" layoutInCell="1" allowOverlap="1" wp14:anchorId="6A5A3611" wp14:editId="5C72834A">
-                <wp:simplePos x="0" y="0"/>
-                <wp:positionH relativeFrom="column">
-                  <wp:posOffset>4938395</wp:posOffset>
-                </wp:positionH>
-                <wp:positionV relativeFrom="paragraph">
-                  <wp:posOffset>100965</wp:posOffset>
-                </wp:positionV>
-                <wp:extent cx="209550" cy="0"/>
-                <wp:effectExtent l="38100" t="76200" r="38100" b="133350"/>
-                <wp:wrapNone/>
-                <wp:docPr id="266054119" name="Straight Arrow Connector 1"/>
-                <wp:cNvGraphicFramePr/>
-                <a:graphic xmlns:a="http://schemas.openxmlformats.org/drawingml/2006/main">
-                  <a:graphicData uri="http://schemas.microsoft.com/office/word/2010/wordprocessingShape">
-                    <wps:wsp>
-                      <wps:cNvCnPr/>
-                      <wps:spPr>
-                        <a:xfrm>
-                          <a:off x="0" y="0"/>
-                          <a:ext cx="209550" cy="0"/>
-                        </a:xfrm>
-                        <a:prstGeom prst="straightConnector1">
-                          <a:avLst/>
-                        </a:prstGeom>
-                        <a:ln>
-                          <a:tailEnd type="triangle"/>
-                        </a:ln>
-                      </wps:spPr>
-                      <wps:style>
-                        <a:lnRef idx="2">
-                          <a:schemeClr val="accent1"/>
-                        </a:lnRef>
-                        <a:fillRef idx="0">
-                          <a:schemeClr val="accent1"/>
-                        </a:fillRef>
-                        <a:effectRef idx="1">
-                          <a:schemeClr val="accent1"/>
-                        </a:effectRef>
-                        <a:fontRef idx="minor">
-                          <a:schemeClr val="tx1"/>
-                        </a:fontRef>
-                      </wps:style>
-                      <wps:bodyPr/>
-                    </wps:wsp>
-                  </a:graphicData>
-                </a:graphic>
-              </wp:anchor>
-            </w:drawing>
-          </mc:Choice>
-          <mc:Fallback>
-            <w:pict>
-              <v:shape w14:anchorId="7C4A771B" id="Straight Arrow Connector 1" o:spid="_x0000_s1026" type="#_x0000_t32" style="position:absolute;margin-left:388.85pt;margin-top:7.95pt;width:16.5pt;height:0;z-index:251654144;visibility:visible;mso-wrap-style:square;mso-wrap-distance-left:9pt;mso-wrap-distance-top:0;mso-wrap-distance-right:9pt;mso-wrap-distance-bottom:0;mso-position-horizontal:absolute;mso-position-horizontal-relative:text;mso-position-vertical:absolute;mso-position-vertical-relative:text" o:gfxdata="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" strokecolor="#4f81bd [3204]" strokeweight="2pt">
-                <v:stroke endarrow="block"/>
-                <v:shadow on="t" color="black" opacity="24903f" origin=",.5" offset="0,.55556mm"/>
-              </v:shape>
-            </w:pict>
-          </mc:Fallback>
-        </mc:AlternateContent>
-      </w:r>
-      <w:r>
-        <w:rPr>
-          <w:rFonts w:ascii="Times New Roman" w:hAnsi="Times New Roman" w:cs="Times New Roman"/>
-          <w:noProof/>
-          <w:sz w:val="24"/>
-          <w:szCs w:val="24"/>
-        </w:rPr>
-        <mc:AlternateContent>
-          <mc:Choice Requires="wps">
-            <w:drawing>
-              <wp:anchor distT="0" distB="0" distL="114300" distR="114300" simplePos="0" relativeHeight="251658240" behindDoc="0" locked="0" layoutInCell="1" allowOverlap="1" wp14:anchorId="400C9F97" wp14:editId="28DE6EBC">
-                <wp:simplePos x="0" y="0"/>
-                <wp:positionH relativeFrom="column">
-                  <wp:posOffset>4443095</wp:posOffset>
-                </wp:positionH>
-                <wp:positionV relativeFrom="paragraph">
-                  <wp:posOffset>94615</wp:posOffset>
-                </wp:positionV>
-                <wp:extent cx="209550" cy="0"/>
-                <wp:effectExtent l="38100" t="76200" r="38100" b="133350"/>
-                <wp:wrapNone/>
-                <wp:docPr id="494089370" name="Straight Arrow Connector 1"/>
-                <wp:cNvGraphicFramePr/>
-                <a:graphic xmlns:a="http://schemas.openxmlformats.org/drawingml/2006/main">
-                  <a:graphicData uri="http://schemas.microsoft.com/office/word/2010/wordprocessingShape">
-                    <wps:wsp>
-                      <wps:cNvCnPr/>
-                      <wps:spPr>
-                        <a:xfrm>
-                          <a:off x="0" y="0"/>
-                          <a:ext cx="209550" cy="0"/>
-                        </a:xfrm>
-                        <a:prstGeom prst="straightConnector1">
-                          <a:avLst/>
-                        </a:prstGeom>
-                        <a:ln>
-                          <a:tailEnd type="triangle"/>
-                        </a:ln>
-                      </wps:spPr>
-                      <wps:style>
-                        <a:lnRef idx="2">
-                          <a:schemeClr val="accent1"/>
-                        </a:lnRef>
-                        <a:fillRef idx="0">
-                          <a:schemeClr val="accent1"/>
-                        </a:fillRef>
-                        <a:effectRef idx="1">
-                          <a:schemeClr val="accent1"/>
-                        </a:effectRef>
-                        <a:fontRef idx="minor">
-                          <a:schemeClr val="tx1"/>
-                        </a:fontRef>
-                      </wps:style>
-                      <wps:bodyPr/>
-                    </wps:wsp>
-                  </a:graphicData>
-                </a:graphic>
-              </wp:anchor>
-            </w:drawing>
-          </mc:Choice>
-          <mc:Fallback>
-            <w:pict>
-              <v:shape w14:anchorId="22E6E9AA" id="Straight Arrow Connector 1" o:spid="_x0000_s1026" type="#_x0000_t32" style="position:absolute;margin-left:349.85pt;margin-top:7.45pt;width:16.5pt;height:0;z-index:251658240;visibility:visible;mso-wrap-style:square;mso-wrap-distance-left:9pt;mso-wrap-distance-top:0;mso-wrap-distance-right:9pt;mso-wrap-distance-bottom:0;mso-position-horizontal:absolute;mso-position-horizontal-relative:text;mso-position-vertical:absolute;mso-position-vertical-relative:text" o:gfxdata="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" strokecolor="#4f81bd [3204]" strokeweight="2pt">
-                <v:stroke endarrow="block"/>
-                <v:shadow on="t" color="black" opacity="24903f" origin=",.5" offset="0,.55556mm"/>
-              </v:shape>
-            </w:pict>
-          </mc:Fallback>
-        </mc:AlternateContent>
-      </w:r>
-      <w:r>
-        <w:rPr>
-          <w:rFonts w:ascii="Times New Roman" w:hAnsi="Times New Roman" w:cs="Times New Roman"/>
-          <w:sz w:val="24"/>
-          <w:szCs w:val="24"/>
-        </w:rPr>
-        <w:t>For the problem 2(x + 3) = 14, the graph contains an invalid branch n1       n2       n3 and an independent valid branch n4        n5. The verifier marks n1 as the first algebraic-transformation error, n2 and n3 as affected, and n4 and n5 as unaffected. The suggested repair is 2x + 6 = 14, and the adaptive budget assigns 7 calls to n1, 2 to n2, 1 to n3, and 0 to the unaffected branch.</w:t>
+        <w:t>For the pipeline demonstration 2(x + 3) = 14, n1 stores the problem state, n2 stores the model's invalid 2x + 3 = 14 transformation, and n3-n4 are affected descendants. The graph records REFORMALIZE, the repaired state 2x + 6 = 14, recomputed x = 4, and final node statuses. A separate branching fixture retains an independent valid branch to test selective descendant propagation and zero allocation to unaffected nodes.</w:t>
       </w:r>
     </w:p>
     <w:p>
@@ -2050,132 +1824,8 @@
         </w:rPr>
       </w:pPr>
       <w:r>
-        <w:rPr>
-          <w:rFonts w:ascii="Times New Roman" w:hAnsi="Times New Roman" w:cs="Times New Roman"/>
-          <w:sz w:val="24"/>
-          <w:szCs w:val="24"/>
-        </w:rPr>
-        <w:t>The paired local-minus-global answer difference was</w:t>
+        <w:t>The paired local-minus-global answer difference was +7.4 percentage points (100% - 92.6%), with a 95% confidence interval of [+3.4, +11.4]. Across the expanded trials, 13 invalid traces were detected: 12 algebraic-transformation errors and 1 arithmetic error. All 13 repairs were accepted, 10 wrong answers were corrected, and no answer regressions occurred.</w:t>
       </w:r>
-      <w:r>
-        <w:rPr>
-          <w:rFonts w:ascii="Times New Roman" w:hAnsi="Times New Roman" w:cs="Times New Roman"/>
-          <w:sz w:val="24"/>
-          <w:szCs w:val="24"/>
-        </w:rPr>
-        <w:t xml:space="preserve"> </w:t>
-      </w:r>
-      <w:r>
-        <w:rPr>
-          <w:rFonts w:ascii="Times New Roman" w:hAnsi="Times New Roman" w:cs="Times New Roman"/>
-          <w:sz w:val="24"/>
-          <w:szCs w:val="24"/>
-        </w:rPr>
-        <w:t>+7.4 percentage points</w:t>
-      </w:r>
-      <w:r>
-        <w:rPr>
-          <w:rFonts w:ascii="Times New Roman" w:hAnsi="Times New Roman" w:cs="Times New Roman"/>
-          <w:sz w:val="24"/>
-          <w:szCs w:val="24"/>
-        </w:rPr>
-        <w:t xml:space="preserve"> (100% - 92.6%)</w:t>
-      </w:r>
-      <w:r>
-        <w:rPr>
-          <w:rFonts w:ascii="Times New Roman" w:hAnsi="Times New Roman" w:cs="Times New Roman"/>
-          <w:sz w:val="24"/>
-          <w:szCs w:val="24"/>
-        </w:rPr>
-        <w:t>, with a 95% C</w:t>
-      </w:r>
-      <w:r>
-        <w:rPr>
-          <w:rFonts w:ascii="Times New Roman" w:hAnsi="Times New Roman" w:cs="Times New Roman"/>
-          <w:sz w:val="24"/>
-          <w:szCs w:val="24"/>
-        </w:rPr>
-        <w:t xml:space="preserve">andidate </w:t>
-      </w:r>
-      <w:r>
-        <w:rPr>
-          <w:rFonts w:ascii="Times New Roman" w:hAnsi="Times New Roman" w:cs="Times New Roman"/>
-          <w:sz w:val="24"/>
-          <w:szCs w:val="24"/>
-        </w:rPr>
-        <w:t>I</w:t>
-      </w:r>
-      <w:r>
-        <w:rPr>
-          <w:rFonts w:ascii="Times New Roman" w:hAnsi="Times New Roman" w:cs="Times New Roman"/>
-          <w:sz w:val="24"/>
-          <w:szCs w:val="24"/>
-        </w:rPr>
-        <w:t>nterval</w:t>
-      </w:r>
-      <w:r>
-        <w:rPr>
-          <w:rFonts w:ascii="Times New Roman" w:hAnsi="Times New Roman" w:cs="Times New Roman"/>
-          <w:sz w:val="24"/>
-          <w:szCs w:val="24"/>
-        </w:rPr>
-        <w:t xml:space="preserve"> of [+3.4, +11.4]. Across the expanded trials, 13 invalid traces were detected: 12 algebraic-transformation errors and 1 arithmetic error. All 13 repairs were accepted, 10 wrong answers were corrected, and no answer regressions occurred.</w:t>
-      </w:r>
-    </w:p>
-    <w:p>
-      <w:pPr>
-        <w:spacing w:line="360" w:lineRule="auto"/>
-        <w:ind w:left="-90"/>
-        <w:rPr>
-          <w:rFonts w:ascii="Times New Roman" w:hAnsi="Times New Roman" w:cs="Times New Roman"/>
-          <w:sz w:val="24"/>
-          <w:szCs w:val="24"/>
-        </w:rPr>
-      </w:pPr>
-    </w:p>
-    <w:p>
-      <w:pPr>
-        <w:spacing w:line="360" w:lineRule="auto"/>
-        <w:ind w:left="-90"/>
-        <w:rPr>
-          <w:rFonts w:ascii="Times New Roman" w:hAnsi="Times New Roman" w:cs="Times New Roman"/>
-          <w:sz w:val="24"/>
-          <w:szCs w:val="24"/>
-        </w:rPr>
-      </w:pPr>
-    </w:p>
-    <w:p>
-      <w:pPr>
-        <w:spacing w:line="360" w:lineRule="auto"/>
-        <w:ind w:left="-90"/>
-        <w:rPr>
-          <w:rFonts w:ascii="Times New Roman" w:hAnsi="Times New Roman" w:cs="Times New Roman"/>
-          <w:sz w:val="24"/>
-          <w:szCs w:val="24"/>
-        </w:rPr>
-      </w:pPr>
-    </w:p>
-    <w:p>
-      <w:pPr>
-        <w:spacing w:line="360" w:lineRule="auto"/>
-        <w:ind w:left="-90"/>
-        <w:rPr>
-          <w:rFonts w:ascii="Times New Roman" w:hAnsi="Times New Roman" w:cs="Times New Roman"/>
-          <w:sz w:val="24"/>
-          <w:szCs w:val="24"/>
-        </w:rPr>
-      </w:pPr>
-    </w:p>
-    <w:p>
-      <w:pPr>
-        <w:spacing w:line="360" w:lineRule="auto"/>
-        <w:ind w:left="-90"/>
-        <w:rPr>
-          <w:rFonts w:ascii="Times New Roman" w:hAnsi="Times New Roman" w:cs="Times New Roman"/>
-          <w:sz w:val="24"/>
-          <w:szCs w:val="24"/>
-        </w:rPr>
-      </w:pPr>
     </w:p>
     <w:p>
       <w:pPr>
@@ -2189,47 +1839,41 @@
         <w:rPr>
           <w:rFonts w:ascii="Times New Roman" w:hAnsi="Times New Roman" w:cs="Times New Roman"/>
         </w:rPr>
-        <w:lastRenderedPageBreak/>
         <w:t>7. Model and Output-Contract Findings</w:t>
+      </w:r>
+    </w:p>
+    <w:p>
+      <w:pPr>
+        <w:pStyle w:val="Heading2"/>
+      </w:pPr>
+      <w:r>
+        <w:t>7.1 Strict End-to-End Model Comparison</w:t>
       </w:r>
     </w:p>
     <w:tbl>
       <w:tblPr>
         <w:tblStyle w:val="TableGrid"/>
-        <w:tblW w:w="0" w:type="auto"/>
-        <w:tblLook w:val="04A0" w:firstRow="1" w:lastRow="0" w:firstColumn="1" w:lastColumn="0" w:noHBand="0" w:noVBand="1"/>
+        <w:tblW w:type="auto" w:w="0"/>
+        <w:tblLook w:firstColumn="1" w:firstRow="1" w:lastColumn="0" w:lastRow="0" w:noHBand="0" w:noVBand="1" w:val="04A0"/>
       </w:tblPr>
       <w:tblGrid>
-        <w:gridCol w:w="1999"/>
-        <w:gridCol w:w="1999"/>
-        <w:gridCol w:w="1999"/>
-        <w:gridCol w:w="1999"/>
-        <w:gridCol w:w="1999"/>
+        <w:gridCol w:w="2074"/>
+        <w:gridCol w:w="2074"/>
+        <w:gridCol w:w="2074"/>
+        <w:gridCol w:w="2074"/>
+        <w:gridCol w:w="2074"/>
       </w:tblGrid>
       <w:tr>
         <w:tc>
           <w:tcPr>
-            <w:tcW w:w="1999" w:type="dxa"/>
-            <w:shd w:val="clear" w:color="auto" w:fill="173248"/>
-            <w:vAlign w:val="center"/>
-          </w:tcPr>
-          <w:p>
-            <w:pPr>
-              <w:spacing w:line="360" w:lineRule="auto"/>
-              <w:jc w:val="center"/>
-              <w:rPr>
-                <w:rFonts w:ascii="Times New Roman" w:hAnsi="Times New Roman" w:cs="Times New Roman"/>
-                <w:sz w:val="24"/>
-                <w:szCs w:val="24"/>
-              </w:rPr>
-            </w:pPr>
-            <w:r>
-              <w:rPr>
-                <w:rFonts w:ascii="Times New Roman" w:hAnsi="Times New Roman" w:cs="Times New Roman"/>
+            <w:tcW w:type="dxa" w:w="2074"/>
+          </w:tcPr>
+          <w:p>
+            <w:r/>
+            <w:r>
+              <w:rPr>
                 <w:b/>
-                <w:color w:val="FFFFFF"/>
-                <w:sz w:val="24"/>
-                <w:szCs w:val="24"/>
+                <w:sz w:val="16"/>
               </w:rPr>
               <w:t>Configuration</w:t>
             </w:r>
@@ -2237,27 +1881,14 @@
         </w:tc>
         <w:tc>
           <w:tcPr>
-            <w:tcW w:w="1999" w:type="dxa"/>
-            <w:shd w:val="clear" w:color="auto" w:fill="173248"/>
-            <w:vAlign w:val="center"/>
-          </w:tcPr>
-          <w:p>
-            <w:pPr>
-              <w:spacing w:line="360" w:lineRule="auto"/>
-              <w:jc w:val="center"/>
-              <w:rPr>
-                <w:rFonts w:ascii="Times New Roman" w:hAnsi="Times New Roman" w:cs="Times New Roman"/>
-                <w:sz w:val="24"/>
-                <w:szCs w:val="24"/>
-              </w:rPr>
-            </w:pPr>
-            <w:r>
-              <w:rPr>
-                <w:rFonts w:ascii="Times New Roman" w:hAnsi="Times New Roman" w:cs="Times New Roman"/>
+            <w:tcW w:type="dxa" w:w="2074"/>
+          </w:tcPr>
+          <w:p>
+            <w:r/>
+            <w:r>
+              <w:rPr>
                 <w:b/>
-                <w:color w:val="FFFFFF"/>
-                <w:sz w:val="24"/>
-                <w:szCs w:val="24"/>
+                <w:sz w:val="16"/>
               </w:rPr>
               <w:t>No repair</w:t>
             </w:r>
@@ -2265,27 +1896,14 @@
         </w:tc>
         <w:tc>
           <w:tcPr>
-            <w:tcW w:w="1999" w:type="dxa"/>
-            <w:shd w:val="clear" w:color="auto" w:fill="173248"/>
-            <w:vAlign w:val="center"/>
-          </w:tcPr>
-          <w:p>
-            <w:pPr>
-              <w:spacing w:line="360" w:lineRule="auto"/>
-              <w:jc w:val="center"/>
-              <w:rPr>
-                <w:rFonts w:ascii="Times New Roman" w:hAnsi="Times New Roman" w:cs="Times New Roman"/>
-                <w:sz w:val="24"/>
-                <w:szCs w:val="24"/>
-              </w:rPr>
-            </w:pPr>
-            <w:r>
-              <w:rPr>
-                <w:rFonts w:ascii="Times New Roman" w:hAnsi="Times New Roman" w:cs="Times New Roman"/>
+            <w:tcW w:type="dxa" w:w="2074"/>
+          </w:tcPr>
+          <w:p>
+            <w:r/>
+            <w:r>
+              <w:rPr>
                 <w:b/>
-                <w:color w:val="FFFFFF"/>
-                <w:sz w:val="24"/>
-                <w:szCs w:val="24"/>
+                <w:sz w:val="16"/>
               </w:rPr>
               <w:t>Global</w:t>
             </w:r>
@@ -2293,27 +1911,14 @@
         </w:tc>
         <w:tc>
           <w:tcPr>
-            <w:tcW w:w="1999" w:type="dxa"/>
-            <w:shd w:val="clear" w:color="auto" w:fill="173248"/>
-            <w:vAlign w:val="center"/>
-          </w:tcPr>
-          <w:p>
-            <w:pPr>
-              <w:spacing w:line="360" w:lineRule="auto"/>
-              <w:jc w:val="center"/>
-              <w:rPr>
-                <w:rFonts w:ascii="Times New Roman" w:hAnsi="Times New Roman" w:cs="Times New Roman"/>
-                <w:sz w:val="24"/>
-                <w:szCs w:val="24"/>
-              </w:rPr>
-            </w:pPr>
-            <w:r>
-              <w:rPr>
-                <w:rFonts w:ascii="Times New Roman" w:hAnsi="Times New Roman" w:cs="Times New Roman"/>
+            <w:tcW w:type="dxa" w:w="2074"/>
+          </w:tcPr>
+          <w:p>
+            <w:r/>
+            <w:r>
+              <w:rPr>
                 <w:b/>
-                <w:color w:val="FFFFFF"/>
-                <w:sz w:val="24"/>
-                <w:szCs w:val="24"/>
+                <w:sz w:val="16"/>
               </w:rPr>
               <w:t>Local</w:t>
             </w:r>
@@ -2321,29 +1926,16 @@
         </w:tc>
         <w:tc>
           <w:tcPr>
-            <w:tcW w:w="1999" w:type="dxa"/>
-            <w:shd w:val="clear" w:color="auto" w:fill="173248"/>
-            <w:vAlign w:val="center"/>
-          </w:tcPr>
-          <w:p>
-            <w:pPr>
-              <w:spacing w:line="360" w:lineRule="auto"/>
-              <w:jc w:val="center"/>
-              <w:rPr>
-                <w:rFonts w:ascii="Times New Roman" w:hAnsi="Times New Roman" w:cs="Times New Roman"/>
-                <w:sz w:val="24"/>
-                <w:szCs w:val="24"/>
-              </w:rPr>
-            </w:pPr>
-            <w:r>
-              <w:rPr>
-                <w:rFonts w:ascii="Times New Roman" w:hAnsi="Times New Roman" w:cs="Times New Roman"/>
+            <w:tcW w:type="dxa" w:w="2074"/>
+          </w:tcPr>
+          <w:p>
+            <w:r/>
+            <w:r>
+              <w:rPr>
                 <w:b/>
-                <w:color w:val="FFFFFF"/>
-                <w:sz w:val="24"/>
-                <w:szCs w:val="24"/>
-              </w:rPr>
-              <w:t>Generation failures</w:t>
+                <w:sz w:val="16"/>
+              </w:rPr>
+              <w:t>Failures</w:t>
             </w:r>
           </w:p>
         </w:tc>
@@ -2351,49 +1943,29 @@
       <w:tr>
         <w:tc>
           <w:tcPr>
-            <w:tcW w:w="1999" w:type="dxa"/>
-            <w:vAlign w:val="center"/>
-          </w:tcPr>
-          <w:p>
-            <w:pPr>
-              <w:spacing w:line="360" w:lineRule="auto"/>
-              <w:jc w:val="center"/>
-              <w:rPr>
-                <w:rFonts w:ascii="Times New Roman" w:hAnsi="Times New Roman" w:cs="Times New Roman"/>
-                <w:sz w:val="24"/>
-                <w:szCs w:val="24"/>
-              </w:rPr>
-            </w:pPr>
-            <w:r>
-              <w:rPr>
-                <w:rFonts w:ascii="Times New Roman" w:hAnsi="Times New Roman" w:cs="Times New Roman"/>
-                <w:sz w:val="24"/>
-                <w:szCs w:val="24"/>
-              </w:rPr>
-              <w:t>1.5B baseline</w:t>
-            </w:r>
-          </w:p>
-        </w:tc>
-        <w:tc>
-          <w:tcPr>
-            <w:tcW w:w="1999" w:type="dxa"/>
-            <w:vAlign w:val="center"/>
-          </w:tcPr>
-          <w:p>
-            <w:pPr>
-              <w:spacing w:line="360" w:lineRule="auto"/>
-              <w:jc w:val="center"/>
-              <w:rPr>
-                <w:rFonts w:ascii="Times New Roman" w:hAnsi="Times New Roman" w:cs="Times New Roman"/>
-                <w:sz w:val="24"/>
-                <w:szCs w:val="24"/>
-              </w:rPr>
-            </w:pPr>
-            <w:r>
-              <w:rPr>
-                <w:rFonts w:ascii="Times New Roman" w:hAnsi="Times New Roman" w:cs="Times New Roman"/>
-                <w:sz w:val="24"/>
-                <w:szCs w:val="24"/>
+            <w:tcW w:type="dxa" w:w="2074"/>
+          </w:tcPr>
+          <w:p>
+            <w:r/>
+            <w:r>
+              <w:rPr>
+                <w:b w:val="0"/>
+                <w:sz w:val="16"/>
+              </w:rPr>
+              <w:t>1.5B / default</w:t>
+            </w:r>
+          </w:p>
+        </w:tc>
+        <w:tc>
+          <w:tcPr>
+            <w:tcW w:type="dxa" w:w="2074"/>
+          </w:tcPr>
+          <w:p>
+            <w:r/>
+            <w:r>
+              <w:rPr>
+                <w:b w:val="0"/>
+                <w:sz w:val="16"/>
               </w:rPr>
               <w:t>90.7%</w:t>
             </w:r>
@@ -2401,24 +1973,14 @@
         </w:tc>
         <w:tc>
           <w:tcPr>
-            <w:tcW w:w="1999" w:type="dxa"/>
-            <w:vAlign w:val="center"/>
-          </w:tcPr>
-          <w:p>
-            <w:pPr>
-              <w:spacing w:line="360" w:lineRule="auto"/>
-              <w:jc w:val="center"/>
-              <w:rPr>
-                <w:rFonts w:ascii="Times New Roman" w:hAnsi="Times New Roman" w:cs="Times New Roman"/>
-                <w:sz w:val="24"/>
-                <w:szCs w:val="24"/>
-              </w:rPr>
-            </w:pPr>
-            <w:r>
-              <w:rPr>
-                <w:rFonts w:ascii="Times New Roman" w:hAnsi="Times New Roman" w:cs="Times New Roman"/>
-                <w:sz w:val="24"/>
-                <w:szCs w:val="24"/>
+            <w:tcW w:type="dxa" w:w="2074"/>
+          </w:tcPr>
+          <w:p>
+            <w:r/>
+            <w:r>
+              <w:rPr>
+                <w:b w:val="0"/>
+                <w:sz w:val="16"/>
               </w:rPr>
               <w:t>92.6%</w:t>
             </w:r>
@@ -2426,24 +1988,14 @@
         </w:tc>
         <w:tc>
           <w:tcPr>
-            <w:tcW w:w="1999" w:type="dxa"/>
-            <w:vAlign w:val="center"/>
-          </w:tcPr>
-          <w:p>
-            <w:pPr>
-              <w:spacing w:line="360" w:lineRule="auto"/>
-              <w:jc w:val="center"/>
-              <w:rPr>
-                <w:rFonts w:ascii="Times New Roman" w:hAnsi="Times New Roman" w:cs="Times New Roman"/>
-                <w:sz w:val="24"/>
-                <w:szCs w:val="24"/>
-              </w:rPr>
-            </w:pPr>
-            <w:r>
-              <w:rPr>
-                <w:rFonts w:ascii="Times New Roman" w:hAnsi="Times New Roman" w:cs="Times New Roman"/>
-                <w:sz w:val="24"/>
-                <w:szCs w:val="24"/>
+            <w:tcW w:type="dxa" w:w="2074"/>
+          </w:tcPr>
+          <w:p>
+            <w:r/>
+            <w:r>
+              <w:rPr>
+                <w:b w:val="0"/>
+                <w:sz w:val="16"/>
               </w:rPr>
               <w:t>100.0%</w:t>
             </w:r>
@@ -2451,26 +2003,16 @@
         </w:tc>
         <w:tc>
           <w:tcPr>
-            <w:tcW w:w="1999" w:type="dxa"/>
-            <w:vAlign w:val="center"/>
-          </w:tcPr>
-          <w:p>
-            <w:pPr>
-              <w:spacing w:line="360" w:lineRule="auto"/>
-              <w:jc w:val="center"/>
-              <w:rPr>
-                <w:rFonts w:ascii="Times New Roman" w:hAnsi="Times New Roman" w:cs="Times New Roman"/>
-                <w:sz w:val="24"/>
-                <w:szCs w:val="24"/>
-              </w:rPr>
-            </w:pPr>
-            <w:r>
-              <w:rPr>
-                <w:rFonts w:ascii="Times New Roman" w:hAnsi="Times New Roman" w:cs="Times New Roman"/>
-                <w:sz w:val="24"/>
-                <w:szCs w:val="24"/>
-              </w:rPr>
-              <w:t>Not dominant</w:t>
+            <w:tcW w:type="dxa" w:w="2074"/>
+          </w:tcPr>
+          <w:p>
+            <w:r/>
+            <w:r>
+              <w:rPr>
+                <w:b w:val="0"/>
+                <w:sz w:val="16"/>
+              </w:rPr>
+              <w:t>0/108</w:t>
             </w:r>
           </w:p>
         </w:tc>
@@ -2478,49 +2020,29 @@
       <w:tr>
         <w:tc>
           <w:tcPr>
-            <w:tcW w:w="1999" w:type="dxa"/>
-            <w:vAlign w:val="center"/>
-          </w:tcPr>
-          <w:p>
-            <w:pPr>
-              <w:spacing w:line="360" w:lineRule="auto"/>
-              <w:jc w:val="center"/>
-              <w:rPr>
-                <w:rFonts w:ascii="Times New Roman" w:hAnsi="Times New Roman" w:cs="Times New Roman"/>
-                <w:sz w:val="24"/>
-                <w:szCs w:val="24"/>
-              </w:rPr>
-            </w:pPr>
-            <w:r>
-              <w:rPr>
-                <w:rFonts w:ascii="Times New Roman" w:hAnsi="Times New Roman" w:cs="Times New Roman"/>
-                <w:sz w:val="24"/>
-                <w:szCs w:val="24"/>
-              </w:rPr>
-              <w:t>3B candidate</w:t>
-            </w:r>
-          </w:p>
-        </w:tc>
-        <w:tc>
-          <w:tcPr>
-            <w:tcW w:w="1999" w:type="dxa"/>
-            <w:vAlign w:val="center"/>
-          </w:tcPr>
-          <w:p>
-            <w:pPr>
-              <w:spacing w:line="360" w:lineRule="auto"/>
-              <w:jc w:val="center"/>
-              <w:rPr>
-                <w:rFonts w:ascii="Times New Roman" w:hAnsi="Times New Roman" w:cs="Times New Roman"/>
-                <w:sz w:val="24"/>
-                <w:szCs w:val="24"/>
-              </w:rPr>
-            </w:pPr>
-            <w:r>
-              <w:rPr>
-                <w:rFonts w:ascii="Times New Roman" w:hAnsi="Times New Roman" w:cs="Times New Roman"/>
-                <w:sz w:val="24"/>
-                <w:szCs w:val="24"/>
+            <w:tcW w:type="dxa" w:w="2074"/>
+          </w:tcPr>
+          <w:p>
+            <w:r/>
+            <w:r>
+              <w:rPr>
+                <w:b w:val="0"/>
+                <w:sz w:val="16"/>
+              </w:rPr>
+              <w:t>3B / default</w:t>
+            </w:r>
+          </w:p>
+        </w:tc>
+        <w:tc>
+          <w:tcPr>
+            <w:tcW w:type="dxa" w:w="2074"/>
+          </w:tcPr>
+          <w:p>
+            <w:r/>
+            <w:r>
+              <w:rPr>
+                <w:b w:val="0"/>
+                <w:sz w:val="16"/>
               </w:rPr>
               <w:t>47.2%</w:t>
             </w:r>
@@ -2528,24 +2050,14 @@
         </w:tc>
         <w:tc>
           <w:tcPr>
-            <w:tcW w:w="1999" w:type="dxa"/>
-            <w:vAlign w:val="center"/>
-          </w:tcPr>
-          <w:p>
-            <w:pPr>
-              <w:spacing w:line="360" w:lineRule="auto"/>
-              <w:jc w:val="center"/>
-              <w:rPr>
-                <w:rFonts w:ascii="Times New Roman" w:hAnsi="Times New Roman" w:cs="Times New Roman"/>
-                <w:sz w:val="24"/>
-                <w:szCs w:val="24"/>
-              </w:rPr>
-            </w:pPr>
-            <w:r>
-              <w:rPr>
-                <w:rFonts w:ascii="Times New Roman" w:hAnsi="Times New Roman" w:cs="Times New Roman"/>
-                <w:sz w:val="24"/>
-                <w:szCs w:val="24"/>
+            <w:tcW w:type="dxa" w:w="2074"/>
+          </w:tcPr>
+          <w:p>
+            <w:r/>
+            <w:r>
+              <w:rPr>
+                <w:b w:val="0"/>
+                <w:sz w:val="16"/>
               </w:rPr>
               <w:t>56.5%</w:t>
             </w:r>
@@ -2553,24 +2065,14 @@
         </w:tc>
         <w:tc>
           <w:tcPr>
-            <w:tcW w:w="1999" w:type="dxa"/>
-            <w:vAlign w:val="center"/>
-          </w:tcPr>
-          <w:p>
-            <w:pPr>
-              <w:spacing w:line="360" w:lineRule="auto"/>
-              <w:jc w:val="center"/>
-              <w:rPr>
-                <w:rFonts w:ascii="Times New Roman" w:hAnsi="Times New Roman" w:cs="Times New Roman"/>
-                <w:sz w:val="24"/>
-                <w:szCs w:val="24"/>
-              </w:rPr>
-            </w:pPr>
-            <w:r>
-              <w:rPr>
-                <w:rFonts w:ascii="Times New Roman" w:hAnsi="Times New Roman" w:cs="Times New Roman"/>
-                <w:sz w:val="24"/>
-                <w:szCs w:val="24"/>
+            <w:tcW w:type="dxa" w:w="2074"/>
+          </w:tcPr>
+          <w:p>
+            <w:r/>
+            <w:r>
+              <w:rPr>
+                <w:b w:val="0"/>
+                <w:sz w:val="16"/>
               </w:rPr>
               <w:t>48.1%</w:t>
             </w:r>
@@ -2578,24 +2080,14 @@
         </w:tc>
         <w:tc>
           <w:tcPr>
-            <w:tcW w:w="1999" w:type="dxa"/>
-            <w:vAlign w:val="center"/>
-          </w:tcPr>
-          <w:p>
-            <w:pPr>
-              <w:spacing w:line="360" w:lineRule="auto"/>
-              <w:jc w:val="center"/>
-              <w:rPr>
-                <w:rFonts w:ascii="Times New Roman" w:hAnsi="Times New Roman" w:cs="Times New Roman"/>
-                <w:sz w:val="24"/>
-                <w:szCs w:val="24"/>
-              </w:rPr>
-            </w:pPr>
-            <w:r>
-              <w:rPr>
-                <w:rFonts w:ascii="Times New Roman" w:hAnsi="Times New Roman" w:cs="Times New Roman"/>
-                <w:sz w:val="24"/>
-                <w:szCs w:val="24"/>
+            <w:tcW w:type="dxa" w:w="2074"/>
+          </w:tcPr>
+          <w:p>
+            <w:r/>
+            <w:r>
+              <w:rPr>
+                <w:b w:val="0"/>
+                <w:sz w:val="16"/>
               </w:rPr>
               <w:t>24/108</w:t>
             </w:r>
@@ -2605,49 +2097,29 @@
       <w:tr>
         <w:tc>
           <w:tcPr>
-            <w:tcW w:w="1999" w:type="dxa"/>
-            <w:vAlign w:val="center"/>
-          </w:tcPr>
-          <w:p>
-            <w:pPr>
-              <w:spacing w:line="360" w:lineRule="auto"/>
-              <w:jc w:val="center"/>
-              <w:rPr>
-                <w:rFonts w:ascii="Times New Roman" w:hAnsi="Times New Roman" w:cs="Times New Roman"/>
-                <w:sz w:val="24"/>
-                <w:szCs w:val="24"/>
-              </w:rPr>
-            </w:pPr>
-            <w:r>
-              <w:rPr>
-                <w:rFonts w:ascii="Times New Roman" w:hAnsi="Times New Roman" w:cs="Times New Roman"/>
-                <w:sz w:val="24"/>
-                <w:szCs w:val="24"/>
-              </w:rPr>
-              <w:t>7B strict protocol</w:t>
-            </w:r>
-          </w:p>
-        </w:tc>
-        <w:tc>
-          <w:tcPr>
-            <w:tcW w:w="1999" w:type="dxa"/>
-            <w:vAlign w:val="center"/>
-          </w:tcPr>
-          <w:p>
-            <w:pPr>
-              <w:spacing w:line="360" w:lineRule="auto"/>
-              <w:jc w:val="center"/>
-              <w:rPr>
-                <w:rFonts w:ascii="Times New Roman" w:hAnsi="Times New Roman" w:cs="Times New Roman"/>
-                <w:sz w:val="24"/>
-                <w:szCs w:val="24"/>
-              </w:rPr>
-            </w:pPr>
-            <w:r>
-              <w:rPr>
-                <w:rFonts w:ascii="Times New Roman" w:hAnsi="Times New Roman" w:cs="Times New Roman"/>
-                <w:sz w:val="24"/>
-                <w:szCs w:val="24"/>
+            <w:tcW w:type="dxa" w:w="2074"/>
+          </w:tcPr>
+          <w:p>
+            <w:r/>
+            <w:r>
+              <w:rPr>
+                <w:b w:val="0"/>
+                <w:sz w:val="16"/>
+              </w:rPr>
+              <w:t>7B / default</w:t>
+            </w:r>
+          </w:p>
+        </w:tc>
+        <w:tc>
+          <w:tcPr>
+            <w:tcW w:type="dxa" w:w="2074"/>
+          </w:tcPr>
+          <w:p>
+            <w:r/>
+            <w:r>
+              <w:rPr>
+                <w:b w:val="0"/>
+                <w:sz w:val="16"/>
               </w:rPr>
               <w:t>13.0%</w:t>
             </w:r>
@@ -2655,24 +2127,14 @@
         </w:tc>
         <w:tc>
           <w:tcPr>
-            <w:tcW w:w="1999" w:type="dxa"/>
-            <w:vAlign w:val="center"/>
-          </w:tcPr>
-          <w:p>
-            <w:pPr>
-              <w:spacing w:line="360" w:lineRule="auto"/>
-              <w:jc w:val="center"/>
-              <w:rPr>
-                <w:rFonts w:ascii="Times New Roman" w:hAnsi="Times New Roman" w:cs="Times New Roman"/>
-                <w:sz w:val="24"/>
-                <w:szCs w:val="24"/>
-              </w:rPr>
-            </w:pPr>
-            <w:r>
-              <w:rPr>
-                <w:rFonts w:ascii="Times New Roman" w:hAnsi="Times New Roman" w:cs="Times New Roman"/>
-                <w:sz w:val="24"/>
-                <w:szCs w:val="24"/>
+            <w:tcW w:type="dxa" w:w="2074"/>
+          </w:tcPr>
+          <w:p>
+            <w:r/>
+            <w:r>
+              <w:rPr>
+                <w:b w:val="0"/>
+                <w:sz w:val="16"/>
               </w:rPr>
               <w:t>13.9%</w:t>
             </w:r>
@@ -2680,24 +2142,14 @@
         </w:tc>
         <w:tc>
           <w:tcPr>
-            <w:tcW w:w="1999" w:type="dxa"/>
-            <w:vAlign w:val="center"/>
-          </w:tcPr>
-          <w:p>
-            <w:pPr>
-              <w:spacing w:line="360" w:lineRule="auto"/>
-              <w:jc w:val="center"/>
-              <w:rPr>
-                <w:rFonts w:ascii="Times New Roman" w:hAnsi="Times New Roman" w:cs="Times New Roman"/>
-                <w:sz w:val="24"/>
-                <w:szCs w:val="24"/>
-              </w:rPr>
-            </w:pPr>
-            <w:r>
-              <w:rPr>
-                <w:rFonts w:ascii="Times New Roman" w:hAnsi="Times New Roman" w:cs="Times New Roman"/>
-                <w:sz w:val="24"/>
-                <w:szCs w:val="24"/>
+            <w:tcW w:type="dxa" w:w="2074"/>
+          </w:tcPr>
+          <w:p>
+            <w:r/>
+            <w:r>
+              <w:rPr>
+                <w:b w:val="0"/>
+                <w:sz w:val="16"/>
               </w:rPr>
               <w:t>13.0%</w:t>
             </w:r>
@@ -2705,24 +2157,14 @@
         </w:tc>
         <w:tc>
           <w:tcPr>
-            <w:tcW w:w="1999" w:type="dxa"/>
-            <w:vAlign w:val="center"/>
-          </w:tcPr>
-          <w:p>
-            <w:pPr>
-              <w:spacing w:line="360" w:lineRule="auto"/>
-              <w:jc w:val="center"/>
-              <w:rPr>
-                <w:rFonts w:ascii="Times New Roman" w:hAnsi="Times New Roman" w:cs="Times New Roman"/>
-                <w:sz w:val="24"/>
-                <w:szCs w:val="24"/>
-              </w:rPr>
-            </w:pPr>
-            <w:r>
-              <w:rPr>
-                <w:rFonts w:ascii="Times New Roman" w:hAnsi="Times New Roman" w:cs="Times New Roman"/>
-                <w:sz w:val="24"/>
-                <w:szCs w:val="24"/>
+            <w:tcW w:type="dxa" w:w="2074"/>
+          </w:tcPr>
+          <w:p>
+            <w:r/>
+            <w:r>
+              <w:rPr>
+                <w:b w:val="0"/>
+                <w:sz w:val="16"/>
               </w:rPr>
               <w:t>91/108</w:t>
             </w:r>
@@ -2732,49 +2174,29 @@
       <w:tr>
         <w:tc>
           <w:tcPr>
-            <w:tcW w:w="1999" w:type="dxa"/>
-            <w:vAlign w:val="center"/>
-          </w:tcPr>
-          <w:p>
-            <w:pPr>
-              <w:spacing w:line="360" w:lineRule="auto"/>
-              <w:jc w:val="center"/>
-              <w:rPr>
-                <w:rFonts w:ascii="Times New Roman" w:hAnsi="Times New Roman" w:cs="Times New Roman"/>
-                <w:sz w:val="24"/>
-                <w:szCs w:val="24"/>
-              </w:rPr>
-            </w:pPr>
-            <w:r>
-              <w:rPr>
-                <w:rFonts w:ascii="Times New Roman" w:hAnsi="Times New Roman" w:cs="Times New Roman"/>
-                <w:sz w:val="24"/>
-                <w:szCs w:val="24"/>
-              </w:rPr>
-              <w:t>7B JSON profile</w:t>
-            </w:r>
-          </w:p>
-        </w:tc>
-        <w:tc>
-          <w:tcPr>
-            <w:tcW w:w="1999" w:type="dxa"/>
-            <w:vAlign w:val="center"/>
-          </w:tcPr>
-          <w:p>
-            <w:pPr>
-              <w:spacing w:line="360" w:lineRule="auto"/>
-              <w:jc w:val="center"/>
-              <w:rPr>
-                <w:rFonts w:ascii="Times New Roman" w:hAnsi="Times New Roman" w:cs="Times New Roman"/>
-                <w:sz w:val="24"/>
-                <w:szCs w:val="24"/>
-              </w:rPr>
-            </w:pPr>
-            <w:r>
-              <w:rPr>
-                <w:rFonts w:ascii="Times New Roman" w:hAnsi="Times New Roman" w:cs="Times New Roman"/>
-                <w:sz w:val="24"/>
-                <w:szCs w:val="24"/>
+            <w:tcW w:type="dxa" w:w="2074"/>
+          </w:tcPr>
+          <w:p>
+            <w:r/>
+            <w:r>
+              <w:rPr>
+                <w:b w:val="0"/>
+                <w:sz w:val="16"/>
+              </w:rPr>
+              <w:t>7B / JSON contract</w:t>
+            </w:r>
+          </w:p>
+        </w:tc>
+        <w:tc>
+          <w:tcPr>
+            <w:tcW w:type="dxa" w:w="2074"/>
+          </w:tcPr>
+          <w:p>
+            <w:r/>
+            <w:r>
+              <w:rPr>
+                <w:b w:val="0"/>
+                <w:sz w:val="16"/>
               </w:rPr>
               <w:t>75.0%</w:t>
             </w:r>
@@ -2782,24 +2204,14 @@
         </w:tc>
         <w:tc>
           <w:tcPr>
-            <w:tcW w:w="1999" w:type="dxa"/>
-            <w:vAlign w:val="center"/>
-          </w:tcPr>
-          <w:p>
-            <w:pPr>
-              <w:spacing w:line="360" w:lineRule="auto"/>
-              <w:jc w:val="center"/>
-              <w:rPr>
-                <w:rFonts w:ascii="Times New Roman" w:hAnsi="Times New Roman" w:cs="Times New Roman"/>
-                <w:sz w:val="24"/>
-                <w:szCs w:val="24"/>
-              </w:rPr>
-            </w:pPr>
-            <w:r>
-              <w:rPr>
-                <w:rFonts w:ascii="Times New Roman" w:hAnsi="Times New Roman" w:cs="Times New Roman"/>
-                <w:sz w:val="24"/>
-                <w:szCs w:val="24"/>
+            <w:tcW w:type="dxa" w:w="2074"/>
+          </w:tcPr>
+          <w:p>
+            <w:r/>
+            <w:r>
+              <w:rPr>
+                <w:b w:val="0"/>
+                <w:sz w:val="16"/>
               </w:rPr>
               <w:t>75.9%</w:t>
             </w:r>
@@ -2807,24 +2219,14 @@
         </w:tc>
         <w:tc>
           <w:tcPr>
-            <w:tcW w:w="1999" w:type="dxa"/>
-            <w:vAlign w:val="center"/>
-          </w:tcPr>
-          <w:p>
-            <w:pPr>
-              <w:spacing w:line="360" w:lineRule="auto"/>
-              <w:jc w:val="center"/>
-              <w:rPr>
-                <w:rFonts w:ascii="Times New Roman" w:hAnsi="Times New Roman" w:cs="Times New Roman"/>
-                <w:sz w:val="24"/>
-                <w:szCs w:val="24"/>
-              </w:rPr>
-            </w:pPr>
-            <w:r>
-              <w:rPr>
-                <w:rFonts w:ascii="Times New Roman" w:hAnsi="Times New Roman" w:cs="Times New Roman"/>
-                <w:sz w:val="24"/>
-                <w:szCs w:val="24"/>
+            <w:tcW w:type="dxa" w:w="2074"/>
+          </w:tcPr>
+          <w:p>
+            <w:r/>
+            <w:r>
+              <w:rPr>
+                <w:b w:val="0"/>
+                <w:sz w:val="16"/>
               </w:rPr>
               <w:t>85.2%</w:t>
             </w:r>
@@ -2832,24 +2234,14 @@
         </w:tc>
         <w:tc>
           <w:tcPr>
-            <w:tcW w:w="1999" w:type="dxa"/>
-            <w:vAlign w:val="center"/>
-          </w:tcPr>
-          <w:p>
-            <w:pPr>
-              <w:spacing w:line="360" w:lineRule="auto"/>
-              <w:jc w:val="center"/>
-              <w:rPr>
-                <w:rFonts w:ascii="Times New Roman" w:hAnsi="Times New Roman" w:cs="Times New Roman"/>
-                <w:sz w:val="24"/>
-                <w:szCs w:val="24"/>
-              </w:rPr>
-            </w:pPr>
-            <w:r>
-              <w:rPr>
-                <w:rFonts w:ascii="Times New Roman" w:hAnsi="Times New Roman" w:cs="Times New Roman"/>
-                <w:sz w:val="24"/>
-                <w:szCs w:val="24"/>
+            <w:tcW w:type="dxa" w:w="2074"/>
+          </w:tcPr>
+          <w:p>
+            <w:r/>
+            <w:r>
+              <w:rPr>
+                <w:b w:val="0"/>
+                <w:sz w:val="16"/>
               </w:rPr>
               <w:t>10/108</w:t>
             </w:r>
@@ -2859,32 +2251,414 @@
     </w:tbl>
     <w:p>
       <w:pPr>
-        <w:spacing w:line="360" w:lineRule="auto"/>
-        <w:rPr>
-          <w:rFonts w:ascii="Times New Roman" w:hAnsi="Times New Roman" w:cs="Times New Roman"/>
-          <w:sz w:val="24"/>
-          <w:szCs w:val="24"/>
-        </w:rPr>
-      </w:pPr>
+        <w:pStyle w:val="Heading2"/>
+      </w:pPr>
+      <w:r>
+        <w:t>7.2 Parser-Normalized Sensitivity</w:t>
+      </w:r>
     </w:p>
+    <w:tbl>
+      <w:tblPr>
+        <w:tblStyle w:val="TableGrid"/>
+        <w:tblW w:type="auto" w:w="0"/>
+        <w:tblLook w:firstColumn="1" w:firstRow="1" w:lastColumn="0" w:lastRow="0" w:noHBand="0" w:noVBand="1" w:val="04A0"/>
+      </w:tblPr>
+      <w:tblGrid>
+        <w:gridCol w:w="2074"/>
+        <w:gridCol w:w="2074"/>
+        <w:gridCol w:w="2074"/>
+        <w:gridCol w:w="2074"/>
+        <w:gridCol w:w="2074"/>
+      </w:tblGrid>
+      <w:tr>
+        <w:tc>
+          <w:tcPr>
+            <w:tcW w:type="dxa" w:w="2074"/>
+          </w:tcPr>
+          <w:p>
+            <w:r/>
+            <w:r>
+              <w:rPr>
+                <w:b/>
+                <w:sz w:val="16"/>
+              </w:rPr>
+              <w:t>Configuration</w:t>
+            </w:r>
+          </w:p>
+        </w:tc>
+        <w:tc>
+          <w:tcPr>
+            <w:tcW w:type="dxa" w:w="2074"/>
+          </w:tcPr>
+          <w:p>
+            <w:r/>
+            <w:r>
+              <w:rPr>
+                <w:b/>
+                <w:sz w:val="16"/>
+              </w:rPr>
+              <w:t>Strict</w:t>
+            </w:r>
+          </w:p>
+        </w:tc>
+        <w:tc>
+          <w:tcPr>
+            <w:tcW w:type="dxa" w:w="2074"/>
+          </w:tcPr>
+          <w:p>
+            <w:r/>
+            <w:r>
+              <w:rPr>
+                <w:b/>
+                <w:sz w:val="16"/>
+              </w:rPr>
+              <w:t>Normalized</w:t>
+            </w:r>
+          </w:p>
+        </w:tc>
+        <w:tc>
+          <w:tcPr>
+            <w:tcW w:type="dxa" w:w="2074"/>
+          </w:tcPr>
+          <w:p>
+            <w:r/>
+            <w:r>
+              <w:rPr>
+                <w:b/>
+                <w:sz w:val="16"/>
+              </w:rPr>
+              <w:t>Delta</w:t>
+            </w:r>
+          </w:p>
+        </w:tc>
+        <w:tc>
+          <w:tcPr>
+            <w:tcW w:type="dxa" w:w="2074"/>
+          </w:tcPr>
+          <w:p>
+            <w:r/>
+            <w:r>
+              <w:rPr>
+                <w:b/>
+                <w:sz w:val="16"/>
+              </w:rPr>
+              <w:t>Recovered failures</w:t>
+            </w:r>
+          </w:p>
+        </w:tc>
+      </w:tr>
+      <w:tr>
+        <w:tc>
+          <w:tcPr>
+            <w:tcW w:type="dxa" w:w="2074"/>
+          </w:tcPr>
+          <w:p>
+            <w:r/>
+            <w:r>
+              <w:rPr>
+                <w:b w:val="0"/>
+                <w:sz w:val="16"/>
+              </w:rPr>
+              <w:t>1.5B / default</w:t>
+            </w:r>
+          </w:p>
+        </w:tc>
+        <w:tc>
+          <w:tcPr>
+            <w:tcW w:type="dxa" w:w="2074"/>
+          </w:tcPr>
+          <w:p>
+            <w:r/>
+            <w:r>
+              <w:rPr>
+                <w:b w:val="0"/>
+                <w:sz w:val="16"/>
+              </w:rPr>
+              <w:t>90.7%</w:t>
+            </w:r>
+          </w:p>
+        </w:tc>
+        <w:tc>
+          <w:tcPr>
+            <w:tcW w:type="dxa" w:w="2074"/>
+          </w:tcPr>
+          <w:p>
+            <w:r/>
+            <w:r>
+              <w:rPr>
+                <w:b w:val="0"/>
+                <w:sz w:val="16"/>
+              </w:rPr>
+              <w:t>90.7%</w:t>
+            </w:r>
+          </w:p>
+        </w:tc>
+        <w:tc>
+          <w:tcPr>
+            <w:tcW w:type="dxa" w:w="2074"/>
+          </w:tcPr>
+          <w:p>
+            <w:r/>
+            <w:r>
+              <w:rPr>
+                <w:b w:val="0"/>
+                <w:sz w:val="16"/>
+              </w:rPr>
+              <w:t>+0.0 pp</w:t>
+            </w:r>
+          </w:p>
+        </w:tc>
+        <w:tc>
+          <w:tcPr>
+            <w:tcW w:type="dxa" w:w="2074"/>
+          </w:tcPr>
+          <w:p>
+            <w:r/>
+            <w:r>
+              <w:rPr>
+                <w:b w:val="0"/>
+                <w:sz w:val="16"/>
+              </w:rPr>
+              <w:t>0/0</w:t>
+            </w:r>
+          </w:p>
+        </w:tc>
+      </w:tr>
+      <w:tr>
+        <w:tc>
+          <w:tcPr>
+            <w:tcW w:type="dxa" w:w="2074"/>
+          </w:tcPr>
+          <w:p>
+            <w:r/>
+            <w:r>
+              <w:rPr>
+                <w:b w:val="0"/>
+                <w:sz w:val="16"/>
+              </w:rPr>
+              <w:t>3B / default</w:t>
+            </w:r>
+          </w:p>
+        </w:tc>
+        <w:tc>
+          <w:tcPr>
+            <w:tcW w:type="dxa" w:w="2074"/>
+          </w:tcPr>
+          <w:p>
+            <w:r/>
+            <w:r>
+              <w:rPr>
+                <w:b w:val="0"/>
+                <w:sz w:val="16"/>
+              </w:rPr>
+              <w:t>47.2%</w:t>
+            </w:r>
+          </w:p>
+        </w:tc>
+        <w:tc>
+          <w:tcPr>
+            <w:tcW w:type="dxa" w:w="2074"/>
+          </w:tcPr>
+          <w:p>
+            <w:r/>
+            <w:r>
+              <w:rPr>
+                <w:b w:val="0"/>
+                <w:sz w:val="16"/>
+              </w:rPr>
+              <w:t>59.3%</w:t>
+            </w:r>
+          </w:p>
+        </w:tc>
+        <w:tc>
+          <w:tcPr>
+            <w:tcW w:type="dxa" w:w="2074"/>
+          </w:tcPr>
+          <w:p>
+            <w:r/>
+            <w:r>
+              <w:rPr>
+                <w:b w:val="0"/>
+                <w:sz w:val="16"/>
+              </w:rPr>
+              <w:t>+12.0 pp</w:t>
+            </w:r>
+          </w:p>
+        </w:tc>
+        <w:tc>
+          <w:tcPr>
+            <w:tcW w:type="dxa" w:w="2074"/>
+          </w:tcPr>
+          <w:p>
+            <w:r/>
+            <w:r>
+              <w:rPr>
+                <w:b w:val="0"/>
+                <w:sz w:val="16"/>
+              </w:rPr>
+              <w:t>24/24</w:t>
+            </w:r>
+          </w:p>
+        </w:tc>
+      </w:tr>
+      <w:tr>
+        <w:tc>
+          <w:tcPr>
+            <w:tcW w:type="dxa" w:w="2074"/>
+          </w:tcPr>
+          <w:p>
+            <w:r/>
+            <w:r>
+              <w:rPr>
+                <w:b w:val="0"/>
+                <w:sz w:val="16"/>
+              </w:rPr>
+              <w:t>7B / default</w:t>
+            </w:r>
+          </w:p>
+        </w:tc>
+        <w:tc>
+          <w:tcPr>
+            <w:tcW w:type="dxa" w:w="2074"/>
+          </w:tcPr>
+          <w:p>
+            <w:r/>
+            <w:r>
+              <w:rPr>
+                <w:b w:val="0"/>
+                <w:sz w:val="16"/>
+              </w:rPr>
+              <w:t>13.0%</w:t>
+            </w:r>
+          </w:p>
+        </w:tc>
+        <w:tc>
+          <w:tcPr>
+            <w:tcW w:type="dxa" w:w="2074"/>
+          </w:tcPr>
+          <w:p>
+            <w:r/>
+            <w:r>
+              <w:rPr>
+                <w:b w:val="0"/>
+                <w:sz w:val="16"/>
+              </w:rPr>
+              <w:t>41.7%</w:t>
+            </w:r>
+          </w:p>
+        </w:tc>
+        <w:tc>
+          <w:tcPr>
+            <w:tcW w:type="dxa" w:w="2074"/>
+          </w:tcPr>
+          <w:p>
+            <w:r/>
+            <w:r>
+              <w:rPr>
+                <w:b w:val="0"/>
+                <w:sz w:val="16"/>
+              </w:rPr>
+              <w:t>+28.7 pp</w:t>
+            </w:r>
+          </w:p>
+        </w:tc>
+        <w:tc>
+          <w:tcPr>
+            <w:tcW w:type="dxa" w:w="2074"/>
+          </w:tcPr>
+          <w:p>
+            <w:r/>
+            <w:r>
+              <w:rPr>
+                <w:b w:val="0"/>
+                <w:sz w:val="16"/>
+              </w:rPr>
+              <w:t>36/91</w:t>
+            </w:r>
+          </w:p>
+        </w:tc>
+      </w:tr>
+      <w:tr>
+        <w:tc>
+          <w:tcPr>
+            <w:tcW w:type="dxa" w:w="2074"/>
+          </w:tcPr>
+          <w:p>
+            <w:r/>
+            <w:r>
+              <w:rPr>
+                <w:b w:val="0"/>
+                <w:sz w:val="16"/>
+              </w:rPr>
+              <w:t>7B / JSON contract</w:t>
+            </w:r>
+          </w:p>
+        </w:tc>
+        <w:tc>
+          <w:tcPr>
+            <w:tcW w:type="dxa" w:w="2074"/>
+          </w:tcPr>
+          <w:p>
+            <w:r/>
+            <w:r>
+              <w:rPr>
+                <w:b w:val="0"/>
+                <w:sz w:val="16"/>
+              </w:rPr>
+              <w:t>75.0%</w:t>
+            </w:r>
+          </w:p>
+        </w:tc>
+        <w:tc>
+          <w:tcPr>
+            <w:tcW w:type="dxa" w:w="2074"/>
+          </w:tcPr>
+          <w:p>
+            <w:r/>
+            <w:r>
+              <w:rPr>
+                <w:b w:val="0"/>
+                <w:sz w:val="16"/>
+              </w:rPr>
+              <w:t>79.6%</w:t>
+            </w:r>
+          </w:p>
+        </w:tc>
+        <w:tc>
+          <w:tcPr>
+            <w:tcW w:type="dxa" w:w="2074"/>
+          </w:tcPr>
+          <w:p>
+            <w:r/>
+            <w:r>
+              <w:rPr>
+                <w:b w:val="0"/>
+                <w:sz w:val="16"/>
+              </w:rPr>
+              <w:t>+4.6 pp</w:t>
+            </w:r>
+          </w:p>
+        </w:tc>
+        <w:tc>
+          <w:tcPr>
+            <w:tcW w:type="dxa" w:w="2074"/>
+          </w:tcPr>
+          <w:p>
+            <w:r/>
+            <w:r>
+              <w:rPr>
+                <w:b w:val="0"/>
+                <w:sz w:val="16"/>
+              </w:rPr>
+              <w:t>5/10</w:t>
+            </w:r>
+          </w:p>
+        </w:tc>
+      </w:tr>
+    </w:tbl>
     <w:p>
-      <w:pPr>
-        <w:spacing w:line="360" w:lineRule="auto"/>
-        <w:ind w:left="-180"/>
-        <w:jc w:val="both"/>
-        <w:rPr>
-          <w:rFonts w:ascii="Times New Roman" w:hAnsi="Times New Roman" w:cs="Times New Roman"/>
-          <w:sz w:val="24"/>
-          <w:szCs w:val="24"/>
-        </w:rPr>
-      </w:pPr>
       <w:r>
-        <w:rPr>
-          <w:rFonts w:ascii="Times New Roman" w:hAnsi="Times New Roman" w:cs="Times New Roman"/>
-          <w:sz w:val="24"/>
-          <w:szCs w:val="24"/>
-        </w:rPr>
-        <w:t>The 7B model-specific JSON prompt/parser profile reduced generation failures from 91/108 to 10/108. This shows that output-format compatibility dominated the initial strict 7B result. However, the remaining normalized gap shows that formatting did not fully explain the model difference.</w:t>
+        <w:t>Both 7B rows use the same model artifact but change the prompt and parser profile together. Therefore this is output-contract sensitivity, not a pure prompt ablation. Normalized accuracy is supporting evidence and does not replace strict end-to-end accuracy.</w:t>
       </w:r>
     </w:p>
     <w:p>
@@ -2913,7 +2687,7 @@
         </w:rPr>
       </w:pPr>
       <w:r>
-        <w:t>Executable graph-based verifier and repair pipeline with 129 passing tests.</w:t>
+        <w:t>Executable graph-based verifier and repair pipeline with 130 passing tests.</w:t>
       </w:r>
     </w:p>
     <w:p>
@@ -3008,6 +2782,7 @@
           <w:sz w:val="24"/>
           <w:szCs w:val="24"/>
         </w:rPr>
+        <w:lastRenderedPageBreak/>
         <w:t>Version-controlled source code and reports on GitHub.</w:t>
       </w:r>
     </w:p>
@@ -3039,27 +2814,6 @@
       <w:r>
         <w:t>The complete proposal experiment is not yet finished. The project now includes a 40-problem MATH-500 level-4/5 processing pilot, a frozen six-row ablation design, and graph-integrated model traces. However, the MATH-500 run is currently a text-processing smoke test rather than an accuracy evaluation; the learned calibrated verifier is not trained; three ablation cells remain unmeasured; and the fresh matched-budget result is based on only 36 runs and seven detected errors.</w:t>
       </w:r>
-    </w:p>
-    <w:p>
-      <w:pPr>
-        <w:spacing w:line="360" w:lineRule="auto"/>
-        <w:jc w:val="both"/>
-        <w:rPr>
-          <w:rFonts w:ascii="Times New Roman" w:hAnsi="Times New Roman" w:cs="Times New Roman"/>
-          <w:sz w:val="24"/>
-          <w:szCs w:val="24"/>
-        </w:rPr>
-      </w:pPr>
-    </w:p>
-    <w:p>
-      <w:pPr>
-        <w:spacing w:line="360" w:lineRule="auto"/>
-        <w:rPr>
-          <w:rFonts w:ascii="Times New Roman" w:hAnsi="Times New Roman" w:cs="Times New Roman"/>
-          <w:sz w:val="24"/>
-          <w:szCs w:val="24"/>
-        </w:rPr>
-      </w:pPr>
     </w:p>
     <w:p>
       <w:pPr>
@@ -3279,6 +3033,7 @@
           <w:sz w:val="24"/>
           <w:szCs w:val="24"/>
         </w:rPr>
+        <w:lastRenderedPageBreak/>
         <w:drawing>
           <wp:inline distT="0" distB="0" distL="0" distR="0" wp14:anchorId="65035DA3" wp14:editId="326440AF">
             <wp:extent cx="6346190" cy="2539365"/>
@@ -3366,7 +3121,6 @@
           <w:sz w:val="24"/>
           <w:szCs w:val="24"/>
         </w:rPr>
-        <w:lastRenderedPageBreak/>
         <w:t>python model_pipeline.py --provider mock</w:t>
       </w:r>
     </w:p>
@@ -3460,6 +3214,7 @@
           <w:sz w:val="24"/>
           <w:szCs w:val="24"/>
         </w:rPr>
+        <w:lastRenderedPageBreak/>
         <w:drawing>
           <wp:inline distT="0" distB="0" distL="0" distR="0" wp14:anchorId="2AA59B19" wp14:editId="038C352A">
             <wp:extent cx="6346190" cy="4114800"/>
@@ -3524,7 +3279,6 @@
           <w:sz w:val="24"/>
           <w:szCs w:val="24"/>
         </w:rPr>
-        <w:lastRenderedPageBreak/>
         <w:t>python allocation_report.py</w:t>
       </w:r>
     </w:p>
@@ -3629,6 +3383,14 @@
         </w:rPr>
         <w:t>Conclusion: the pilot supports continuing to the full proposal-scale evaluation, while keeping current claims limited to the tested algebra setting.</w:t>
       </w:r>
+      <w:r>
+        <w:br w:type="page"/>
+      </w:r>
+    </w:p>
+    <w:p>
+      <w:r>
+        <w:br w:type="page"/>
+      </w:r>
     </w:p>
     <w:p>
       <w:r>
@@ -4187,17 +3949,18 @@
         <w:tblLook w:firstColumn="1" w:firstRow="1" w:lastColumn="0" w:lastRow="0" w:noHBand="0" w:noVBand="1" w:val="04A0"/>
       </w:tblPr>
       <w:tblGrid>
-        <w:gridCol w:w="1728"/>
-        <w:gridCol w:w="1728"/>
-        <w:gridCol w:w="1728"/>
-        <w:gridCol w:w="1728"/>
-        <w:gridCol w:w="1728"/>
-        <w:gridCol w:w="1728"/>
+        <w:gridCol w:w="1481"/>
+        <w:gridCol w:w="1481"/>
+        <w:gridCol w:w="1481"/>
+        <w:gridCol w:w="1481"/>
+        <w:gridCol w:w="1481"/>
+        <w:gridCol w:w="1481"/>
+        <w:gridCol w:w="1481"/>
       </w:tblGrid>
       <w:tr>
         <w:tc>
           <w:tcPr>
-            <w:tcW w:type="dxa" w:w="1728"/>
+            <w:tcW w:type="dxa" w:w="1481"/>
           </w:tcPr>
           <w:p>
             <w:r/>
@@ -4212,7 +3975,7 @@
         </w:tc>
         <w:tc>
           <w:tcPr>
-            <w:tcW w:type="dxa" w:w="1728"/>
+            <w:tcW w:type="dxa" w:w="1481"/>
           </w:tcPr>
           <w:p>
             <w:r/>
@@ -4227,7 +3990,7 @@
         </w:tc>
         <w:tc>
           <w:tcPr>
-            <w:tcW w:type="dxa" w:w="1728"/>
+            <w:tcW w:type="dxa" w:w="1481"/>
           </w:tcPr>
           <w:p>
             <w:r/>
@@ -4242,7 +4005,7 @@
         </w:tc>
         <w:tc>
           <w:tcPr>
-            <w:tcW w:type="dxa" w:w="1728"/>
+            <w:tcW w:type="dxa" w:w="1481"/>
           </w:tcPr>
           <w:p>
             <w:r/>
@@ -4257,7 +4020,7 @@
         </w:tc>
         <w:tc>
           <w:tcPr>
-            <w:tcW w:type="dxa" w:w="1728"/>
+            <w:tcW w:type="dxa" w:w="1481"/>
           </w:tcPr>
           <w:p>
             <w:r/>
@@ -4272,7 +4035,7 @@
         </w:tc>
         <w:tc>
           <w:tcPr>
-            <w:tcW w:type="dxa" w:w="1728"/>
+            <w:tcW w:type="dxa" w:w="1481"/>
           </w:tcPr>
           <w:p>
             <w:r/>
@@ -4282,6 +4045,21 @@
                 <w:sz w:val="16"/>
               </w:rPr>
               <w:t>Avg tokens</w:t>
+            </w:r>
+          </w:p>
+        </w:tc>
+        <w:tc>
+          <w:tcPr>
+            <w:tcW w:type="dxa" w:w="1481"/>
+          </w:tcPr>
+          <w:p>
+            <w:r/>
+            <w:r>
+              <w:rPr>
+                <w:b/>
+                <w:sz w:val="16"/>
+              </w:rPr>
+              <w:t>Total cost</w:t>
             </w:r>
           </w:p>
         </w:tc>
@@ -4289,7 +4067,7 @@
       <w:tr>
         <w:tc>
           <w:tcPr>
-            <w:tcW w:type="dxa" w:w="1728"/>
+            <w:tcW w:type="dxa" w:w="1481"/>
           </w:tcPr>
           <w:p>
             <w:r/>
@@ -4304,7 +4082,7 @@
         </w:tc>
         <w:tc>
           <w:tcPr>
-            <w:tcW w:type="dxa" w:w="1728"/>
+            <w:tcW w:type="dxa" w:w="1481"/>
           </w:tcPr>
           <w:p>
             <w:r/>
@@ -4319,7 +4097,7 @@
         </w:tc>
         <w:tc>
           <w:tcPr>
-            <w:tcW w:type="dxa" w:w="1728"/>
+            <w:tcW w:type="dxa" w:w="1481"/>
           </w:tcPr>
           <w:p>
             <w:r/>
@@ -4334,7 +4112,7 @@
         </w:tc>
         <w:tc>
           <w:tcPr>
-            <w:tcW w:type="dxa" w:w="1728"/>
+            <w:tcW w:type="dxa" w:w="1481"/>
           </w:tcPr>
           <w:p>
             <w:r/>
@@ -4349,7 +4127,7 @@
         </w:tc>
         <w:tc>
           <w:tcPr>
-            <w:tcW w:type="dxa" w:w="1728"/>
+            <w:tcW w:type="dxa" w:w="1481"/>
           </w:tcPr>
           <w:p>
             <w:r/>
@@ -4364,7 +4142,7 @@
         </w:tc>
         <w:tc>
           <w:tcPr>
-            <w:tcW w:type="dxa" w:w="1728"/>
+            <w:tcW w:type="dxa" w:w="1481"/>
           </w:tcPr>
           <w:p>
             <w:r/>
@@ -4374,6 +4152,21 @@
                 <w:sz w:val="16"/>
               </w:rPr>
               <w:t>624.1</w:t>
+            </w:r>
+          </w:p>
+        </w:tc>
+        <w:tc>
+          <w:tcPr>
+            <w:tcW w:type="dxa" w:w="1481"/>
+          </w:tcPr>
+          <w:p>
+            <w:r/>
+            <w:r>
+              <w:rPr>
+                <w:b w:val="0"/>
+                <w:sz w:val="16"/>
+              </w:rPr>
+              <w:t>22,469</w:t>
             </w:r>
           </w:p>
         </w:tc>
@@ -4381,7 +4174,7 @@
       <w:tr>
         <w:tc>
           <w:tcPr>
-            <w:tcW w:type="dxa" w:w="1728"/>
+            <w:tcW w:type="dxa" w:w="1481"/>
           </w:tcPr>
           <w:p>
             <w:r/>
@@ -4396,7 +4189,7 @@
         </w:tc>
         <w:tc>
           <w:tcPr>
-            <w:tcW w:type="dxa" w:w="1728"/>
+            <w:tcW w:type="dxa" w:w="1481"/>
           </w:tcPr>
           <w:p>
             <w:r/>
@@ -4411,7 +4204,7 @@
         </w:tc>
         <w:tc>
           <w:tcPr>
-            <w:tcW w:type="dxa" w:w="1728"/>
+            <w:tcW w:type="dxa" w:w="1481"/>
           </w:tcPr>
           <w:p>
             <w:r/>
@@ -4426,7 +4219,7 @@
         </w:tc>
         <w:tc>
           <w:tcPr>
-            <w:tcW w:type="dxa" w:w="1728"/>
+            <w:tcW w:type="dxa" w:w="1481"/>
           </w:tcPr>
           <w:p>
             <w:r/>
@@ -4441,7 +4234,7 @@
         </w:tc>
         <w:tc>
           <w:tcPr>
-            <w:tcW w:type="dxa" w:w="1728"/>
+            <w:tcW w:type="dxa" w:w="1481"/>
           </w:tcPr>
           <w:p>
             <w:r/>
@@ -4456,7 +4249,7 @@
         </w:tc>
         <w:tc>
           <w:tcPr>
-            <w:tcW w:type="dxa" w:w="1728"/>
+            <w:tcW w:type="dxa" w:w="1481"/>
           </w:tcPr>
           <w:p>
             <w:r/>
@@ -4466,6 +4259,21 @@
                 <w:sz w:val="16"/>
               </w:rPr>
               <w:t>757.4</w:t>
+            </w:r>
+          </w:p>
+        </w:tc>
+        <w:tc>
+          <w:tcPr>
+            <w:tcW w:type="dxa" w:w="1481"/>
+          </w:tcPr>
+          <w:p>
+            <w:r/>
+            <w:r>
+              <w:rPr>
+                <w:b w:val="0"/>
+                <w:sz w:val="16"/>
+              </w:rPr>
+              <w:t>27,265</w:t>
             </w:r>
           </w:p>
         </w:tc>
@@ -4473,7 +4281,7 @@
       <w:tr>
         <w:tc>
           <w:tcPr>
-            <w:tcW w:type="dxa" w:w="1728"/>
+            <w:tcW w:type="dxa" w:w="1481"/>
           </w:tcPr>
           <w:p>
             <w:r/>
@@ -4488,7 +4296,7 @@
         </w:tc>
         <w:tc>
           <w:tcPr>
-            <w:tcW w:type="dxa" w:w="1728"/>
+            <w:tcW w:type="dxa" w:w="1481"/>
           </w:tcPr>
           <w:p>
             <w:r/>
@@ -4503,7 +4311,7 @@
         </w:tc>
         <w:tc>
           <w:tcPr>
-            <w:tcW w:type="dxa" w:w="1728"/>
+            <w:tcW w:type="dxa" w:w="1481"/>
           </w:tcPr>
           <w:p>
             <w:r/>
@@ -4518,7 +4326,7 @@
         </w:tc>
         <w:tc>
           <w:tcPr>
-            <w:tcW w:type="dxa" w:w="1728"/>
+            <w:tcW w:type="dxa" w:w="1481"/>
           </w:tcPr>
           <w:p>
             <w:r/>
@@ -4533,7 +4341,7 @@
         </w:tc>
         <w:tc>
           <w:tcPr>
-            <w:tcW w:type="dxa" w:w="1728"/>
+            <w:tcW w:type="dxa" w:w="1481"/>
           </w:tcPr>
           <w:p>
             <w:r/>
@@ -4548,7 +4356,7 @@
         </w:tc>
         <w:tc>
           <w:tcPr>
-            <w:tcW w:type="dxa" w:w="1728"/>
+            <w:tcW w:type="dxa" w:w="1481"/>
           </w:tcPr>
           <w:p>
             <w:r/>
@@ -4558,6 +4366,21 @@
                 <w:sz w:val="16"/>
               </w:rPr>
               <w:t>772.1</w:t>
+            </w:r>
+          </w:p>
+        </w:tc>
+        <w:tc>
+          <w:tcPr>
+            <w:tcW w:type="dxa" w:w="1481"/>
+          </w:tcPr>
+          <w:p>
+            <w:r/>
+            <w:r>
+              <w:rPr>
+                <w:b w:val="0"/>
+                <w:sz w:val="16"/>
+              </w:rPr>
+              <w:t>27,796</w:t>
             </w:r>
           </w:p>
         </w:tc>
@@ -4565,7 +4388,7 @@
       <w:tr>
         <w:tc>
           <w:tcPr>
-            <w:tcW w:type="dxa" w:w="1728"/>
+            <w:tcW w:type="dxa" w:w="1481"/>
           </w:tcPr>
           <w:p>
             <w:r/>
@@ -4580,7 +4403,7 @@
         </w:tc>
         <w:tc>
           <w:tcPr>
-            <w:tcW w:type="dxa" w:w="1728"/>
+            <w:tcW w:type="dxa" w:w="1481"/>
           </w:tcPr>
           <w:p>
             <w:r/>
@@ -4595,7 +4418,7 @@
         </w:tc>
         <w:tc>
           <w:tcPr>
-            <w:tcW w:type="dxa" w:w="1728"/>
+            <w:tcW w:type="dxa" w:w="1481"/>
           </w:tcPr>
           <w:p>
             <w:r/>
@@ -4610,7 +4433,7 @@
         </w:tc>
         <w:tc>
           <w:tcPr>
-            <w:tcW w:type="dxa" w:w="1728"/>
+            <w:tcW w:type="dxa" w:w="1481"/>
           </w:tcPr>
           <w:p>
             <w:r/>
@@ -4625,7 +4448,7 @@
         </w:tc>
         <w:tc>
           <w:tcPr>
-            <w:tcW w:type="dxa" w:w="1728"/>
+            <w:tcW w:type="dxa" w:w="1481"/>
           </w:tcPr>
           <w:p>
             <w:r/>
@@ -4640,7 +4463,7 @@
         </w:tc>
         <w:tc>
           <w:tcPr>
-            <w:tcW w:type="dxa" w:w="1728"/>
+            <w:tcW w:type="dxa" w:w="1481"/>
           </w:tcPr>
           <w:p>
             <w:r/>
@@ -4650,6 +4473,21 @@
                 <w:sz w:val="16"/>
               </w:rPr>
               <w:t>721.5</w:t>
+            </w:r>
+          </w:p>
+        </w:tc>
+        <w:tc>
+          <w:tcPr>
+            <w:tcW w:type="dxa" w:w="1481"/>
+          </w:tcPr>
+          <w:p>
+            <w:r/>
+            <w:r>
+              <w:rPr>
+                <w:b w:val="0"/>
+                <w:sz w:val="16"/>
+              </w:rPr>
+              <w:t>25,975</w:t>
             </w:r>
           </w:p>
         </w:tc>
@@ -4688,15 +4526,17 @@
         <w:tblLook w:firstColumn="1" w:firstRow="1" w:lastColumn="0" w:lastRow="0" w:noHBand="0" w:noVBand="1" w:val="04A0"/>
       </w:tblPr>
       <w:tblGrid>
-        <w:gridCol w:w="2592"/>
-        <w:gridCol w:w="2592"/>
-        <w:gridCol w:w="2592"/>
-        <w:gridCol w:w="2592"/>
+        <w:gridCol w:w="1728"/>
+        <w:gridCol w:w="1728"/>
+        <w:gridCol w:w="1728"/>
+        <w:gridCol w:w="1728"/>
+        <w:gridCol w:w="1728"/>
+        <w:gridCol w:w="1728"/>
       </w:tblGrid>
       <w:tr>
         <w:tc>
           <w:tcPr>
-            <w:tcW w:type="dxa" w:w="2592"/>
+            <w:tcW w:type="dxa" w:w="1728"/>
           </w:tcPr>
           <w:p>
             <w:r/>
@@ -4705,13 +4545,13 @@
                 <w:b/>
                 <w:sz w:val="16"/>
               </w:rPr>
-              <w:t>Configuration</w:t>
-            </w:r>
-          </w:p>
-        </w:tc>
-        <w:tc>
-          <w:tcPr>
-            <w:tcW w:type="dxa" w:w="2592"/>
+              <w:t>Model</w:t>
+            </w:r>
+          </w:p>
+        </w:tc>
+        <w:tc>
+          <w:tcPr>
+            <w:tcW w:type="dxa" w:w="1728"/>
           </w:tcPr>
           <w:p>
             <w:r/>
@@ -4720,13 +4560,43 @@
                 <w:b/>
                 <w:sz w:val="16"/>
               </w:rPr>
+              <w:t>Prompt version</w:t>
+            </w:r>
+          </w:p>
+        </w:tc>
+        <w:tc>
+          <w:tcPr>
+            <w:tcW w:type="dxa" w:w="1728"/>
+          </w:tcPr>
+          <w:p>
+            <w:r/>
+            <w:r>
+              <w:rPr>
+                <w:b/>
+                <w:sz w:val="16"/>
+              </w:rPr>
+              <w:t>Parser version</w:t>
+            </w:r>
+          </w:p>
+        </w:tc>
+        <w:tc>
+          <w:tcPr>
+            <w:tcW w:type="dxa" w:w="1728"/>
+          </w:tcPr>
+          <w:p>
+            <w:r/>
+            <w:r>
+              <w:rPr>
+                <w:b/>
+                <w:sz w:val="16"/>
+              </w:rPr>
               <w:t>Failures</w:t>
             </w:r>
           </w:p>
         </w:tc>
         <w:tc>
           <w:tcPr>
-            <w:tcW w:type="dxa" w:w="2592"/>
+            <w:tcW w:type="dxa" w:w="1728"/>
           </w:tcPr>
           <w:p>
             <w:r/>
@@ -4741,7 +4611,7 @@
         </w:tc>
         <w:tc>
           <w:tcPr>
-            <w:tcW w:type="dxa" w:w="2592"/>
+            <w:tcW w:type="dxa" w:w="1728"/>
           </w:tcPr>
           <w:p>
             <w:r/>
@@ -4758,22 +4628,52 @@
       <w:tr>
         <w:tc>
           <w:tcPr>
-            <w:tcW w:type="dxa" w:w="2592"/>
-          </w:tcPr>
-          <w:p>
-            <w:r/>
-            <w:r>
-              <w:rPr>
-                <w:b w:val="0"/>
-                <w:sz w:val="16"/>
-              </w:rPr>
-              <w:t>qwen2-math:1.5b / default</w:t>
-            </w:r>
-          </w:p>
-        </w:tc>
-        <w:tc>
-          <w:tcPr>
-            <w:tcW w:type="dxa" w:w="2592"/>
+            <w:tcW w:type="dxa" w:w="1728"/>
+          </w:tcPr>
+          <w:p>
+            <w:r/>
+            <w:r>
+              <w:rPr>
+                <w:b w:val="0"/>
+                <w:sz w:val="16"/>
+              </w:rPr>
+              <w:t>qwen2-math:1.5b</w:t>
+            </w:r>
+          </w:p>
+        </w:tc>
+        <w:tc>
+          <w:tcPr>
+            <w:tcW w:type="dxa" w:w="1728"/>
+          </w:tcPr>
+          <w:p>
+            <w:r/>
+            <w:r>
+              <w:rPr>
+                <w:b w:val="0"/>
+                <w:sz w:val="16"/>
+              </w:rPr>
+              <w:t>equation_json_default_v1</w:t>
+            </w:r>
+          </w:p>
+        </w:tc>
+        <w:tc>
+          <w:tcPr>
+            <w:tcW w:type="dxa" w:w="1728"/>
+          </w:tcPr>
+          <w:p>
+            <w:r/>
+            <w:r>
+              <w:rPr>
+                <w:b w:val="0"/>
+                <w:sz w:val="16"/>
+              </w:rPr>
+              <w:t>equation_parser_default_v1</w:t>
+            </w:r>
+          </w:p>
+        </w:tc>
+        <w:tc>
+          <w:tcPr>
+            <w:tcW w:type="dxa" w:w="1728"/>
           </w:tcPr>
           <w:p>
             <w:r/>
@@ -4788,7 +4688,7 @@
         </w:tc>
         <w:tc>
           <w:tcPr>
-            <w:tcW w:type="dxa" w:w="2592"/>
+            <w:tcW w:type="dxa" w:w="1728"/>
           </w:tcPr>
           <w:p>
             <w:r/>
@@ -4803,7 +4703,7 @@
         </w:tc>
         <w:tc>
           <w:tcPr>
-            <w:tcW w:type="dxa" w:w="2592"/>
+            <w:tcW w:type="dxa" w:w="1728"/>
           </w:tcPr>
           <w:p>
             <w:r/>
@@ -4820,22 +4720,52 @@
       <w:tr>
         <w:tc>
           <w:tcPr>
-            <w:tcW w:type="dxa" w:w="2592"/>
-          </w:tcPr>
-          <w:p>
-            <w:r/>
-            <w:r>
-              <w:rPr>
-                <w:b w:val="0"/>
-                <w:sz w:val="16"/>
-              </w:rPr>
-              <w:t>qwen2.5:3b / default</w:t>
-            </w:r>
-          </w:p>
-        </w:tc>
-        <w:tc>
-          <w:tcPr>
-            <w:tcW w:type="dxa" w:w="2592"/>
+            <w:tcW w:type="dxa" w:w="1728"/>
+          </w:tcPr>
+          <w:p>
+            <w:r/>
+            <w:r>
+              <w:rPr>
+                <w:b w:val="0"/>
+                <w:sz w:val="16"/>
+              </w:rPr>
+              <w:t>qwen2.5:3b</w:t>
+            </w:r>
+          </w:p>
+        </w:tc>
+        <w:tc>
+          <w:tcPr>
+            <w:tcW w:type="dxa" w:w="1728"/>
+          </w:tcPr>
+          <w:p>
+            <w:r/>
+            <w:r>
+              <w:rPr>
+                <w:b w:val="0"/>
+                <w:sz w:val="16"/>
+              </w:rPr>
+              <w:t>equation_json_default_v1</w:t>
+            </w:r>
+          </w:p>
+        </w:tc>
+        <w:tc>
+          <w:tcPr>
+            <w:tcW w:type="dxa" w:w="1728"/>
+          </w:tcPr>
+          <w:p>
+            <w:r/>
+            <w:r>
+              <w:rPr>
+                <w:b w:val="0"/>
+                <w:sz w:val="16"/>
+              </w:rPr>
+              <w:t>equation_parser_default_v1</w:t>
+            </w:r>
+          </w:p>
+        </w:tc>
+        <w:tc>
+          <w:tcPr>
+            <w:tcW w:type="dxa" w:w="1728"/>
           </w:tcPr>
           <w:p>
             <w:r/>
@@ -4850,7 +4780,7 @@
         </w:tc>
         <w:tc>
           <w:tcPr>
-            <w:tcW w:type="dxa" w:w="2592"/>
+            <w:tcW w:type="dxa" w:w="1728"/>
           </w:tcPr>
           <w:p>
             <w:r/>
@@ -4865,7 +4795,7 @@
         </w:tc>
         <w:tc>
           <w:tcPr>
-            <w:tcW w:type="dxa" w:w="2592"/>
+            <w:tcW w:type="dxa" w:w="1728"/>
           </w:tcPr>
           <w:p>
             <w:r/>
@@ -4882,22 +4812,52 @@
       <w:tr>
         <w:tc>
           <w:tcPr>
-            <w:tcW w:type="dxa" w:w="2592"/>
-          </w:tcPr>
-          <w:p>
-            <w:r/>
-            <w:r>
-              <w:rPr>
-                <w:b w:val="0"/>
-                <w:sz w:val="16"/>
-              </w:rPr>
-              <w:t>qwen2-math:7b / default</w:t>
-            </w:r>
-          </w:p>
-        </w:tc>
-        <w:tc>
-          <w:tcPr>
-            <w:tcW w:type="dxa" w:w="2592"/>
+            <w:tcW w:type="dxa" w:w="1728"/>
+          </w:tcPr>
+          <w:p>
+            <w:r/>
+            <w:r>
+              <w:rPr>
+                <w:b w:val="0"/>
+                <w:sz w:val="16"/>
+              </w:rPr>
+              <w:t>qwen2-math:7b</w:t>
+            </w:r>
+          </w:p>
+        </w:tc>
+        <w:tc>
+          <w:tcPr>
+            <w:tcW w:type="dxa" w:w="1728"/>
+          </w:tcPr>
+          <w:p>
+            <w:r/>
+            <w:r>
+              <w:rPr>
+                <w:b w:val="0"/>
+                <w:sz w:val="16"/>
+              </w:rPr>
+              <w:t>equation_json_default_v1</w:t>
+            </w:r>
+          </w:p>
+        </w:tc>
+        <w:tc>
+          <w:tcPr>
+            <w:tcW w:type="dxa" w:w="1728"/>
+          </w:tcPr>
+          <w:p>
+            <w:r/>
+            <w:r>
+              <w:rPr>
+                <w:b w:val="0"/>
+                <w:sz w:val="16"/>
+              </w:rPr>
+              <w:t>equation_parser_default_v1</w:t>
+            </w:r>
+          </w:p>
+        </w:tc>
+        <w:tc>
+          <w:tcPr>
+            <w:tcW w:type="dxa" w:w="1728"/>
           </w:tcPr>
           <w:p>
             <w:r/>
@@ -4912,7 +4872,7 @@
         </w:tc>
         <w:tc>
           <w:tcPr>
-            <w:tcW w:type="dxa" w:w="2592"/>
+            <w:tcW w:type="dxa" w:w="1728"/>
           </w:tcPr>
           <w:p>
             <w:r/>
@@ -4927,7 +4887,7 @@
         </w:tc>
         <w:tc>
           <w:tcPr>
-            <w:tcW w:type="dxa" w:w="2592"/>
+            <w:tcW w:type="dxa" w:w="1728"/>
           </w:tcPr>
           <w:p>
             <w:r/>
@@ -4944,22 +4904,52 @@
       <w:tr>
         <w:tc>
           <w:tcPr>
-            <w:tcW w:type="dxa" w:w="2592"/>
-          </w:tcPr>
-          <w:p>
-            <w:r/>
-            <w:r>
-              <w:rPr>
-                <w:b w:val="0"/>
-                <w:sz w:val="16"/>
-              </w:rPr>
-              <w:t>qwen2-math:7b / JSON contract</w:t>
-            </w:r>
-          </w:p>
-        </w:tc>
-        <w:tc>
-          <w:tcPr>
-            <w:tcW w:type="dxa" w:w="2592"/>
+            <w:tcW w:type="dxa" w:w="1728"/>
+          </w:tcPr>
+          <w:p>
+            <w:r/>
+            <w:r>
+              <w:rPr>
+                <w:b w:val="0"/>
+                <w:sz w:val="16"/>
+              </w:rPr>
+              <w:t>qwen2-math:7b</w:t>
+            </w:r>
+          </w:p>
+        </w:tc>
+        <w:tc>
+          <w:tcPr>
+            <w:tcW w:type="dxa" w:w="1728"/>
+          </w:tcPr>
+          <w:p>
+            <w:r/>
+            <w:r>
+              <w:rPr>
+                <w:b w:val="0"/>
+                <w:sz w:val="16"/>
+              </w:rPr>
+              <w:t>equation_json_qwen2_v1</w:t>
+            </w:r>
+          </w:p>
+        </w:tc>
+        <w:tc>
+          <w:tcPr>
+            <w:tcW w:type="dxa" w:w="1728"/>
+          </w:tcPr>
+          <w:p>
+            <w:r/>
+            <w:r>
+              <w:rPr>
+                <w:b w:val="0"/>
+                <w:sz w:val="16"/>
+              </w:rPr>
+              <w:t>equation_parser_qwen2_v1</w:t>
+            </w:r>
+          </w:p>
+        </w:tc>
+        <w:tc>
+          <w:tcPr>
+            <w:tcW w:type="dxa" w:w="1728"/>
           </w:tcPr>
           <w:p>
             <w:r/>
@@ -4974,7 +4964,7 @@
         </w:tc>
         <w:tc>
           <w:tcPr>
-            <w:tcW w:type="dxa" w:w="2592"/>
+            <w:tcW w:type="dxa" w:w="1728"/>
           </w:tcPr>
           <w:p>
             <w:r/>
@@ -4989,7 +4979,7 @@
         </w:tc>
         <w:tc>
           <w:tcPr>
-            <w:tcW w:type="dxa" w:w="2592"/>
+            <w:tcW w:type="dxa" w:w="1728"/>
           </w:tcPr>
           <w:p>
             <w:r/>
@@ -5091,7 +5081,7 @@
     </w:p>
     <w:p>
       <w:r>
-        <w:t>Current automated verification: 129/129 tests passing. The immediate research priority is the learned verifier and completion of the pending controlled ablations, not additional web-interface work.</w:t>
+        <w:t>Current automated verification: 130/130 tests passing. The immediate research priority is the learned verifier and completion of the pending controlled ablations, not additional web-interface work.</w:t>
       </w:r>
     </w:p>
     <w:sectPr>

</xml_diff>

<commit_message>
Audit and polish supervisor progress report
</commit_message>
<xml_diff>
--- a/MATHREPAIR_SUPERVISOR_PROGRESS_REPORT.docx
+++ b/MATHREPAIR_SUPERVISOR_PROGRESS_REPORT.docx
@@ -261,106 +261,6 @@
     </w:p>
     <w:p>
       <w:pPr>
-        <w:pStyle w:val="ListBullet"/>
-        <w:numPr>
-          <w:ilvl w:val="0"/>
-          <w:numId w:val="0"/>
-        </w:numPr>
-        <w:spacing w:after="80" w:line="360" w:lineRule="auto"/>
-        <w:ind w:left="360" w:hanging="360"/>
-        <w:rPr>
-          <w:rFonts w:ascii="Times New Roman" w:hAnsi="Times New Roman" w:cs="Times New Roman"/>
-          <w:sz w:val="24"/>
-          <w:szCs w:val="24"/>
-        </w:rPr>
-      </w:pPr>
-    </w:p>
-    <w:p>
-      <w:pPr>
-        <w:pStyle w:val="ListBullet"/>
-        <w:numPr>
-          <w:ilvl w:val="0"/>
-          <w:numId w:val="0"/>
-        </w:numPr>
-        <w:spacing w:after="80" w:line="360" w:lineRule="auto"/>
-        <w:ind w:left="360" w:hanging="360"/>
-        <w:rPr>
-          <w:rFonts w:ascii="Times New Roman" w:hAnsi="Times New Roman" w:cs="Times New Roman"/>
-        </w:rPr>
-      </w:pPr>
-    </w:p>
-    <w:p>
-      <w:pPr>
-        <w:pStyle w:val="ListBullet"/>
-        <w:numPr>
-          <w:ilvl w:val="0"/>
-          <w:numId w:val="0"/>
-        </w:numPr>
-        <w:spacing w:after="80" w:line="360" w:lineRule="auto"/>
-        <w:ind w:left="360" w:hanging="360"/>
-        <w:rPr>
-          <w:rFonts w:ascii="Times New Roman" w:hAnsi="Times New Roman" w:cs="Times New Roman"/>
-        </w:rPr>
-      </w:pPr>
-    </w:p>
-    <w:p>
-      <w:pPr>
-        <w:pStyle w:val="ListBullet"/>
-        <w:numPr>
-          <w:ilvl w:val="0"/>
-          <w:numId w:val="0"/>
-        </w:numPr>
-        <w:spacing w:after="80" w:line="360" w:lineRule="auto"/>
-        <w:ind w:left="360" w:hanging="360"/>
-        <w:rPr>
-          <w:rFonts w:ascii="Times New Roman" w:hAnsi="Times New Roman" w:cs="Times New Roman"/>
-        </w:rPr>
-      </w:pPr>
-    </w:p>
-    <w:p>
-      <w:pPr>
-        <w:pStyle w:val="ListBullet"/>
-        <w:numPr>
-          <w:ilvl w:val="0"/>
-          <w:numId w:val="0"/>
-        </w:numPr>
-        <w:spacing w:after="80" w:line="360" w:lineRule="auto"/>
-        <w:ind w:left="360" w:hanging="360"/>
-        <w:rPr>
-          <w:rFonts w:ascii="Times New Roman" w:hAnsi="Times New Roman" w:cs="Times New Roman"/>
-        </w:rPr>
-      </w:pPr>
-    </w:p>
-    <w:p>
-      <w:pPr>
-        <w:pStyle w:val="ListBullet"/>
-        <w:numPr>
-          <w:ilvl w:val="0"/>
-          <w:numId w:val="0"/>
-        </w:numPr>
-        <w:spacing w:after="80" w:line="360" w:lineRule="auto"/>
-        <w:ind w:left="360" w:hanging="360"/>
-        <w:rPr>
-          <w:rFonts w:ascii="Times New Roman" w:hAnsi="Times New Roman" w:cs="Times New Roman"/>
-        </w:rPr>
-      </w:pPr>
-    </w:p>
-    <w:p>
-      <w:pPr>
-        <w:pStyle w:val="ListBullet"/>
-        <w:numPr>
-          <w:ilvl w:val="0"/>
-          <w:numId w:val="0"/>
-        </w:numPr>
-        <w:spacing w:after="80" w:line="360" w:lineRule="auto"/>
-        <w:ind w:left="360" w:hanging="360"/>
-        <w:rPr>
-          <w:rFonts w:ascii="Times New Roman" w:hAnsi="Times New Roman" w:cs="Times New Roman"/>
-        </w:rPr>
-      </w:pPr>
-    </w:p>
-    <w:p>
-      <w:pPr>
         <w:pStyle w:val="Heading1"/>
         <w:spacing w:line="360" w:lineRule="auto"/>
         <w:rPr>
@@ -386,12 +286,7 @@
         </w:rPr>
       </w:pPr>
       <w:r>
-        <w:rPr>
-          <w:rFonts w:ascii="Times New Roman" w:hAnsi="Times New Roman" w:cs="Times New Roman"/>
-          <w:sz w:val="24"/>
-          <w:szCs w:val="24"/>
-        </w:rPr>
-        <w:t>The implemented pipeline consists of model generation, equation extraction, reasoning-state construction, symbolic verification, first-error localization, typed repair selection, local regeneration, and final re-verification. Repairs are accepted only when the symbolic verifier validates them.</w:t>
+        <w:t>The implemented pipeline consists of model generation, equation extraction, reasoning-state construction, symbolic verification, first-error localization, typed repair selection, local regeneration, and final re-verification. For currently supported equation-mode problems, repair candidates are accepted only after symbolic validation; the open-ended MATH-500 pilot remains text_unverified.</w:t>
       </w:r>
     </w:p>
     <w:tbl>
@@ -779,72 +674,6 @@
       <w:r>
         <w:t>For the pipeline demonstration 2(x + 3) = 14, n1 stores the problem state, n2 stores the model's invalid 2x + 3 = 14 transformation, and n3-n4 are affected descendants. The graph records REFORMALIZE, the repaired state 2x + 6 = 14, recomputed x = 4, and final node statuses. A separate branching fixture retains an independent valid branch to test selective descendant propagation and zero allocation to unaffected nodes.</w:t>
       </w:r>
-    </w:p>
-    <w:p>
-      <w:pPr>
-        <w:spacing w:line="360" w:lineRule="auto"/>
-        <w:jc w:val="both"/>
-        <w:rPr>
-          <w:rFonts w:ascii="Times New Roman" w:hAnsi="Times New Roman" w:cs="Times New Roman"/>
-          <w:sz w:val="24"/>
-          <w:szCs w:val="24"/>
-        </w:rPr>
-      </w:pPr>
-    </w:p>
-    <w:p>
-      <w:pPr>
-        <w:spacing w:line="360" w:lineRule="auto"/>
-        <w:jc w:val="both"/>
-        <w:rPr>
-          <w:rFonts w:ascii="Times New Roman" w:hAnsi="Times New Roman" w:cs="Times New Roman"/>
-          <w:sz w:val="24"/>
-          <w:szCs w:val="24"/>
-        </w:rPr>
-      </w:pPr>
-    </w:p>
-    <w:p>
-      <w:pPr>
-        <w:spacing w:line="360" w:lineRule="auto"/>
-        <w:jc w:val="both"/>
-        <w:rPr>
-          <w:rFonts w:ascii="Times New Roman" w:hAnsi="Times New Roman" w:cs="Times New Roman"/>
-          <w:sz w:val="24"/>
-          <w:szCs w:val="24"/>
-        </w:rPr>
-      </w:pPr>
-    </w:p>
-    <w:p>
-      <w:pPr>
-        <w:spacing w:line="360" w:lineRule="auto"/>
-        <w:jc w:val="both"/>
-        <w:rPr>
-          <w:rFonts w:ascii="Times New Roman" w:hAnsi="Times New Roman" w:cs="Times New Roman"/>
-          <w:sz w:val="24"/>
-          <w:szCs w:val="24"/>
-        </w:rPr>
-      </w:pPr>
-    </w:p>
-    <w:p>
-      <w:pPr>
-        <w:spacing w:line="360" w:lineRule="auto"/>
-        <w:jc w:val="both"/>
-        <w:rPr>
-          <w:rFonts w:ascii="Times New Roman" w:hAnsi="Times New Roman" w:cs="Times New Roman"/>
-          <w:sz w:val="24"/>
-          <w:szCs w:val="24"/>
-        </w:rPr>
-      </w:pPr>
-    </w:p>
-    <w:p>
-      <w:pPr>
-        <w:spacing w:line="360" w:lineRule="auto"/>
-        <w:jc w:val="both"/>
-        <w:rPr>
-          <w:rFonts w:ascii="Times New Roman" w:hAnsi="Times New Roman" w:cs="Times New Roman"/>
-          <w:sz w:val="24"/>
-          <w:szCs w:val="24"/>
-        </w:rPr>
-      </w:pPr>
     </w:p>
     <w:p>
       <w:pPr>
@@ -1806,16 +1635,6 @@
     <w:p>
       <w:pPr>
         <w:spacing w:line="360" w:lineRule="auto"/>
-        <w:rPr>
-          <w:rFonts w:ascii="Times New Roman" w:hAnsi="Times New Roman" w:cs="Times New Roman"/>
-          <w:sz w:val="24"/>
-          <w:szCs w:val="24"/>
-        </w:rPr>
-      </w:pPr>
-    </w:p>
-    <w:p>
-      <w:pPr>
-        <w:spacing w:line="360" w:lineRule="auto"/>
         <w:ind w:left="-90"/>
         <w:rPr>
           <w:rFonts w:ascii="Times New Roman" w:hAnsi="Times New Roman" w:cs="Times New Roman"/>
@@ -1824,7 +1643,7 @@
         </w:rPr>
       </w:pPr>
       <w:r>
-        <w:t>The paired local-minus-global answer difference was +7.4 percentage points (100% - 92.6%), with a 95% confidence interval of [+3.4, +11.4]. Across the expanded trials, 13 invalid traces were detected: 12 algebraic-transformation errors and 1 arithmetic error. All 13 repairs were accepted, 10 wrong answers were corrected, and no answer regressions occurred.</w:t>
+        <w:t>The paired local-minus-global answer difference was +7.4 percentage points (100% - 92.6%), with a paired 95% Student-t confidence interval of [+3.4, +11.4] across three seed-level trials. The interval reflects seed variation on the same 36 problems, not problem-sampling uncertainty. Across the expanded trials, 13 invalid traces were detected: 12 algebraic-transformation errors and 1 arithmetic error. All 13 repairs were accepted, 10 wrong answers were corrected, and no answer regressions occurred.</w:t>
       </w:r>
     </w:p>
     <w:p>
@@ -2925,6 +2744,16 @@
       </w:r>
     </w:p>
     <w:p>
+      <w:r>
+        <w:t>Primary Tasks 1-7 terminal walkthrough: python show_experiments.py</w:t>
+      </w:r>
+    </w:p>
+    <w:p>
+      <w:r>
+        <w:t>Live graph-integrated model trace (requires Ollama and the installed model): python model_pipeline.py --provider ollama --model qwen2-math:1.5b --problem "2(x + 3) = 14"</w:t>
+      </w:r>
+    </w:p>
+    <w:p>
       <w:pPr>
         <w:spacing w:line="360" w:lineRule="auto"/>
         <w:ind w:left="360"/>
@@ -3094,27 +2923,6 @@
           <w:szCs w:val="24"/>
         </w:rPr>
       </w:pPr>
-    </w:p>
-    <w:p>
-      <w:pPr>
-        <w:spacing w:line="360" w:lineRule="auto"/>
-        <w:rPr>
-          <w:rFonts w:ascii="Times New Roman" w:hAnsi="Times New Roman" w:cs="Times New Roman"/>
-          <w:sz w:val="24"/>
-          <w:szCs w:val="24"/>
-        </w:rPr>
-      </w:pPr>
-    </w:p>
-    <w:p>
-      <w:pPr>
-        <w:spacing w:line="360" w:lineRule="auto"/>
-        <w:ind w:left="360"/>
-        <w:rPr>
-          <w:rFonts w:ascii="Times New Roman" w:hAnsi="Times New Roman" w:cs="Times New Roman"/>
-          <w:sz w:val="24"/>
-          <w:szCs w:val="24"/>
-        </w:rPr>
-      </w:pPr>
       <w:r>
         <w:rPr>
           <w:rFonts w:ascii="Times New Roman" w:hAnsi="Times New Roman" w:cs="Times New Roman"/>
@@ -3262,17 +3070,6 @@
           <w:szCs w:val="24"/>
         </w:rPr>
       </w:pPr>
-    </w:p>
-    <w:p>
-      <w:pPr>
-        <w:spacing w:line="360" w:lineRule="auto"/>
-        <w:ind w:left="360"/>
-        <w:rPr>
-          <w:rFonts w:ascii="Times New Roman" w:hAnsi="Times New Roman" w:cs="Times New Roman"/>
-          <w:sz w:val="24"/>
-          <w:szCs w:val="24"/>
-        </w:rPr>
-      </w:pPr>
       <w:r>
         <w:rPr>
           <w:rFonts w:ascii="Times New Roman" w:hAnsi="Times New Roman" w:cs="Times New Roman"/>
@@ -3358,14 +3155,6 @@
     <w:p>
       <w:pPr>
         <w:spacing w:line="360" w:lineRule="auto"/>
-        <w:rPr>
-          <w:rFonts w:ascii="Times New Roman" w:hAnsi="Times New Roman" w:cs="Times New Roman"/>
-        </w:rPr>
-      </w:pPr>
-    </w:p>
-    <w:p>
-      <w:pPr>
-        <w:spacing w:line="360" w:lineRule="auto"/>
         <w:jc w:val="center"/>
         <w:rPr>
           <w:rFonts w:ascii="Times New Roman" w:hAnsi="Times New Roman" w:cs="Times New Roman"/>
@@ -3374,32 +3163,7 @@
         </w:rPr>
       </w:pPr>
       <w:r>
-        <w:rPr>
-          <w:rFonts w:ascii="Times New Roman" w:hAnsi="Times New Roman" w:cs="Times New Roman"/>
-          <w:b/>
-          <w:color w:val="087E8B"/>
-          <w:sz w:val="24"/>
-          <w:szCs w:val="24"/>
-        </w:rPr>
-        <w:t>Conclusion: the pilot supports continuing to the full proposal-scale evaluation, while keeping current claims limited to the tested algebra setting.</w:t>
-      </w:r>
-      <w:r>
-        <w:br w:type="page"/>
-      </w:r>
-    </w:p>
-    <w:p>
-      <w:r>
-        <w:br w:type="page"/>
-      </w:r>
-    </w:p>
-    <w:p>
-      <w:r>
-        <w:br w:type="page"/>
-      </w:r>
-    </w:p>
-    <w:p>
-      <w:r>
-        <w:br w:type="page"/>
+        <w:t>Conclusion: Tasks 1-7 establish the proposal-level infrastructure and reproducible pilot evidence. Current performance claims remain preliminary: the expanded accuracy result is limited to algebra, the MATH-500 run is processing-only, and the learned verifier and three ablation cells remain deferred.</w:t>
       </w:r>
     </w:p>
     <w:p>
@@ -3613,7 +3377,7 @@
                 <w:b w:val="0"/>
                 <w:sz w:val="16"/>
               </w:rPr>
-              <w:t>math500_pilot_40_manifest.json</w:t>
+              <w:t>math500_pilot_40_manifest.json; math500_pilot_run.json</w:t>
             </w:r>
           </w:p>
         </w:tc>

</xml_diff>

<commit_message>
Update experiment headings and supervisor progress report
</commit_message>
<xml_diff>
--- a/MATHREPAIR_SUPERVISOR_PROGRESS_REPORT.docx
+++ b/MATHREPAIR_SUPERVISOR_PROGRESS_REPORT.docx
@@ -271,7 +271,6 @@
         <w:rPr>
           <w:rFonts w:ascii="Times New Roman" w:hAnsi="Times New Roman" w:cs="Times New Roman"/>
         </w:rPr>
-        <w:lastRenderedPageBreak/>
         <w:t>3. Implemented System</w:t>
       </w:r>
     </w:p>
@@ -324,6 +323,7 @@
                 <w:sz w:val="24"/>
                 <w:szCs w:val="24"/>
               </w:rPr>
+              <w:lastRenderedPageBreak/>
               <w:t>Component</w:t>
             </w:r>
           </w:p>
@@ -360,13 +360,11 @@
       <w:tr>
         <w:tc>
           <w:tcPr>
-            <w:tcW w:type="dxa" w:w="2088"/>
-          </w:tcPr>
-          <w:p>
-            <w:r/>
-            <w:r>
-              <w:rPr>
-                <w:b w:val="0"/>
+            <w:tcW w:w="2088" w:type="dxa"/>
+          </w:tcPr>
+          <w:p>
+            <w:r>
+              <w:rPr>
                 <w:sz w:val="16"/>
               </w:rPr>
               <w:t>Symbolic verifier</w:t>
@@ -375,13 +373,11 @@
         </w:tc>
         <w:tc>
           <w:tcPr>
-            <w:tcW w:type="dxa" w:w="7906"/>
-          </w:tcPr>
-          <w:p>
-            <w:r/>
-            <w:r>
-              <w:rPr>
-                <w:b w:val="0"/>
+            <w:tcW w:w="7906" w:type="dxa"/>
+          </w:tcPr>
+          <w:p>
+            <w:r>
+              <w:rPr>
                 <w:sz w:val="16"/>
               </w:rPr>
               <w:t>Rule-based equation equivalence, supporting identities, arithmetic, sign, and algebraic-transformation checks; learned verifier remains deferred.</w:t>
@@ -392,13 +388,11 @@
       <w:tr>
         <w:tc>
           <w:tcPr>
-            <w:tcW w:type="dxa" w:w="2088"/>
-          </w:tcPr>
-          <w:p>
-            <w:r/>
-            <w:r>
-              <w:rPr>
-                <w:b w:val="0"/>
+            <w:tcW w:w="2088" w:type="dxa"/>
+          </w:tcPr>
+          <w:p>
+            <w:r>
+              <w:rPr>
                 <w:sz w:val="16"/>
               </w:rPr>
               <w:t>Typed-error taxonomy</w:t>
@@ -407,13 +401,11 @@
         </w:tc>
         <w:tc>
           <w:tcPr>
-            <w:tcW w:type="dxa" w:w="7906"/>
-          </w:tcPr>
-          <w:p>
-            <w:r/>
-            <w:r>
-              <w:rPr>
-                <w:b w:val="0"/>
+            <w:tcW w:w="7906" w:type="dxa"/>
+          </w:tcPr>
+          <w:p>
+            <w:r>
+              <w:rPr>
                 <w:sz w:val="16"/>
               </w:rPr>
               <w:t>Eight frozen supervision labels with definitions, examples, detection contracts, and allowed repair actions.</w:t>
@@ -424,13 +416,11 @@
       <w:tr>
         <w:tc>
           <w:tcPr>
-            <w:tcW w:type="dxa" w:w="2088"/>
-          </w:tcPr>
-          <w:p>
-            <w:r/>
-            <w:r>
-              <w:rPr>
-                <w:b w:val="0"/>
+            <w:tcW w:w="2088" w:type="dxa"/>
+          </w:tcPr>
+          <w:p>
+            <w:r>
+              <w:rPr>
                 <w:sz w:val="16"/>
               </w:rPr>
               <w:t>Reasoning graph</w:t>
@@ -439,13 +429,11 @@
         </w:tc>
         <w:tc>
           <w:tcPr>
-            <w:tcW w:type="dxa" w:w="7906"/>
-          </w:tcPr>
-          <w:p>
-            <w:r/>
-            <w:r>
-              <w:rPr>
-                <w:b w:val="0"/>
+            <w:tcW w:w="7906" w:type="dxa"/>
+          </w:tcPr>
+          <w:p>
+            <w:r>
+              <w:rPr>
                 <w:sz w:val="16"/>
               </w:rPr>
               <w:t>The model pipeline's internal representation, recording node state, parents, model reasoning, verification, affected descendants, repair, repaired state, and final status.</w:t>
@@ -456,13 +444,11 @@
       <w:tr>
         <w:tc>
           <w:tcPr>
-            <w:tcW w:type="dxa" w:w="2088"/>
-          </w:tcPr>
-          <w:p>
-            <w:r/>
-            <w:r>
-              <w:rPr>
-                <w:b w:val="0"/>
+            <w:tcW w:w="2088" w:type="dxa"/>
+          </w:tcPr>
+          <w:p>
+            <w:r>
+              <w:rPr>
                 <w:sz w:val="16"/>
               </w:rPr>
               <w:t>Repair policy</w:t>
@@ -471,13 +457,11 @@
         </w:tc>
         <w:tc>
           <w:tcPr>
-            <w:tcW w:type="dxa" w:w="7906"/>
-          </w:tcPr>
-          <w:p>
-            <w:r/>
-            <w:r>
-              <w:rPr>
-                <w:b w:val="0"/>
+            <w:tcW w:w="7906" w:type="dxa"/>
+          </w:tcPr>
+          <w:p>
+            <w:r>
+              <w:rPr>
                 <w:sz w:val="16"/>
               </w:rPr>
               <w:t>TOOL_EXECUTE, BACKTRACK, REFORMALIZE, LOCAL_RESAMPLE, REPLAN, and CONTINUE actions.</w:t>
@@ -488,13 +472,11 @@
       <w:tr>
         <w:tc>
           <w:tcPr>
-            <w:tcW w:type="dxa" w:w="2088"/>
-          </w:tcPr>
-          <w:p>
-            <w:r/>
-            <w:r>
-              <w:rPr>
-                <w:b w:val="0"/>
+            <w:tcW w:w="2088" w:type="dxa"/>
+          </w:tcPr>
+          <w:p>
+            <w:r>
+              <w:rPr>
                 <w:sz w:val="16"/>
               </w:rPr>
               <w:t>Local repair</w:t>
@@ -503,13 +485,11 @@
         </w:tc>
         <w:tc>
           <w:tcPr>
-            <w:tcW w:type="dxa" w:w="7906"/>
-          </w:tcPr>
-          <w:p>
-            <w:r/>
-            <w:r>
-              <w:rPr>
-                <w:b w:val="0"/>
+            <w:tcW w:w="7906" w:type="dxa"/>
+          </w:tcPr>
+          <w:p>
+            <w:r>
+              <w:rPr>
                 <w:sz w:val="16"/>
               </w:rPr>
               <w:t>Preserves the verified prefix, regenerates the affected suffix, and writes accepted repairs back to graph nodes.</w:t>
@@ -520,13 +500,11 @@
       <w:tr>
         <w:tc>
           <w:tcPr>
-            <w:tcW w:type="dxa" w:w="2088"/>
-          </w:tcPr>
-          <w:p>
-            <w:r/>
-            <w:r>
-              <w:rPr>
-                <w:b w:val="0"/>
+            <w:tcW w:w="2088" w:type="dxa"/>
+          </w:tcPr>
+          <w:p>
+            <w:r>
+              <w:rPr>
                 <w:sz w:val="16"/>
               </w:rPr>
               <w:t>Adaptive compute</w:t>
@@ -535,13 +513,11 @@
         </w:tc>
         <w:tc>
           <w:tcPr>
-            <w:tcW w:type="dxa" w:w="7906"/>
-          </w:tcPr>
-          <w:p>
-            <w:r/>
-            <w:r>
-              <w:rPr>
-                <w:b w:val="0"/>
+            <w:tcW w:w="7906" w:type="dxa"/>
+          </w:tcPr>
+          <w:p>
+            <w:r>
+              <w:rPr>
                 <w:sz w:val="16"/>
               </w:rPr>
               <w:t>Heuristic risk allocation plus measured uniform-local and adaptive-local arms under a shared token ceiling.</w:t>
@@ -552,13 +528,11 @@
       <w:tr>
         <w:tc>
           <w:tcPr>
-            <w:tcW w:type="dxa" w:w="2088"/>
-          </w:tcPr>
-          <w:p>
-            <w:r/>
-            <w:r>
-              <w:rPr>
-                <w:b w:val="0"/>
+            <w:tcW w:w="2088" w:type="dxa"/>
+          </w:tcPr>
+          <w:p>
+            <w:r>
+              <w:rPr>
                 <w:sz w:val="16"/>
               </w:rPr>
               <w:t>Benchmark and supervision data</w:t>
@@ -567,13 +541,11 @@
         </w:tc>
         <w:tc>
           <w:tcPr>
-            <w:tcW w:type="dxa" w:w="7906"/>
-          </w:tcPr>
-          <w:p>
-            <w:r/>
-            <w:r>
-              <w:rPr>
-                <w:b w:val="0"/>
+            <w:tcW w:w="7906" w:type="dxa"/>
+          </w:tcPr>
+          <w:p>
+            <w:r>
+              <w:rPr>
                 <w:sz w:val="16"/>
               </w:rPr>
               <w:t>A 40-problem MATH-500 hard pilot and 48 controlled typed-verifier training examples.</w:t>
@@ -584,13 +556,11 @@
       <w:tr>
         <w:tc>
           <w:tcPr>
-            <w:tcW w:type="dxa" w:w="2088"/>
-          </w:tcPr>
-          <w:p>
-            <w:r/>
-            <w:r>
-              <w:rPr>
-                <w:b w:val="0"/>
+            <w:tcW w:w="2088" w:type="dxa"/>
+          </w:tcPr>
+          <w:p>
+            <w:r>
+              <w:rPr>
                 <w:sz w:val="16"/>
               </w:rPr>
               <w:t>Experiment evidence</w:t>
@@ -599,13 +569,11 @@
         </w:tc>
         <w:tc>
           <w:tcPr>
-            <w:tcW w:type="dxa" w:w="7906"/>
-          </w:tcPr>
-          <w:p>
-            <w:r/>
-            <w:r>
-              <w:rPr>
-                <w:b w:val="0"/>
+            <w:tcW w:w="7906" w:type="dxa"/>
+          </w:tcPr>
+          <w:p>
+            <w:r>
+              <w:rPr>
                 <w:sz w:val="16"/>
               </w:rPr>
               <w:t>Matched-budget reports, a six-row ablation matrix, versioned output contracts, raw outputs, and artifact hashes.</w:t>
@@ -616,13 +584,11 @@
       <w:tr>
         <w:tc>
           <w:tcPr>
-            <w:tcW w:type="dxa" w:w="2088"/>
-          </w:tcPr>
-          <w:p>
-            <w:r/>
-            <w:r>
-              <w:rPr>
-                <w:b w:val="0"/>
+            <w:tcW w:w="2088" w:type="dxa"/>
+          </w:tcPr>
+          <w:p>
+            <w:r>
+              <w:rPr>
                 <w:sz w:val="16"/>
               </w:rPr>
               <w:t>Web demo</w:t>
@@ -631,13 +597,11 @@
         </w:tc>
         <w:tc>
           <w:tcPr>
-            <w:tcW w:type="dxa" w:w="7906"/>
-          </w:tcPr>
-          <w:p>
-            <w:r/>
-            <w:r>
-              <w:rPr>
-                <w:b w:val="0"/>
+            <w:tcW w:w="7906" w:type="dxa"/>
+          </w:tcPr>
+          <w:p>
+            <w:r>
+              <w:rPr>
                 <w:sz w:val="16"/>
               </w:rPr>
               <w:t>Retained as a secondary interactive graph view; methodology and experiments are the current priority.</w:t>
@@ -688,7 +652,6 @@
       </w:r>
     </w:p>
     <w:p>
-      <w:pPr/>
       <w:r>
         <w:t>The report contains two complementary experimental protocols. They use different budget definitions and must not be pooled into one performance claim.</w:t>
       </w:r>
@@ -704,8 +667,8 @@
     <w:tbl>
       <w:tblPr>
         <w:tblStyle w:val="TableGrid"/>
-        <w:tblW w:type="auto" w:w="0"/>
-        <w:tblLook w:firstColumn="1" w:firstRow="1" w:lastColumn="0" w:lastRow="0" w:noHBand="0" w:noVBand="1" w:val="04A0"/>
+        <w:tblW w:w="0" w:type="auto"/>
+        <w:tblLook w:val="04A0" w:firstRow="1" w:lastRow="0" w:firstColumn="1" w:lastColumn="0" w:noHBand="0" w:noVBand="1"/>
       </w:tblPr>
       <w:tblGrid>
         <w:gridCol w:w="5184"/>
@@ -714,10 +677,9 @@
       <w:tr>
         <w:tc>
           <w:tcPr>
-            <w:tcW w:type="dxa" w:w="5184"/>
-          </w:tcPr>
-          <w:p>
-            <w:r/>
+            <w:tcW w:w="5184" w:type="dxa"/>
+          </w:tcPr>
+          <w:p>
             <w:r>
               <w:rPr>
                 <w:b/>
@@ -729,10 +691,9 @@
         </w:tc>
         <w:tc>
           <w:tcPr>
-            <w:tcW w:type="dxa" w:w="5184"/>
-          </w:tcPr>
-          <w:p>
-            <w:r/>
+            <w:tcW w:w="5184" w:type="dxa"/>
+          </w:tcPr>
+          <w:p>
             <w:r>
               <w:rPr>
                 <w:b/>
@@ -746,13 +707,11 @@
       <w:tr>
         <w:tc>
           <w:tcPr>
-            <w:tcW w:type="dxa" w:w="5184"/>
-          </w:tcPr>
-          <w:p>
-            <w:r/>
-            <w:r>
-              <w:rPr>
-                <w:b w:val="0"/>
+            <w:tcW w:w="5184" w:type="dxa"/>
+          </w:tcPr>
+          <w:p>
+            <w:r>
+              <w:rPr>
                 <w:sz w:val="16"/>
               </w:rPr>
               <w:t>Purpose</w:t>
@@ -761,13 +720,11 @@
         </w:tc>
         <w:tc>
           <w:tcPr>
-            <w:tcW w:type="dxa" w:w="5184"/>
-          </w:tcPr>
-          <w:p>
-            <w:r/>
-            <w:r>
-              <w:rPr>
-                <w:b w:val="0"/>
+            <w:tcW w:w="5184" w:type="dxa"/>
+          </w:tcPr>
+          <w:p>
+            <w:r>
+              <w:rPr>
                 <w:sz w:val="16"/>
               </w:rPr>
               <w:t>Earlier evidence for local versus global repair on symbolic algebra.</w:t>
@@ -778,13 +735,11 @@
       <w:tr>
         <w:tc>
           <w:tcPr>
-            <w:tcW w:type="dxa" w:w="5184"/>
-          </w:tcPr>
-          <w:p>
-            <w:r/>
-            <w:r>
-              <w:rPr>
-                <w:b w:val="0"/>
+            <w:tcW w:w="5184" w:type="dxa"/>
+          </w:tcPr>
+          <w:p>
+            <w:r>
+              <w:rPr>
                 <w:sz w:val="16"/>
               </w:rPr>
               <w:t>Model</w:t>
@@ -793,13 +748,11 @@
         </w:tc>
         <w:tc>
           <w:tcPr>
-            <w:tcW w:type="dxa" w:w="5184"/>
-          </w:tcPr>
-          <w:p>
-            <w:r/>
-            <w:r>
-              <w:rPr>
-                <w:b w:val="0"/>
+            <w:tcW w:w="5184" w:type="dxa"/>
+          </w:tcPr>
+          <w:p>
+            <w:r>
+              <w:rPr>
                 <w:sz w:val="16"/>
               </w:rPr>
               <w:t>qwen2-math:1.5b through the local Ollama API.</w:t>
@@ -810,13 +763,11 @@
       <w:tr>
         <w:tc>
           <w:tcPr>
-            <w:tcW w:type="dxa" w:w="5184"/>
-          </w:tcPr>
-          <w:p>
-            <w:r/>
-            <w:r>
-              <w:rPr>
-                <w:b w:val="0"/>
+            <w:tcW w:w="5184" w:type="dxa"/>
+          </w:tcPr>
+          <w:p>
+            <w:r>
+              <w:rPr>
                 <w:sz w:val="16"/>
               </w:rPr>
               <w:t>Dataset</w:t>
@@ -825,13 +776,11 @@
         </w:tc>
         <w:tc>
           <w:tcPr>
-            <w:tcW w:type="dxa" w:w="5184"/>
-          </w:tcPr>
-          <w:p>
-            <w:r/>
-            <w:r>
-              <w:rPr>
-                <w:b w:val="0"/>
+            <w:tcW w:w="5184" w:type="dxa"/>
+          </w:tcPr>
+          <w:p>
+            <w:r>
+              <w:rPr>
                 <w:sz w:val="16"/>
               </w:rPr>
               <w:t>36 algebra problems: 18 earlier held-out and 18 new.</w:t>
@@ -842,13 +791,11 @@
       <w:tr>
         <w:tc>
           <w:tcPr>
-            <w:tcW w:type="dxa" w:w="5184"/>
-          </w:tcPr>
-          <w:p>
-            <w:r/>
-            <w:r>
-              <w:rPr>
-                <w:b w:val="0"/>
+            <w:tcW w:w="5184" w:type="dxa"/>
+          </w:tcPr>
+          <w:p>
+            <w:r>
+              <w:rPr>
                 <w:sz w:val="16"/>
               </w:rPr>
               <w:t>Trials</w:t>
@@ -857,13 +804,11 @@
         </w:tc>
         <w:tc>
           <w:tcPr>
-            <w:tcW w:type="dxa" w:w="5184"/>
-          </w:tcPr>
-          <w:p>
-            <w:r/>
-            <w:r>
-              <w:rPr>
-                <w:b w:val="0"/>
+            <w:tcW w:w="5184" w:type="dxa"/>
+          </w:tcPr>
+          <w:p>
+            <w:r>
+              <w:rPr>
                 <w:sz w:val="16"/>
               </w:rPr>
               <w:t>Three seeds and 36 runs per seed; 108 completed runs.</w:t>
@@ -874,13 +819,11 @@
       <w:tr>
         <w:tc>
           <w:tcPr>
-            <w:tcW w:type="dxa" w:w="5184"/>
-          </w:tcPr>
-          <w:p>
-            <w:r/>
-            <w:r>
-              <w:rPr>
-                <w:b w:val="0"/>
+            <w:tcW w:w="5184" w:type="dxa"/>
+          </w:tcPr>
+          <w:p>
+            <w:r>
+              <w:rPr>
                 <w:sz w:val="16"/>
               </w:rPr>
               <w:t>Strategies</w:t>
@@ -889,13 +832,11 @@
         </w:tc>
         <w:tc>
           <w:tcPr>
-            <w:tcW w:type="dxa" w:w="5184"/>
-          </w:tcPr>
-          <w:p>
-            <w:r/>
-            <w:r>
-              <w:rPr>
-                <w:b w:val="0"/>
+            <w:tcW w:w="5184" w:type="dxa"/>
+          </w:tcPr>
+          <w:p>
+            <w:r>
+              <w:rPr>
                 <w:sz w:val="16"/>
               </w:rPr>
               <w:t>No repair, verified global regeneration, and verified local repair.</w:t>
@@ -906,13 +847,11 @@
       <w:tr>
         <w:tc>
           <w:tcPr>
-            <w:tcW w:type="dxa" w:w="5184"/>
-          </w:tcPr>
-          <w:p>
-            <w:r/>
-            <w:r>
-              <w:rPr>
-                <w:b w:val="0"/>
+            <w:tcW w:w="5184" w:type="dxa"/>
+          </w:tcPr>
+          <w:p>
+            <w:r>
+              <w:rPr>
                 <w:sz w:val="16"/>
               </w:rPr>
               <w:t>Budget</w:t>
@@ -921,13 +860,11 @@
         </w:tc>
         <w:tc>
           <w:tcPr>
-            <w:tcW w:type="dxa" w:w="5184"/>
-          </w:tcPr>
-          <w:p>
-            <w:r/>
-            <w:r>
-              <w:rPr>
-                <w:b w:val="0"/>
+            <w:tcW w:w="5184" w:type="dxa"/>
+          </w:tcPr>
+          <w:p>
+            <w:r>
+              <w:rPr>
                 <w:sz w:val="16"/>
               </w:rPr>
               <w:t>Matched per detected-error case under the earlier protocol.</w:t>
@@ -938,13 +875,11 @@
       <w:tr>
         <w:tc>
           <w:tcPr>
-            <w:tcW w:type="dxa" w:w="5184"/>
-          </w:tcPr>
-          <w:p>
-            <w:r/>
-            <w:r>
-              <w:rPr>
-                <w:b w:val="0"/>
+            <w:tcW w:w="5184" w:type="dxa"/>
+          </w:tcPr>
+          <w:p>
+            <w:r>
+              <w:rPr>
                 <w:sz w:val="16"/>
               </w:rPr>
               <w:t>Metrics</w:t>
@@ -953,13 +888,11 @@
         </w:tc>
         <w:tc>
           <w:tcPr>
-            <w:tcW w:type="dxa" w:w="5184"/>
-          </w:tcPr>
-          <w:p>
-            <w:r/>
-            <w:r>
-              <w:rPr>
-                <w:b w:val="0"/>
+            <w:tcW w:w="5184" w:type="dxa"/>
+          </w:tcPr>
+          <w:p>
+            <w:r>
+              <w:rPr>
                 <w:sz w:val="16"/>
               </w:rPr>
               <w:t>Answer accuracy, valid-trace rate, calls, tokens, and paired confidence intervals.</w:t>
@@ -979,8 +912,8 @@
     <w:tbl>
       <w:tblPr>
         <w:tblStyle w:val="TableGrid"/>
-        <w:tblW w:type="auto" w:w="0"/>
-        <w:tblLook w:firstColumn="1" w:firstRow="1" w:lastColumn="0" w:lastRow="0" w:noHBand="0" w:noVBand="1" w:val="04A0"/>
+        <w:tblW w:w="0" w:type="auto"/>
+        <w:tblLook w:val="04A0" w:firstRow="1" w:lastRow="0" w:firstColumn="1" w:lastColumn="0" w:noHBand="0" w:noVBand="1"/>
       </w:tblPr>
       <w:tblGrid>
         <w:gridCol w:w="5184"/>
@@ -989,10 +922,9 @@
       <w:tr>
         <w:tc>
           <w:tcPr>
-            <w:tcW w:type="dxa" w:w="5184"/>
-          </w:tcPr>
-          <w:p>
-            <w:r/>
+            <w:tcW w:w="5184" w:type="dxa"/>
+          </w:tcPr>
+          <w:p>
             <w:r>
               <w:rPr>
                 <w:b/>
@@ -1004,10 +936,9 @@
         </w:tc>
         <w:tc>
           <w:tcPr>
-            <w:tcW w:type="dxa" w:w="5184"/>
-          </w:tcPr>
-          <w:p>
-            <w:r/>
+            <w:tcW w:w="5184" w:type="dxa"/>
+          </w:tcPr>
+          <w:p>
             <w:r>
               <w:rPr>
                 <w:b/>
@@ -1021,13 +952,11 @@
       <w:tr>
         <w:tc>
           <w:tcPr>
-            <w:tcW w:type="dxa" w:w="5184"/>
-          </w:tcPr>
-          <w:p>
-            <w:r/>
-            <w:r>
-              <w:rPr>
-                <w:b w:val="0"/>
+            <w:tcW w:w="5184" w:type="dxa"/>
+          </w:tcPr>
+          <w:p>
+            <w:r>
+              <w:rPr>
                 <w:sz w:val="16"/>
               </w:rPr>
               <w:t>Internal representation</w:t>
@@ -1036,13 +965,11 @@
         </w:tc>
         <w:tc>
           <w:tcPr>
-            <w:tcW w:type="dxa" w:w="5184"/>
-          </w:tcPr>
-          <w:p>
-            <w:r/>
-            <w:r>
-              <w:rPr>
-                <w:b w:val="0"/>
+            <w:tcW w:w="5184" w:type="dxa"/>
+          </w:tcPr>
+          <w:p>
+            <w:r>
+              <w:rPr>
                 <w:sz w:val="16"/>
               </w:rPr>
               <w:t>Model traces are verified and repaired as reasoning graphs with node state, parents, error impact, repair, and final status.</w:t>
@@ -1053,28 +980,25 @@
       <w:tr>
         <w:tc>
           <w:tcPr>
-            <w:tcW w:type="dxa" w:w="5184"/>
-          </w:tcPr>
-          <w:p>
-            <w:r/>
-            <w:r>
-              <w:rPr>
-                <w:b w:val="0"/>
-                <w:sz w:val="16"/>
-              </w:rPr>
+            <w:tcW w:w="5184" w:type="dxa"/>
+          </w:tcPr>
+          <w:p>
+            <w:r>
+              <w:rPr>
+                <w:sz w:val="16"/>
+              </w:rPr>
+              <w:lastRenderedPageBreak/>
               <w:t>Hard pilot</w:t>
             </w:r>
           </w:p>
         </w:tc>
         <w:tc>
           <w:tcPr>
-            <w:tcW w:type="dxa" w:w="5184"/>
-          </w:tcPr>
-          <w:p>
-            <w:r/>
-            <w:r>
-              <w:rPr>
-                <w:b w:val="0"/>
+            <w:tcW w:w="5184" w:type="dxa"/>
+          </w:tcPr>
+          <w:p>
+            <w:r>
+              <w:rPr>
                 <w:sz w:val="16"/>
               </w:rPr>
               <w:t>A deterministic 40-problem MATH-500 subset: 17 level-4 and 23 level-5 problems across seven subjects; processing check only.</w:t>
@@ -1085,13 +1009,11 @@
       <w:tr>
         <w:tc>
           <w:tcPr>
-            <w:tcW w:type="dxa" w:w="5184"/>
-          </w:tcPr>
-          <w:p>
-            <w:r/>
-            <w:r>
-              <w:rPr>
-                <w:b w:val="0"/>
+            <w:tcW w:w="5184" w:type="dxa"/>
+          </w:tcPr>
+          <w:p>
+            <w:r>
+              <w:rPr>
                 <w:sz w:val="16"/>
               </w:rPr>
               <w:t>Typed errors</w:t>
@@ -1100,13 +1022,11 @@
         </w:tc>
         <w:tc>
           <w:tcPr>
-            <w:tcW w:type="dxa" w:w="5184"/>
-          </w:tcPr>
-          <w:p>
-            <w:r/>
-            <w:r>
-              <w:rPr>
-                <w:b w:val="0"/>
+            <w:tcW w:w="5184" w:type="dxa"/>
+          </w:tcPr>
+          <w:p>
+            <w:r>
+              <w:rPr>
                 <w:sz w:val="16"/>
               </w:rPr>
               <w:t>Eight frozen error classes with definitions, examples, detection contracts, and allowed repair actions.</w:t>
@@ -1117,13 +1037,11 @@
       <w:tr>
         <w:tc>
           <w:tcPr>
-            <w:tcW w:type="dxa" w:w="5184"/>
-          </w:tcPr>
-          <w:p>
-            <w:r/>
-            <w:r>
-              <w:rPr>
-                <w:b w:val="0"/>
+            <w:tcW w:w="5184" w:type="dxa"/>
+          </w:tcPr>
+          <w:p>
+            <w:r>
+              <w:rPr>
                 <w:sz w:val="16"/>
               </w:rPr>
               <w:t>Verifier supervision</w:t>
@@ -1132,13 +1050,11 @@
         </w:tc>
         <w:tc>
           <w:tcPr>
-            <w:tcW w:type="dxa" w:w="5184"/>
-          </w:tcPr>
-          <w:p>
-            <w:r/>
-            <w:r>
-              <w:rPr>
-                <w:b w:val="0"/>
+            <w:tcW w:w="5184" w:type="dxa"/>
+          </w:tcPr>
+          <w:p>
+            <w:r>
+              <w:rPr>
                 <w:sz w:val="16"/>
               </w:rPr>
               <w:t>48 controlled corrupted/correct trace pairs, balanced at six examples per error type.</w:t>
@@ -1149,13 +1065,11 @@
       <w:tr>
         <w:tc>
           <w:tcPr>
-            <w:tcW w:type="dxa" w:w="5184"/>
-          </w:tcPr>
-          <w:p>
-            <w:r/>
-            <w:r>
-              <w:rPr>
-                <w:b w:val="0"/>
+            <w:tcW w:w="5184" w:type="dxa"/>
+          </w:tcPr>
+          <w:p>
+            <w:r>
+              <w:rPr>
                 <w:sz w:val="16"/>
               </w:rPr>
               <w:t>Fresh matched budget</w:t>
@@ -1164,13 +1078,11 @@
         </w:tc>
         <w:tc>
           <w:tcPr>
-            <w:tcW w:type="dxa" w:w="5184"/>
-          </w:tcPr>
-          <w:p>
-            <w:r/>
-            <w:r>
-              <w:rPr>
-                <w:b w:val="0"/>
+            <w:tcW w:w="5184" w:type="dxa"/>
+          </w:tcPr>
+          <w:p>
+            <w:r>
+              <w:rPr>
                 <w:sz w:val="16"/>
               </w:rPr>
               <w:t>Thirty-six initial runs and seven detected-error cases; global, uniform-local, and adaptive-local arms share an approximately 5,800 additional-token ceiling.</w:t>
@@ -1181,13 +1093,11 @@
       <w:tr>
         <w:tc>
           <w:tcPr>
-            <w:tcW w:type="dxa" w:w="5184"/>
-          </w:tcPr>
-          <w:p>
-            <w:r/>
-            <w:r>
-              <w:rPr>
-                <w:b w:val="0"/>
+            <w:tcW w:w="5184" w:type="dxa"/>
+          </w:tcPr>
+          <w:p>
+            <w:r>
+              <w:rPr>
                 <w:sz w:val="16"/>
               </w:rPr>
               <w:t>Ablations</w:t>
@@ -1196,13 +1106,11 @@
         </w:tc>
         <w:tc>
           <w:tcPr>
-            <w:tcW w:type="dxa" w:w="5184"/>
-          </w:tcPr>
-          <w:p>
-            <w:r/>
-            <w:r>
-              <w:rPr>
-                <w:b w:val="0"/>
+            <w:tcW w:w="5184" w:type="dxa"/>
+          </w:tcPr>
+          <w:p>
+            <w:r>
+              <w:rPr>
                 <w:sz w:val="16"/>
               </w:rPr>
               <w:t>Six frozen variants with explicit measured, proxy, planned, and learned-verifier-dependent evidence states.</w:t>
@@ -1213,13 +1121,11 @@
       <w:tr>
         <w:tc>
           <w:tcPr>
-            <w:tcW w:type="dxa" w:w="5184"/>
-          </w:tcPr>
-          <w:p>
-            <w:r/>
-            <w:r>
-              <w:rPr>
-                <w:b w:val="0"/>
+            <w:tcW w:w="5184" w:type="dxa"/>
+          </w:tcPr>
+          <w:p>
+            <w:r>
+              <w:rPr>
                 <w:sz w:val="16"/>
               </w:rPr>
               <w:t>Output contracts</w:t>
@@ -1228,13 +1134,11 @@
         </w:tc>
         <w:tc>
           <w:tcPr>
-            <w:tcW w:type="dxa" w:w="5184"/>
-          </w:tcPr>
-          <w:p>
-            <w:r/>
-            <w:r>
-              <w:rPr>
-                <w:b w:val="0"/>
+            <w:tcW w:w="5184" w:type="dxa"/>
+          </w:tcPr>
+          <w:p>
+            <w:r>
+              <w:rPr>
                 <w:sz w:val="16"/>
               </w:rPr>
               <w:t>Four saved configurations preserve model digests, prompt/parser versions, 432 raw outputs, failures, and strict/normalized accuracy.</w:t>
@@ -1245,13 +1149,11 @@
       <w:tr>
         <w:tc>
           <w:tcPr>
-            <w:tcW w:type="dxa" w:w="5184"/>
-          </w:tcPr>
-          <w:p>
-            <w:r/>
-            <w:r>
-              <w:rPr>
-                <w:b w:val="0"/>
+            <w:tcW w:w="5184" w:type="dxa"/>
+          </w:tcPr>
+          <w:p>
+            <w:r>
+              <w:rPr>
                 <w:sz w:val="16"/>
               </w:rPr>
               <w:t>Primary fresh metric</w:t>
@@ -1260,13 +1162,11 @@
         </w:tc>
         <w:tc>
           <w:tcPr>
-            <w:tcW w:type="dxa" w:w="5184"/>
-          </w:tcPr>
-          <w:p>
-            <w:r/>
-            <w:r>
-              <w:rPr>
-                <w:b w:val="0"/>
+            <w:tcW w:w="5184" w:type="dxa"/>
+          </w:tcPr>
+          <w:p>
+            <w:r>
+              <w:rPr>
                 <w:sz w:val="16"/>
               </w:rPr>
               <w:t>Answer accuracy over all scheduled runs; secondary metrics include valid traces, repair success, calls, tokens, and budget violations.</w:t>
@@ -1672,8 +1572,8 @@
     <w:tbl>
       <w:tblPr>
         <w:tblStyle w:val="TableGrid"/>
-        <w:tblW w:type="auto" w:w="0"/>
-        <w:tblLook w:firstColumn="1" w:firstRow="1" w:lastColumn="0" w:lastRow="0" w:noHBand="0" w:noVBand="1" w:val="04A0"/>
+        <w:tblW w:w="0" w:type="auto"/>
+        <w:tblLook w:val="04A0" w:firstRow="1" w:lastRow="0" w:firstColumn="1" w:lastColumn="0" w:noHBand="0" w:noVBand="1"/>
       </w:tblPr>
       <w:tblGrid>
         <w:gridCol w:w="2074"/>
@@ -1685,10 +1585,9 @@
       <w:tr>
         <w:tc>
           <w:tcPr>
-            <w:tcW w:type="dxa" w:w="2074"/>
-          </w:tcPr>
-          <w:p>
-            <w:r/>
+            <w:tcW w:w="2074" w:type="dxa"/>
+          </w:tcPr>
+          <w:p>
             <w:r>
               <w:rPr>
                 <w:b/>
@@ -1700,10 +1599,9 @@
         </w:tc>
         <w:tc>
           <w:tcPr>
-            <w:tcW w:type="dxa" w:w="2074"/>
-          </w:tcPr>
-          <w:p>
-            <w:r/>
+            <w:tcW w:w="2074" w:type="dxa"/>
+          </w:tcPr>
+          <w:p>
             <w:r>
               <w:rPr>
                 <w:b/>
@@ -1715,10 +1613,9 @@
         </w:tc>
         <w:tc>
           <w:tcPr>
-            <w:tcW w:type="dxa" w:w="2074"/>
-          </w:tcPr>
-          <w:p>
-            <w:r/>
+            <w:tcW w:w="2074" w:type="dxa"/>
+          </w:tcPr>
+          <w:p>
             <w:r>
               <w:rPr>
                 <w:b/>
@@ -1730,10 +1627,9 @@
         </w:tc>
         <w:tc>
           <w:tcPr>
-            <w:tcW w:type="dxa" w:w="2074"/>
-          </w:tcPr>
-          <w:p>
-            <w:r/>
+            <w:tcW w:w="2074" w:type="dxa"/>
+          </w:tcPr>
+          <w:p>
             <w:r>
               <w:rPr>
                 <w:b/>
@@ -1745,10 +1641,9 @@
         </w:tc>
         <w:tc>
           <w:tcPr>
-            <w:tcW w:type="dxa" w:w="2074"/>
-          </w:tcPr>
-          <w:p>
-            <w:r/>
+            <w:tcW w:w="2074" w:type="dxa"/>
+          </w:tcPr>
+          <w:p>
             <w:r>
               <w:rPr>
                 <w:b/>
@@ -1762,13 +1657,11 @@
       <w:tr>
         <w:tc>
           <w:tcPr>
-            <w:tcW w:type="dxa" w:w="2074"/>
-          </w:tcPr>
-          <w:p>
-            <w:r/>
-            <w:r>
-              <w:rPr>
-                <w:b w:val="0"/>
+            <w:tcW w:w="2074" w:type="dxa"/>
+          </w:tcPr>
+          <w:p>
+            <w:r>
+              <w:rPr>
                 <w:sz w:val="16"/>
               </w:rPr>
               <w:t>1.5B / default</w:t>
@@ -1777,13 +1670,11 @@
         </w:tc>
         <w:tc>
           <w:tcPr>
-            <w:tcW w:type="dxa" w:w="2074"/>
-          </w:tcPr>
-          <w:p>
-            <w:r/>
-            <w:r>
-              <w:rPr>
-                <w:b w:val="0"/>
+            <w:tcW w:w="2074" w:type="dxa"/>
+          </w:tcPr>
+          <w:p>
+            <w:r>
+              <w:rPr>
                 <w:sz w:val="16"/>
               </w:rPr>
               <w:t>90.7%</w:t>
@@ -1792,13 +1683,11 @@
         </w:tc>
         <w:tc>
           <w:tcPr>
-            <w:tcW w:type="dxa" w:w="2074"/>
-          </w:tcPr>
-          <w:p>
-            <w:r/>
-            <w:r>
-              <w:rPr>
-                <w:b w:val="0"/>
+            <w:tcW w:w="2074" w:type="dxa"/>
+          </w:tcPr>
+          <w:p>
+            <w:r>
+              <w:rPr>
                 <w:sz w:val="16"/>
               </w:rPr>
               <w:t>92.6%</w:t>
@@ -1807,13 +1696,11 @@
         </w:tc>
         <w:tc>
           <w:tcPr>
-            <w:tcW w:type="dxa" w:w="2074"/>
-          </w:tcPr>
-          <w:p>
-            <w:r/>
-            <w:r>
-              <w:rPr>
-                <w:b w:val="0"/>
+            <w:tcW w:w="2074" w:type="dxa"/>
+          </w:tcPr>
+          <w:p>
+            <w:r>
+              <w:rPr>
                 <w:sz w:val="16"/>
               </w:rPr>
               <w:t>100.0%</w:t>
@@ -1822,13 +1709,11 @@
         </w:tc>
         <w:tc>
           <w:tcPr>
-            <w:tcW w:type="dxa" w:w="2074"/>
-          </w:tcPr>
-          <w:p>
-            <w:r/>
-            <w:r>
-              <w:rPr>
-                <w:b w:val="0"/>
+            <w:tcW w:w="2074" w:type="dxa"/>
+          </w:tcPr>
+          <w:p>
+            <w:r>
+              <w:rPr>
                 <w:sz w:val="16"/>
               </w:rPr>
               <w:t>0/108</w:t>
@@ -1839,13 +1724,11 @@
       <w:tr>
         <w:tc>
           <w:tcPr>
-            <w:tcW w:type="dxa" w:w="2074"/>
-          </w:tcPr>
-          <w:p>
-            <w:r/>
-            <w:r>
-              <w:rPr>
-                <w:b w:val="0"/>
+            <w:tcW w:w="2074" w:type="dxa"/>
+          </w:tcPr>
+          <w:p>
+            <w:r>
+              <w:rPr>
                 <w:sz w:val="16"/>
               </w:rPr>
               <w:t>3B / default</w:t>
@@ -1854,13 +1737,11 @@
         </w:tc>
         <w:tc>
           <w:tcPr>
-            <w:tcW w:type="dxa" w:w="2074"/>
-          </w:tcPr>
-          <w:p>
-            <w:r/>
-            <w:r>
-              <w:rPr>
-                <w:b w:val="0"/>
+            <w:tcW w:w="2074" w:type="dxa"/>
+          </w:tcPr>
+          <w:p>
+            <w:r>
+              <w:rPr>
                 <w:sz w:val="16"/>
               </w:rPr>
               <w:t>47.2%</w:t>
@@ -1869,13 +1750,11 @@
         </w:tc>
         <w:tc>
           <w:tcPr>
-            <w:tcW w:type="dxa" w:w="2074"/>
-          </w:tcPr>
-          <w:p>
-            <w:r/>
-            <w:r>
-              <w:rPr>
-                <w:b w:val="0"/>
+            <w:tcW w:w="2074" w:type="dxa"/>
+          </w:tcPr>
+          <w:p>
+            <w:r>
+              <w:rPr>
                 <w:sz w:val="16"/>
               </w:rPr>
               <w:t>56.5%</w:t>
@@ -1884,13 +1763,11 @@
         </w:tc>
         <w:tc>
           <w:tcPr>
-            <w:tcW w:type="dxa" w:w="2074"/>
-          </w:tcPr>
-          <w:p>
-            <w:r/>
-            <w:r>
-              <w:rPr>
-                <w:b w:val="0"/>
+            <w:tcW w:w="2074" w:type="dxa"/>
+          </w:tcPr>
+          <w:p>
+            <w:r>
+              <w:rPr>
                 <w:sz w:val="16"/>
               </w:rPr>
               <w:t>48.1%</w:t>
@@ -1899,13 +1776,11 @@
         </w:tc>
         <w:tc>
           <w:tcPr>
-            <w:tcW w:type="dxa" w:w="2074"/>
-          </w:tcPr>
-          <w:p>
-            <w:r/>
-            <w:r>
-              <w:rPr>
-                <w:b w:val="0"/>
+            <w:tcW w:w="2074" w:type="dxa"/>
+          </w:tcPr>
+          <w:p>
+            <w:r>
+              <w:rPr>
                 <w:sz w:val="16"/>
               </w:rPr>
               <w:t>24/108</w:t>
@@ -1916,13 +1791,11 @@
       <w:tr>
         <w:tc>
           <w:tcPr>
-            <w:tcW w:type="dxa" w:w="2074"/>
-          </w:tcPr>
-          <w:p>
-            <w:r/>
-            <w:r>
-              <w:rPr>
-                <w:b w:val="0"/>
+            <w:tcW w:w="2074" w:type="dxa"/>
+          </w:tcPr>
+          <w:p>
+            <w:r>
+              <w:rPr>
                 <w:sz w:val="16"/>
               </w:rPr>
               <w:t>7B / default</w:t>
@@ -1931,13 +1804,11 @@
         </w:tc>
         <w:tc>
           <w:tcPr>
-            <w:tcW w:type="dxa" w:w="2074"/>
-          </w:tcPr>
-          <w:p>
-            <w:r/>
-            <w:r>
-              <w:rPr>
-                <w:b w:val="0"/>
+            <w:tcW w:w="2074" w:type="dxa"/>
+          </w:tcPr>
+          <w:p>
+            <w:r>
+              <w:rPr>
                 <w:sz w:val="16"/>
               </w:rPr>
               <w:t>13.0%</w:t>
@@ -1946,13 +1817,11 @@
         </w:tc>
         <w:tc>
           <w:tcPr>
-            <w:tcW w:type="dxa" w:w="2074"/>
-          </w:tcPr>
-          <w:p>
-            <w:r/>
-            <w:r>
-              <w:rPr>
-                <w:b w:val="0"/>
+            <w:tcW w:w="2074" w:type="dxa"/>
+          </w:tcPr>
+          <w:p>
+            <w:r>
+              <w:rPr>
                 <w:sz w:val="16"/>
               </w:rPr>
               <w:t>13.9%</w:t>
@@ -1961,13 +1830,11 @@
         </w:tc>
         <w:tc>
           <w:tcPr>
-            <w:tcW w:type="dxa" w:w="2074"/>
-          </w:tcPr>
-          <w:p>
-            <w:r/>
-            <w:r>
-              <w:rPr>
-                <w:b w:val="0"/>
+            <w:tcW w:w="2074" w:type="dxa"/>
+          </w:tcPr>
+          <w:p>
+            <w:r>
+              <w:rPr>
                 <w:sz w:val="16"/>
               </w:rPr>
               <w:t>13.0%</w:t>
@@ -1976,13 +1843,11 @@
         </w:tc>
         <w:tc>
           <w:tcPr>
-            <w:tcW w:type="dxa" w:w="2074"/>
-          </w:tcPr>
-          <w:p>
-            <w:r/>
-            <w:r>
-              <w:rPr>
-                <w:b w:val="0"/>
+            <w:tcW w:w="2074" w:type="dxa"/>
+          </w:tcPr>
+          <w:p>
+            <w:r>
+              <w:rPr>
                 <w:sz w:val="16"/>
               </w:rPr>
               <w:t>91/108</w:t>
@@ -1993,28 +1858,25 @@
       <w:tr>
         <w:tc>
           <w:tcPr>
-            <w:tcW w:type="dxa" w:w="2074"/>
-          </w:tcPr>
-          <w:p>
-            <w:r/>
-            <w:r>
-              <w:rPr>
-                <w:b w:val="0"/>
-                <w:sz w:val="16"/>
-              </w:rPr>
+            <w:tcW w:w="2074" w:type="dxa"/>
+          </w:tcPr>
+          <w:p>
+            <w:r>
+              <w:rPr>
+                <w:sz w:val="16"/>
+              </w:rPr>
+              <w:lastRenderedPageBreak/>
               <w:t>7B / JSON contract</w:t>
             </w:r>
           </w:p>
         </w:tc>
         <w:tc>
           <w:tcPr>
-            <w:tcW w:type="dxa" w:w="2074"/>
-          </w:tcPr>
-          <w:p>
-            <w:r/>
-            <w:r>
-              <w:rPr>
-                <w:b w:val="0"/>
+            <w:tcW w:w="2074" w:type="dxa"/>
+          </w:tcPr>
+          <w:p>
+            <w:r>
+              <w:rPr>
                 <w:sz w:val="16"/>
               </w:rPr>
               <w:t>75.0%</w:t>
@@ -2023,13 +1885,11 @@
         </w:tc>
         <w:tc>
           <w:tcPr>
-            <w:tcW w:type="dxa" w:w="2074"/>
-          </w:tcPr>
-          <w:p>
-            <w:r/>
-            <w:r>
-              <w:rPr>
-                <w:b w:val="0"/>
+            <w:tcW w:w="2074" w:type="dxa"/>
+          </w:tcPr>
+          <w:p>
+            <w:r>
+              <w:rPr>
                 <w:sz w:val="16"/>
               </w:rPr>
               <w:t>75.9%</w:t>
@@ -2038,13 +1898,11 @@
         </w:tc>
         <w:tc>
           <w:tcPr>
-            <w:tcW w:type="dxa" w:w="2074"/>
-          </w:tcPr>
-          <w:p>
-            <w:r/>
-            <w:r>
-              <w:rPr>
-                <w:b w:val="0"/>
+            <w:tcW w:w="2074" w:type="dxa"/>
+          </w:tcPr>
+          <w:p>
+            <w:r>
+              <w:rPr>
                 <w:sz w:val="16"/>
               </w:rPr>
               <w:t>85.2%</w:t>
@@ -2053,13 +1911,11 @@
         </w:tc>
         <w:tc>
           <w:tcPr>
-            <w:tcW w:type="dxa" w:w="2074"/>
-          </w:tcPr>
-          <w:p>
-            <w:r/>
-            <w:r>
-              <w:rPr>
-                <w:b w:val="0"/>
+            <w:tcW w:w="2074" w:type="dxa"/>
+          </w:tcPr>
+          <w:p>
+            <w:r>
+              <w:rPr>
                 <w:sz w:val="16"/>
               </w:rPr>
               <w:t>10/108</w:t>
@@ -2079,8 +1935,8 @@
     <w:tbl>
       <w:tblPr>
         <w:tblStyle w:val="TableGrid"/>
-        <w:tblW w:type="auto" w:w="0"/>
-        <w:tblLook w:firstColumn="1" w:firstRow="1" w:lastColumn="0" w:lastRow="0" w:noHBand="0" w:noVBand="1" w:val="04A0"/>
+        <w:tblW w:w="0" w:type="auto"/>
+        <w:tblLook w:val="04A0" w:firstRow="1" w:lastRow="0" w:firstColumn="1" w:lastColumn="0" w:noHBand="0" w:noVBand="1"/>
       </w:tblPr>
       <w:tblGrid>
         <w:gridCol w:w="2074"/>
@@ -2092,10 +1948,9 @@
       <w:tr>
         <w:tc>
           <w:tcPr>
-            <w:tcW w:type="dxa" w:w="2074"/>
-          </w:tcPr>
-          <w:p>
-            <w:r/>
+            <w:tcW w:w="2074" w:type="dxa"/>
+          </w:tcPr>
+          <w:p>
             <w:r>
               <w:rPr>
                 <w:b/>
@@ -2107,10 +1962,9 @@
         </w:tc>
         <w:tc>
           <w:tcPr>
-            <w:tcW w:type="dxa" w:w="2074"/>
-          </w:tcPr>
-          <w:p>
-            <w:r/>
+            <w:tcW w:w="2074" w:type="dxa"/>
+          </w:tcPr>
+          <w:p>
             <w:r>
               <w:rPr>
                 <w:b/>
@@ -2122,10 +1976,9 @@
         </w:tc>
         <w:tc>
           <w:tcPr>
-            <w:tcW w:type="dxa" w:w="2074"/>
-          </w:tcPr>
-          <w:p>
-            <w:r/>
+            <w:tcW w:w="2074" w:type="dxa"/>
+          </w:tcPr>
+          <w:p>
             <w:r>
               <w:rPr>
                 <w:b/>
@@ -2137,10 +1990,9 @@
         </w:tc>
         <w:tc>
           <w:tcPr>
-            <w:tcW w:type="dxa" w:w="2074"/>
-          </w:tcPr>
-          <w:p>
-            <w:r/>
+            <w:tcW w:w="2074" w:type="dxa"/>
+          </w:tcPr>
+          <w:p>
             <w:r>
               <w:rPr>
                 <w:b/>
@@ -2152,10 +2004,9 @@
         </w:tc>
         <w:tc>
           <w:tcPr>
-            <w:tcW w:type="dxa" w:w="2074"/>
-          </w:tcPr>
-          <w:p>
-            <w:r/>
+            <w:tcW w:w="2074" w:type="dxa"/>
+          </w:tcPr>
+          <w:p>
             <w:r>
               <w:rPr>
                 <w:b/>
@@ -2169,13 +2020,11 @@
       <w:tr>
         <w:tc>
           <w:tcPr>
-            <w:tcW w:type="dxa" w:w="2074"/>
-          </w:tcPr>
-          <w:p>
-            <w:r/>
-            <w:r>
-              <w:rPr>
-                <w:b w:val="0"/>
+            <w:tcW w:w="2074" w:type="dxa"/>
+          </w:tcPr>
+          <w:p>
+            <w:r>
+              <w:rPr>
                 <w:sz w:val="16"/>
               </w:rPr>
               <w:t>1.5B / default</w:t>
@@ -2184,13 +2033,11 @@
         </w:tc>
         <w:tc>
           <w:tcPr>
-            <w:tcW w:type="dxa" w:w="2074"/>
-          </w:tcPr>
-          <w:p>
-            <w:r/>
-            <w:r>
-              <w:rPr>
-                <w:b w:val="0"/>
+            <w:tcW w:w="2074" w:type="dxa"/>
+          </w:tcPr>
+          <w:p>
+            <w:r>
+              <w:rPr>
                 <w:sz w:val="16"/>
               </w:rPr>
               <w:t>90.7%</w:t>
@@ -2199,13 +2046,11 @@
         </w:tc>
         <w:tc>
           <w:tcPr>
-            <w:tcW w:type="dxa" w:w="2074"/>
-          </w:tcPr>
-          <w:p>
-            <w:r/>
-            <w:r>
-              <w:rPr>
-                <w:b w:val="0"/>
+            <w:tcW w:w="2074" w:type="dxa"/>
+          </w:tcPr>
+          <w:p>
+            <w:r>
+              <w:rPr>
                 <w:sz w:val="16"/>
               </w:rPr>
               <w:t>90.7%</w:t>
@@ -2214,13 +2059,11 @@
         </w:tc>
         <w:tc>
           <w:tcPr>
-            <w:tcW w:type="dxa" w:w="2074"/>
-          </w:tcPr>
-          <w:p>
-            <w:r/>
-            <w:r>
-              <w:rPr>
-                <w:b w:val="0"/>
+            <w:tcW w:w="2074" w:type="dxa"/>
+          </w:tcPr>
+          <w:p>
+            <w:r>
+              <w:rPr>
                 <w:sz w:val="16"/>
               </w:rPr>
               <w:t>+0.0 pp</w:t>
@@ -2229,13 +2072,11 @@
         </w:tc>
         <w:tc>
           <w:tcPr>
-            <w:tcW w:type="dxa" w:w="2074"/>
-          </w:tcPr>
-          <w:p>
-            <w:r/>
-            <w:r>
-              <w:rPr>
-                <w:b w:val="0"/>
+            <w:tcW w:w="2074" w:type="dxa"/>
+          </w:tcPr>
+          <w:p>
+            <w:r>
+              <w:rPr>
                 <w:sz w:val="16"/>
               </w:rPr>
               <w:t>0/0</w:t>
@@ -2246,13 +2087,11 @@
       <w:tr>
         <w:tc>
           <w:tcPr>
-            <w:tcW w:type="dxa" w:w="2074"/>
-          </w:tcPr>
-          <w:p>
-            <w:r/>
-            <w:r>
-              <w:rPr>
-                <w:b w:val="0"/>
+            <w:tcW w:w="2074" w:type="dxa"/>
+          </w:tcPr>
+          <w:p>
+            <w:r>
+              <w:rPr>
                 <w:sz w:val="16"/>
               </w:rPr>
               <w:t>3B / default</w:t>
@@ -2261,13 +2100,11 @@
         </w:tc>
         <w:tc>
           <w:tcPr>
-            <w:tcW w:type="dxa" w:w="2074"/>
-          </w:tcPr>
-          <w:p>
-            <w:r/>
-            <w:r>
-              <w:rPr>
-                <w:b w:val="0"/>
+            <w:tcW w:w="2074" w:type="dxa"/>
+          </w:tcPr>
+          <w:p>
+            <w:r>
+              <w:rPr>
                 <w:sz w:val="16"/>
               </w:rPr>
               <w:t>47.2%</w:t>
@@ -2276,13 +2113,11 @@
         </w:tc>
         <w:tc>
           <w:tcPr>
-            <w:tcW w:type="dxa" w:w="2074"/>
-          </w:tcPr>
-          <w:p>
-            <w:r/>
-            <w:r>
-              <w:rPr>
-                <w:b w:val="0"/>
+            <w:tcW w:w="2074" w:type="dxa"/>
+          </w:tcPr>
+          <w:p>
+            <w:r>
+              <w:rPr>
                 <w:sz w:val="16"/>
               </w:rPr>
               <w:t>59.3%</w:t>
@@ -2291,13 +2126,11 @@
         </w:tc>
         <w:tc>
           <w:tcPr>
-            <w:tcW w:type="dxa" w:w="2074"/>
-          </w:tcPr>
-          <w:p>
-            <w:r/>
-            <w:r>
-              <w:rPr>
-                <w:b w:val="0"/>
+            <w:tcW w:w="2074" w:type="dxa"/>
+          </w:tcPr>
+          <w:p>
+            <w:r>
+              <w:rPr>
                 <w:sz w:val="16"/>
               </w:rPr>
               <w:t>+12.0 pp</w:t>
@@ -2306,13 +2139,11 @@
         </w:tc>
         <w:tc>
           <w:tcPr>
-            <w:tcW w:type="dxa" w:w="2074"/>
-          </w:tcPr>
-          <w:p>
-            <w:r/>
-            <w:r>
-              <w:rPr>
-                <w:b w:val="0"/>
+            <w:tcW w:w="2074" w:type="dxa"/>
+          </w:tcPr>
+          <w:p>
+            <w:r>
+              <w:rPr>
                 <w:sz w:val="16"/>
               </w:rPr>
               <w:t>24/24</w:t>
@@ -2323,13 +2154,11 @@
       <w:tr>
         <w:tc>
           <w:tcPr>
-            <w:tcW w:type="dxa" w:w="2074"/>
-          </w:tcPr>
-          <w:p>
-            <w:r/>
-            <w:r>
-              <w:rPr>
-                <w:b w:val="0"/>
+            <w:tcW w:w="2074" w:type="dxa"/>
+          </w:tcPr>
+          <w:p>
+            <w:r>
+              <w:rPr>
                 <w:sz w:val="16"/>
               </w:rPr>
               <w:t>7B / default</w:t>
@@ -2338,13 +2167,11 @@
         </w:tc>
         <w:tc>
           <w:tcPr>
-            <w:tcW w:type="dxa" w:w="2074"/>
-          </w:tcPr>
-          <w:p>
-            <w:r/>
-            <w:r>
-              <w:rPr>
-                <w:b w:val="0"/>
+            <w:tcW w:w="2074" w:type="dxa"/>
+          </w:tcPr>
+          <w:p>
+            <w:r>
+              <w:rPr>
                 <w:sz w:val="16"/>
               </w:rPr>
               <w:t>13.0%</w:t>
@@ -2353,13 +2180,11 @@
         </w:tc>
         <w:tc>
           <w:tcPr>
-            <w:tcW w:type="dxa" w:w="2074"/>
-          </w:tcPr>
-          <w:p>
-            <w:r/>
-            <w:r>
-              <w:rPr>
-                <w:b w:val="0"/>
+            <w:tcW w:w="2074" w:type="dxa"/>
+          </w:tcPr>
+          <w:p>
+            <w:r>
+              <w:rPr>
                 <w:sz w:val="16"/>
               </w:rPr>
               <w:t>41.7%</w:t>
@@ -2368,13 +2193,11 @@
         </w:tc>
         <w:tc>
           <w:tcPr>
-            <w:tcW w:type="dxa" w:w="2074"/>
-          </w:tcPr>
-          <w:p>
-            <w:r/>
-            <w:r>
-              <w:rPr>
-                <w:b w:val="0"/>
+            <w:tcW w:w="2074" w:type="dxa"/>
+          </w:tcPr>
+          <w:p>
+            <w:r>
+              <w:rPr>
                 <w:sz w:val="16"/>
               </w:rPr>
               <w:t>+28.7 pp</w:t>
@@ -2383,13 +2206,11 @@
         </w:tc>
         <w:tc>
           <w:tcPr>
-            <w:tcW w:type="dxa" w:w="2074"/>
-          </w:tcPr>
-          <w:p>
-            <w:r/>
-            <w:r>
-              <w:rPr>
-                <w:b w:val="0"/>
+            <w:tcW w:w="2074" w:type="dxa"/>
+          </w:tcPr>
+          <w:p>
+            <w:r>
+              <w:rPr>
                 <w:sz w:val="16"/>
               </w:rPr>
               <w:t>36/91</w:t>
@@ -2400,13 +2221,11 @@
       <w:tr>
         <w:tc>
           <w:tcPr>
-            <w:tcW w:type="dxa" w:w="2074"/>
-          </w:tcPr>
-          <w:p>
-            <w:r/>
-            <w:r>
-              <w:rPr>
-                <w:b w:val="0"/>
+            <w:tcW w:w="2074" w:type="dxa"/>
+          </w:tcPr>
+          <w:p>
+            <w:r>
+              <w:rPr>
                 <w:sz w:val="16"/>
               </w:rPr>
               <w:t>7B / JSON contract</w:t>
@@ -2415,13 +2234,11 @@
         </w:tc>
         <w:tc>
           <w:tcPr>
-            <w:tcW w:type="dxa" w:w="2074"/>
-          </w:tcPr>
-          <w:p>
-            <w:r/>
-            <w:r>
-              <w:rPr>
-                <w:b w:val="0"/>
+            <w:tcW w:w="2074" w:type="dxa"/>
+          </w:tcPr>
+          <w:p>
+            <w:r>
+              <w:rPr>
                 <w:sz w:val="16"/>
               </w:rPr>
               <w:t>75.0%</w:t>
@@ -2430,13 +2247,11 @@
         </w:tc>
         <w:tc>
           <w:tcPr>
-            <w:tcW w:type="dxa" w:w="2074"/>
-          </w:tcPr>
-          <w:p>
-            <w:r/>
-            <w:r>
-              <w:rPr>
-                <w:b w:val="0"/>
+            <w:tcW w:w="2074" w:type="dxa"/>
+          </w:tcPr>
+          <w:p>
+            <w:r>
+              <w:rPr>
                 <w:sz w:val="16"/>
               </w:rPr>
               <w:t>79.6%</w:t>
@@ -2445,13 +2260,11 @@
         </w:tc>
         <w:tc>
           <w:tcPr>
-            <w:tcW w:type="dxa" w:w="2074"/>
-          </w:tcPr>
-          <w:p>
-            <w:r/>
-            <w:r>
-              <w:rPr>
-                <w:b w:val="0"/>
+            <w:tcW w:w="2074" w:type="dxa"/>
+          </w:tcPr>
+          <w:p>
+            <w:r>
+              <w:rPr>
                 <w:sz w:val="16"/>
               </w:rPr>
               <w:t>+4.6 pp</w:t>
@@ -2460,13 +2273,11 @@
         </w:tc>
         <w:tc>
           <w:tcPr>
-            <w:tcW w:type="dxa" w:w="2074"/>
-          </w:tcPr>
-          <w:p>
-            <w:r/>
-            <w:r>
-              <w:rPr>
-                <w:b w:val="0"/>
+            <w:tcW w:w="2074" w:type="dxa"/>
+          </w:tcPr>
+          <w:p>
+            <w:r>
+              <w:rPr>
                 <w:sz w:val="16"/>
               </w:rPr>
               <w:t>5/10</w:t>
@@ -2601,7 +2412,6 @@
           <w:sz w:val="24"/>
           <w:szCs w:val="24"/>
         </w:rPr>
-        <w:lastRenderedPageBreak/>
         <w:t>Version-controlled source code and reports on GitHub.</w:t>
       </w:r>
     </w:p>
@@ -2631,7 +2441,13 @@
         </w:rPr>
       </w:pPr>
       <w:r>
-        <w:t>The complete proposal experiment is not yet finished. The project now includes a 40-problem MATH-500 level-4/5 processing pilot, a frozen six-row ablation design, and graph-integrated model traces. However, the MATH-500 run is currently a text-processing smoke test rather than an accuracy evaluation; the learned calibrated verifier is not trained; three ablation cells remain unmeasured; and the fresh matched-budget result is based on only 36 runs and seven detected errors.</w:t>
+        <w:t xml:space="preserve">The complete proposal experiment is not yet finished. The project now includes a 40-problem MATH-500 level-4/5 processing pilot, a frozen six-row ablation design, and graph-integrated model traces. However, the MATH-500 run is currently a text-processing smoke test rather than an accuracy evaluation; the learned </w:t>
+      </w:r>
+      <w:r>
+        <w:t>standardized</w:t>
+      </w:r>
+      <w:r>
+        <w:t xml:space="preserve"> verifier is not trained; three ablation cells remain unmeasured; and the fresh matched-budget result is based on only 36 runs and seven detected errors.</w:t>
       </w:r>
     </w:p>
     <w:p>
@@ -2688,6 +2504,7 @@
         <w:pStyle w:val="ListBullet"/>
       </w:pPr>
       <w:r>
+        <w:lastRenderedPageBreak/>
         <w:t>Fill the no-graph, no-typed-error, and no-symbolic-tool ablation cells. Task 6 explicitly requested the table structure even if cells were unfinished.</w:t>
       </w:r>
     </w:p>
@@ -2862,7 +2679,6 @@
           <w:sz w:val="24"/>
           <w:szCs w:val="24"/>
         </w:rPr>
-        <w:lastRenderedPageBreak/>
         <w:drawing>
           <wp:inline distT="0" distB="0" distL="0" distR="0" wp14:anchorId="65035DA3" wp14:editId="326440AF">
             <wp:extent cx="6346190" cy="2539365"/>
@@ -2949,6 +2765,7 @@
           <w:sz w:val="24"/>
           <w:szCs w:val="24"/>
         </w:rPr>
+        <w:lastRenderedPageBreak/>
         <w:drawing>
           <wp:inline distT="0" distB="0" distL="0" distR="0" wp14:anchorId="7AB3DBFE" wp14:editId="610BA5EB">
             <wp:extent cx="6187976" cy="3375953"/>
@@ -3022,7 +2839,6 @@
           <w:sz w:val="24"/>
           <w:szCs w:val="24"/>
         </w:rPr>
-        <w:lastRenderedPageBreak/>
         <w:drawing>
           <wp:inline distT="0" distB="0" distL="0" distR="0" wp14:anchorId="2AA59B19" wp14:editId="038C352A">
             <wp:extent cx="6346190" cy="4114800"/>
@@ -3095,6 +2911,7 @@
           <w:sz w:val="24"/>
           <w:szCs w:val="24"/>
         </w:rPr>
+        <w:lastRenderedPageBreak/>
         <w:t>python run_repeated_experiments.py --aggregate-only --problems expanded_heldout_model_problems.csv --seeds 160500 180500 200500 --samples-per-problem 1</w:t>
       </w:r>
     </w:p>
@@ -3176,6 +2993,7 @@
         <w:pStyle w:val="Heading1"/>
       </w:pPr>
       <w:r>
+        <w:lastRenderedPageBreak/>
         <w:t>12. Supervisor Tasks 1-7 Completion Update</w:t>
       </w:r>
     </w:p>
@@ -3187,8 +3005,8 @@
     <w:tbl>
       <w:tblPr>
         <w:tblStyle w:val="TableGrid"/>
-        <w:tblW w:type="auto" w:w="0"/>
-        <w:tblLook w:firstColumn="1" w:firstRow="1" w:lastColumn="0" w:lastRow="0" w:noHBand="0" w:noVBand="1" w:val="04A0"/>
+        <w:tblW w:w="0" w:type="auto"/>
+        <w:tblLook w:val="04A0" w:firstRow="1" w:lastRow="0" w:firstColumn="1" w:lastColumn="0" w:noHBand="0" w:noVBand="1"/>
       </w:tblPr>
       <w:tblGrid>
         <w:gridCol w:w="2592"/>
@@ -3199,10 +3017,9 @@
       <w:tr>
         <w:tc>
           <w:tcPr>
-            <w:tcW w:type="dxa" w:w="2592"/>
-          </w:tcPr>
-          <w:p>
-            <w:r/>
+            <w:tcW w:w="2592" w:type="dxa"/>
+          </w:tcPr>
+          <w:p>
             <w:r>
               <w:rPr>
                 <w:b/>
@@ -3214,10 +3031,9 @@
         </w:tc>
         <w:tc>
           <w:tcPr>
-            <w:tcW w:type="dxa" w:w="2592"/>
-          </w:tcPr>
-          <w:p>
-            <w:r/>
+            <w:tcW w:w="2592" w:type="dxa"/>
+          </w:tcPr>
+          <w:p>
             <w:r>
               <w:rPr>
                 <w:b/>
@@ -3229,10 +3045,9 @@
         </w:tc>
         <w:tc>
           <w:tcPr>
-            <w:tcW w:type="dxa" w:w="2592"/>
-          </w:tcPr>
-          <w:p>
-            <w:r/>
+            <w:tcW w:w="2592" w:type="dxa"/>
+          </w:tcPr>
+          <w:p>
             <w:r>
               <w:rPr>
                 <w:b/>
@@ -3244,10 +3059,9 @@
         </w:tc>
         <w:tc>
           <w:tcPr>
-            <w:tcW w:type="dxa" w:w="2592"/>
-          </w:tcPr>
-          <w:p>
-            <w:r/>
+            <w:tcW w:w="2592" w:type="dxa"/>
+          </w:tcPr>
+          <w:p>
             <w:r>
               <w:rPr>
                 <w:b/>
@@ -3261,13 +3075,11 @@
       <w:tr>
         <w:tc>
           <w:tcPr>
-            <w:tcW w:type="dxa" w:w="2592"/>
-          </w:tcPr>
-          <w:p>
-            <w:r/>
-            <w:r>
-              <w:rPr>
-                <w:b w:val="0"/>
+            <w:tcW w:w="2592" w:type="dxa"/>
+          </w:tcPr>
+          <w:p>
+            <w:r>
+              <w:rPr>
                 <w:sz w:val="16"/>
               </w:rPr>
               <w:t>1</w:t>
@@ -3276,13 +3088,11 @@
         </w:tc>
         <w:tc>
           <w:tcPr>
-            <w:tcW w:type="dxa" w:w="2592"/>
-          </w:tcPr>
-          <w:p>
-            <w:r/>
-            <w:r>
-              <w:rPr>
-                <w:b w:val="0"/>
+            <w:tcW w:w="2592" w:type="dxa"/>
+          </w:tcPr>
+          <w:p>
+            <w:r>
+              <w:rPr>
                 <w:sz w:val="16"/>
               </w:rPr>
               <w:t>Completed</w:t>
@@ -3291,13 +3101,11 @@
         </w:tc>
         <w:tc>
           <w:tcPr>
-            <w:tcW w:type="dxa" w:w="2592"/>
-          </w:tcPr>
-          <w:p>
-            <w:r/>
-            <w:r>
-              <w:rPr>
-                <w:b w:val="0"/>
+            <w:tcW w:w="2592" w:type="dxa"/>
+          </w:tcPr>
+          <w:p>
+            <w:r>
+              <w:rPr>
                 <w:sz w:val="16"/>
               </w:rPr>
               <w:t>Real model traces now use the reasoning graph internally. Each node stores state, parents, verification, error impact, repair, and final status.</w:t>
@@ -3306,13 +3114,11 @@
         </w:tc>
         <w:tc>
           <w:tcPr>
-            <w:tcW w:type="dxa" w:w="2592"/>
-          </w:tcPr>
-          <w:p>
-            <w:r/>
-            <w:r>
-              <w:rPr>
-                <w:b w:val="0"/>
+            <w:tcW w:w="2592" w:type="dxa"/>
+          </w:tcPr>
+          <w:p>
+            <w:r>
+              <w:rPr>
                 <w:sz w:val="16"/>
               </w:rPr>
               <w:t>model_pipeline.py; reasoning_graph.py</w:t>
@@ -3323,13 +3129,11 @@
       <w:tr>
         <w:tc>
           <w:tcPr>
-            <w:tcW w:type="dxa" w:w="2592"/>
-          </w:tcPr>
-          <w:p>
-            <w:r/>
-            <w:r>
-              <w:rPr>
-                <w:b w:val="0"/>
+            <w:tcW w:w="2592" w:type="dxa"/>
+          </w:tcPr>
+          <w:p>
+            <w:r>
+              <w:rPr>
                 <w:sz w:val="16"/>
               </w:rPr>
               <w:t>2</w:t>
@@ -3338,13 +3142,11 @@
         </w:tc>
         <w:tc>
           <w:tcPr>
-            <w:tcW w:type="dxa" w:w="2592"/>
-          </w:tcPr>
-          <w:p>
-            <w:r/>
-            <w:r>
-              <w:rPr>
-                <w:b w:val="0"/>
+            <w:tcW w:w="2592" w:type="dxa"/>
+          </w:tcPr>
+          <w:p>
+            <w:r>
+              <w:rPr>
                 <w:sz w:val="16"/>
               </w:rPr>
               <w:t>Completed within requested scope</w:t>
@@ -3353,13 +3155,11 @@
         </w:tc>
         <w:tc>
           <w:tcPr>
-            <w:tcW w:type="dxa" w:w="2592"/>
-          </w:tcPr>
-          <w:p>
-            <w:r/>
-            <w:r>
-              <w:rPr>
-                <w:b w:val="0"/>
+            <w:tcW w:w="2592" w:type="dxa"/>
+          </w:tcPr>
+          <w:p>
+            <w:r>
+              <w:rPr>
                 <w:sz w:val="16"/>
               </w:rPr>
               <w:t>A deterministic 40-problem MATH-500 subset has 17 level-4 and 23 level-5 problems across seven subjects. The smoke test processed 40/40 in text_unverified mode.</w:t>
@@ -3368,13 +3168,11 @@
         </w:tc>
         <w:tc>
           <w:tcPr>
-            <w:tcW w:type="dxa" w:w="2592"/>
-          </w:tcPr>
-          <w:p>
-            <w:r/>
-            <w:r>
-              <w:rPr>
-                <w:b w:val="0"/>
+            <w:tcW w:w="2592" w:type="dxa"/>
+          </w:tcPr>
+          <w:p>
+            <w:r>
+              <w:rPr>
                 <w:sz w:val="16"/>
               </w:rPr>
               <w:t>math500_pilot_40_manifest.json; math500_pilot_run.json</w:t>
@@ -3385,13 +3183,11 @@
       <w:tr>
         <w:tc>
           <w:tcPr>
-            <w:tcW w:type="dxa" w:w="2592"/>
-          </w:tcPr>
-          <w:p>
-            <w:r/>
-            <w:r>
-              <w:rPr>
-                <w:b w:val="0"/>
+            <w:tcW w:w="2592" w:type="dxa"/>
+          </w:tcPr>
+          <w:p>
+            <w:r>
+              <w:rPr>
                 <w:sz w:val="16"/>
               </w:rPr>
               <w:t>3</w:t>
@@ -3400,13 +3196,11 @@
         </w:tc>
         <w:tc>
           <w:tcPr>
-            <w:tcW w:type="dxa" w:w="2592"/>
-          </w:tcPr>
-          <w:p>
-            <w:r/>
-            <w:r>
-              <w:rPr>
-                <w:b w:val="0"/>
+            <w:tcW w:w="2592" w:type="dxa"/>
+          </w:tcPr>
+          <w:p>
+            <w:r>
+              <w:rPr>
                 <w:sz w:val="16"/>
               </w:rPr>
               <w:t>Completed</w:t>
@@ -3415,13 +3209,11 @@
         </w:tc>
         <w:tc>
           <w:tcPr>
-            <w:tcW w:type="dxa" w:w="2592"/>
-          </w:tcPr>
-          <w:p>
-            <w:r/>
-            <w:r>
-              <w:rPr>
-                <w:b w:val="0"/>
+            <w:tcW w:w="2592" w:type="dxa"/>
+          </w:tcPr>
+          <w:p>
+            <w:r>
+              <w:rPr>
                 <w:sz w:val="16"/>
               </w:rPr>
               <w:t>Eight typed errors are frozen with definitions, positive and negative examples, detection contracts, and repair actions.</w:t>
@@ -3430,13 +3222,11 @@
         </w:tc>
         <w:tc>
           <w:tcPr>
-            <w:tcW w:type="dxa" w:w="2592"/>
-          </w:tcPr>
-          <w:p>
-            <w:r/>
-            <w:r>
-              <w:rPr>
-                <w:b w:val="0"/>
+            <w:tcW w:w="2592" w:type="dxa"/>
+          </w:tcPr>
+          <w:p>
+            <w:r>
+              <w:rPr>
                 <w:sz w:val="16"/>
               </w:rPr>
               <w:t>ERROR_TAXONOMY.md</w:t>
@@ -3447,13 +3237,11 @@
       <w:tr>
         <w:tc>
           <w:tcPr>
-            <w:tcW w:type="dxa" w:w="2592"/>
-          </w:tcPr>
-          <w:p>
-            <w:r/>
-            <w:r>
-              <w:rPr>
-                <w:b w:val="0"/>
+            <w:tcW w:w="2592" w:type="dxa"/>
+          </w:tcPr>
+          <w:p>
+            <w:r>
+              <w:rPr>
                 <w:sz w:val="16"/>
               </w:rPr>
               <w:t>4</w:t>
@@ -3462,13 +3250,11 @@
         </w:tc>
         <w:tc>
           <w:tcPr>
-            <w:tcW w:type="dxa" w:w="2592"/>
-          </w:tcPr>
-          <w:p>
-            <w:r/>
-            <w:r>
-              <w:rPr>
-                <w:b w:val="0"/>
+            <w:tcW w:w="2592" w:type="dxa"/>
+          </w:tcPr>
+          <w:p>
+            <w:r>
+              <w:rPr>
                 <w:sz w:val="16"/>
               </w:rPr>
               <w:t>Completed within requested scope</w:t>
@@ -3477,13 +3263,11 @@
         </w:tc>
         <w:tc>
           <w:tcPr>
-            <w:tcW w:type="dxa" w:w="2592"/>
-          </w:tcPr>
-          <w:p>
-            <w:r/>
-            <w:r>
-              <w:rPr>
-                <w:b w:val="0"/>
+            <w:tcW w:w="2592" w:type="dxa"/>
+          </w:tcPr>
+          <w:p>
+            <w:r>
+              <w:rPr>
                 <w:sz w:val="16"/>
               </w:rPr>
               <w:t>The data generator produced 48 typed-verifier examples, six per error type, with error location, corrupted/correct steps, and preferred action.</w:t>
@@ -3492,13 +3276,11 @@
         </w:tc>
         <w:tc>
           <w:tcPr>
-            <w:tcW w:type="dxa" w:w="2592"/>
-          </w:tcPr>
-          <w:p>
-            <w:r/>
-            <w:r>
-              <w:rPr>
-                <w:b w:val="0"/>
+            <w:tcW w:w="2592" w:type="dxa"/>
+          </w:tcPr>
+          <w:p>
+            <w:r>
+              <w:rPr>
                 <w:sz w:val="16"/>
               </w:rPr>
               <w:t>typed_verifier_pilot.json</w:t>
@@ -3509,13 +3291,11 @@
       <w:tr>
         <w:tc>
           <w:tcPr>
-            <w:tcW w:type="dxa" w:w="2592"/>
-          </w:tcPr>
-          <w:p>
-            <w:r/>
-            <w:r>
-              <w:rPr>
-                <w:b w:val="0"/>
+            <w:tcW w:w="2592" w:type="dxa"/>
+          </w:tcPr>
+          <w:p>
+            <w:r>
+              <w:rPr>
                 <w:sz w:val="16"/>
               </w:rPr>
               <w:t>5</w:t>
@@ -3524,13 +3304,11 @@
         </w:tc>
         <w:tc>
           <w:tcPr>
-            <w:tcW w:type="dxa" w:w="2592"/>
-          </w:tcPr>
-          <w:p>
-            <w:r/>
-            <w:r>
-              <w:rPr>
-                <w:b w:val="0"/>
+            <w:tcW w:w="2592" w:type="dxa"/>
+          </w:tcPr>
+          <w:p>
+            <w:r>
+              <w:rPr>
                 <w:sz w:val="16"/>
               </w:rPr>
               <w:t>Completed</w:t>
@@ -3539,13 +3317,11 @@
         </w:tc>
         <w:tc>
           <w:tcPr>
-            <w:tcW w:type="dxa" w:w="2592"/>
-          </w:tcPr>
-          <w:p>
-            <w:r/>
-            <w:r>
-              <w:rPr>
-                <w:b w:val="0"/>
+            <w:tcW w:w="2592" w:type="dxa"/>
+          </w:tcPr>
+          <w:p>
+            <w:r>
+              <w:rPr>
                 <w:sz w:val="16"/>
               </w:rPr>
               <w:t>Under a shared approximately 5,800-token ceiling, global regeneration reached 88.9% answer accuracy; uniform and adaptive local repair each reached 86.1%. Budget violations: zero.</w:t>
@@ -3554,13 +3330,11 @@
         </w:tc>
         <w:tc>
           <w:tcPr>
-            <w:tcW w:type="dxa" w:w="2592"/>
-          </w:tcPr>
-          <w:p>
-            <w:r/>
-            <w:r>
-              <w:rPr>
-                <w:b w:val="0"/>
+            <w:tcW w:w="2592" w:type="dxa"/>
+          </w:tcPr>
+          <w:p>
+            <w:r>
+              <w:rPr>
                 <w:sz w:val="16"/>
               </w:rPr>
               <w:t>matched_budget_report.md</w:t>
@@ -3571,13 +3345,11 @@
       <w:tr>
         <w:tc>
           <w:tcPr>
-            <w:tcW w:type="dxa" w:w="2592"/>
-          </w:tcPr>
-          <w:p>
-            <w:r/>
-            <w:r>
-              <w:rPr>
-                <w:b w:val="0"/>
+            <w:tcW w:w="2592" w:type="dxa"/>
+          </w:tcPr>
+          <w:p>
+            <w:r>
+              <w:rPr>
                 <w:sz w:val="16"/>
               </w:rPr>
               <w:t>6</w:t>
@@ -3586,13 +3358,11 @@
         </w:tc>
         <w:tc>
           <w:tcPr>
-            <w:tcW w:type="dxa" w:w="2592"/>
-          </w:tcPr>
-          <w:p>
-            <w:r/>
-            <w:r>
-              <w:rPr>
-                <w:b w:val="0"/>
+            <w:tcW w:w="2592" w:type="dxa"/>
+          </w:tcPr>
+          <w:p>
+            <w:r>
+              <w:rPr>
                 <w:sz w:val="16"/>
               </w:rPr>
               <w:t>Completed within requested scope</w:t>
@@ -3601,13 +3371,11 @@
         </w:tc>
         <w:tc>
           <w:tcPr>
-            <w:tcW w:type="dxa" w:w="2592"/>
-          </w:tcPr>
-          <w:p>
-            <w:r/>
-            <w:r>
-              <w:rPr>
-                <w:b w:val="0"/>
+            <w:tcW w:w="2592" w:type="dxa"/>
+          </w:tcPr>
+          <w:p>
+            <w:r>
+              <w:rPr>
                 <w:sz w:val="16"/>
               </w:rPr>
               <w:t>The requested six-row structure is frozen. As explicitly allowed, two rows are measured, one is a rule-based proxy reference, and three future cells remain unfilled.</w:t>
@@ -3616,13 +3384,11 @@
         </w:tc>
         <w:tc>
           <w:tcPr>
-            <w:tcW w:type="dxa" w:w="2592"/>
-          </w:tcPr>
-          <w:p>
-            <w:r/>
-            <w:r>
-              <w:rPr>
-                <w:b w:val="0"/>
+            <w:tcW w:w="2592" w:type="dxa"/>
+          </w:tcPr>
+          <w:p>
+            <w:r>
+              <w:rPr>
                 <w:sz w:val="16"/>
               </w:rPr>
               <w:t>ablation_table.md</w:t>
@@ -3633,13 +3399,11 @@
       <w:tr>
         <w:tc>
           <w:tcPr>
-            <w:tcW w:type="dxa" w:w="2592"/>
-          </w:tcPr>
-          <w:p>
-            <w:r/>
-            <w:r>
-              <w:rPr>
-                <w:b w:val="0"/>
+            <w:tcW w:w="2592" w:type="dxa"/>
+          </w:tcPr>
+          <w:p>
+            <w:r>
+              <w:rPr>
                 <w:sz w:val="16"/>
               </w:rPr>
               <w:t>7</w:t>
@@ -3648,13 +3412,11 @@
         </w:tc>
         <w:tc>
           <w:tcPr>
-            <w:tcW w:type="dxa" w:w="2592"/>
-          </w:tcPr>
-          <w:p>
-            <w:r/>
-            <w:r>
-              <w:rPr>
-                <w:b w:val="0"/>
+            <w:tcW w:w="2592" w:type="dxa"/>
+          </w:tcPr>
+          <w:p>
+            <w:r>
+              <w:rPr>
                 <w:sz w:val="16"/>
               </w:rPr>
               <w:t>Completed</w:t>
@@ -3663,13 +3425,11 @@
         </w:tc>
         <w:tc>
           <w:tcPr>
-            <w:tcW w:type="dxa" w:w="2592"/>
-          </w:tcPr>
-          <w:p>
-            <w:r/>
-            <w:r>
-              <w:rPr>
-                <w:b w:val="0"/>
+            <w:tcW w:w="2592" w:type="dxa"/>
+          </w:tcPr>
+          <w:p>
+            <w:r>
+              <w:rPr>
                 <w:sz w:val="16"/>
               </w:rPr>
               <w:t>The archive preserves exact model digests, prompt/parser versions, 432 raw-output records, generation failures, trace hashes, and normalized accuracy for four configurations.</w:t>
@@ -3678,13 +3438,11 @@
         </w:tc>
         <w:tc>
           <w:tcPr>
-            <w:tcW w:type="dxa" w:w="2592"/>
-          </w:tcPr>
-          <w:p>
-            <w:r/>
-            <w:r>
-              <w:rPr>
-                <w:b w:val="0"/>
+            <w:tcW w:w="2592" w:type="dxa"/>
+          </w:tcPr>
+          <w:p>
+            <w:r>
+              <w:rPr>
                 <w:sz w:val="16"/>
               </w:rPr>
               <w:t>output_contract_evidence.md</w:t>
@@ -3709,8 +3467,8 @@
     <w:tbl>
       <w:tblPr>
         <w:tblStyle w:val="TableGrid"/>
-        <w:tblW w:type="auto" w:w="0"/>
-        <w:tblLook w:firstColumn="1" w:firstRow="1" w:lastColumn="0" w:lastRow="0" w:noHBand="0" w:noVBand="1" w:val="04A0"/>
+        <w:tblW w:w="0" w:type="auto"/>
+        <w:tblLook w:val="04A0" w:firstRow="1" w:lastRow="0" w:firstColumn="1" w:lastColumn="0" w:noHBand="0" w:noVBand="1"/>
       </w:tblPr>
       <w:tblGrid>
         <w:gridCol w:w="1481"/>
@@ -3724,10 +3482,9 @@
       <w:tr>
         <w:tc>
           <w:tcPr>
-            <w:tcW w:type="dxa" w:w="1481"/>
-          </w:tcPr>
-          <w:p>
-            <w:r/>
+            <w:tcW w:w="1481" w:type="dxa"/>
+          </w:tcPr>
+          <w:p>
             <w:r>
               <w:rPr>
                 <w:b/>
@@ -3739,10 +3496,9 @@
         </w:tc>
         <w:tc>
           <w:tcPr>
-            <w:tcW w:type="dxa" w:w="1481"/>
-          </w:tcPr>
-          <w:p>
-            <w:r/>
+            <w:tcW w:w="1481" w:type="dxa"/>
+          </w:tcPr>
+          <w:p>
             <w:r>
               <w:rPr>
                 <w:b/>
@@ -3754,10 +3510,9 @@
         </w:tc>
         <w:tc>
           <w:tcPr>
-            <w:tcW w:type="dxa" w:w="1481"/>
-          </w:tcPr>
-          <w:p>
-            <w:r/>
+            <w:tcW w:w="1481" w:type="dxa"/>
+          </w:tcPr>
+          <w:p>
             <w:r>
               <w:rPr>
                 <w:b/>
@@ -3769,10 +3524,9 @@
         </w:tc>
         <w:tc>
           <w:tcPr>
-            <w:tcW w:type="dxa" w:w="1481"/>
-          </w:tcPr>
-          <w:p>
-            <w:r/>
+            <w:tcW w:w="1481" w:type="dxa"/>
+          </w:tcPr>
+          <w:p>
             <w:r>
               <w:rPr>
                 <w:b/>
@@ -3784,10 +3538,9 @@
         </w:tc>
         <w:tc>
           <w:tcPr>
-            <w:tcW w:type="dxa" w:w="1481"/>
-          </w:tcPr>
-          <w:p>
-            <w:r/>
+            <w:tcW w:w="1481" w:type="dxa"/>
+          </w:tcPr>
+          <w:p>
             <w:r>
               <w:rPr>
                 <w:b/>
@@ -3799,10 +3552,9 @@
         </w:tc>
         <w:tc>
           <w:tcPr>
-            <w:tcW w:type="dxa" w:w="1481"/>
-          </w:tcPr>
-          <w:p>
-            <w:r/>
+            <w:tcW w:w="1481" w:type="dxa"/>
+          </w:tcPr>
+          <w:p>
             <w:r>
               <w:rPr>
                 <w:b/>
@@ -3814,10 +3566,9 @@
         </w:tc>
         <w:tc>
           <w:tcPr>
-            <w:tcW w:type="dxa" w:w="1481"/>
-          </w:tcPr>
-          <w:p>
-            <w:r/>
+            <w:tcW w:w="1481" w:type="dxa"/>
+          </w:tcPr>
+          <w:p>
             <w:r>
               <w:rPr>
                 <w:b/>
@@ -3831,13 +3582,11 @@
       <w:tr>
         <w:tc>
           <w:tcPr>
-            <w:tcW w:type="dxa" w:w="1481"/>
-          </w:tcPr>
-          <w:p>
-            <w:r/>
-            <w:r>
-              <w:rPr>
-                <w:b w:val="0"/>
+            <w:tcW w:w="1481" w:type="dxa"/>
+          </w:tcPr>
+          <w:p>
+            <w:r>
+              <w:rPr>
                 <w:sz w:val="16"/>
               </w:rPr>
               <w:t>No repair</w:t>
@@ -3846,13 +3595,11 @@
         </w:tc>
         <w:tc>
           <w:tcPr>
-            <w:tcW w:type="dxa" w:w="1481"/>
-          </w:tcPr>
-          <w:p>
-            <w:r/>
-            <w:r>
-              <w:rPr>
-                <w:b w:val="0"/>
+            <w:tcW w:w="1481" w:type="dxa"/>
+          </w:tcPr>
+          <w:p>
+            <w:r>
+              <w:rPr>
                 <w:sz w:val="16"/>
               </w:rPr>
               <w:t>86.1%</w:t>
@@ -3861,13 +3608,11 @@
         </w:tc>
         <w:tc>
           <w:tcPr>
-            <w:tcW w:type="dxa" w:w="1481"/>
-          </w:tcPr>
-          <w:p>
-            <w:r/>
-            <w:r>
-              <w:rPr>
-                <w:b w:val="0"/>
+            <w:tcW w:w="1481" w:type="dxa"/>
+          </w:tcPr>
+          <w:p>
+            <w:r>
+              <w:rPr>
                 <w:sz w:val="16"/>
               </w:rPr>
               <w:t>80.6%</w:t>
@@ -3876,13 +3621,11 @@
         </w:tc>
         <w:tc>
           <w:tcPr>
-            <w:tcW w:type="dxa" w:w="1481"/>
-          </w:tcPr>
-          <w:p>
-            <w:r/>
-            <w:r>
-              <w:rPr>
-                <w:b w:val="0"/>
+            <w:tcW w:w="1481" w:type="dxa"/>
+          </w:tcPr>
+          <w:p>
+            <w:r>
+              <w:rPr>
                 <w:sz w:val="16"/>
               </w:rPr>
               <w:t>0.0%</w:t>
@@ -3891,13 +3634,11 @@
         </w:tc>
         <w:tc>
           <w:tcPr>
-            <w:tcW w:type="dxa" w:w="1481"/>
-          </w:tcPr>
-          <w:p>
-            <w:r/>
-            <w:r>
-              <w:rPr>
-                <w:b w:val="0"/>
+            <w:tcW w:w="1481" w:type="dxa"/>
+          </w:tcPr>
+          <w:p>
+            <w:r>
+              <w:rPr>
                 <w:sz w:val="16"/>
               </w:rPr>
               <w:t>1.00</w:t>
@@ -3906,13 +3647,11 @@
         </w:tc>
         <w:tc>
           <w:tcPr>
-            <w:tcW w:type="dxa" w:w="1481"/>
-          </w:tcPr>
-          <w:p>
-            <w:r/>
-            <w:r>
-              <w:rPr>
-                <w:b w:val="0"/>
+            <w:tcW w:w="1481" w:type="dxa"/>
+          </w:tcPr>
+          <w:p>
+            <w:r>
+              <w:rPr>
                 <w:sz w:val="16"/>
               </w:rPr>
               <w:t>624.1</w:t>
@@ -3921,13 +3660,11 @@
         </w:tc>
         <w:tc>
           <w:tcPr>
-            <w:tcW w:type="dxa" w:w="1481"/>
-          </w:tcPr>
-          <w:p>
-            <w:r/>
-            <w:r>
-              <w:rPr>
-                <w:b w:val="0"/>
+            <w:tcW w:w="1481" w:type="dxa"/>
+          </w:tcPr>
+          <w:p>
+            <w:r>
+              <w:rPr>
                 <w:sz w:val="16"/>
               </w:rPr>
               <w:t>22,469</w:t>
@@ -3938,13 +3675,11 @@
       <w:tr>
         <w:tc>
           <w:tcPr>
-            <w:tcW w:type="dxa" w:w="1481"/>
-          </w:tcPr>
-          <w:p>
-            <w:r/>
-            <w:r>
-              <w:rPr>
-                <w:b w:val="0"/>
+            <w:tcW w:w="1481" w:type="dxa"/>
+          </w:tcPr>
+          <w:p>
+            <w:r>
+              <w:rPr>
                 <w:sz w:val="16"/>
               </w:rPr>
               <w:t>Global regeneration</w:t>
@@ -3953,13 +3688,11 @@
         </w:tc>
         <w:tc>
           <w:tcPr>
-            <w:tcW w:type="dxa" w:w="1481"/>
-          </w:tcPr>
-          <w:p>
-            <w:r/>
-            <w:r>
-              <w:rPr>
-                <w:b w:val="0"/>
+            <w:tcW w:w="1481" w:type="dxa"/>
+          </w:tcPr>
+          <w:p>
+            <w:r>
+              <w:rPr>
                 <w:sz w:val="16"/>
               </w:rPr>
               <w:t>88.9%</w:t>
@@ -3968,13 +3701,11 @@
         </w:tc>
         <w:tc>
           <w:tcPr>
-            <w:tcW w:type="dxa" w:w="1481"/>
-          </w:tcPr>
-          <w:p>
-            <w:r/>
-            <w:r>
-              <w:rPr>
-                <w:b w:val="0"/>
+            <w:tcW w:w="1481" w:type="dxa"/>
+          </w:tcPr>
+          <w:p>
+            <w:r>
+              <w:rPr>
                 <w:sz w:val="16"/>
               </w:rPr>
               <w:t>88.9%</w:t>
@@ -3983,13 +3714,11 @@
         </w:tc>
         <w:tc>
           <w:tcPr>
-            <w:tcW w:type="dxa" w:w="1481"/>
-          </w:tcPr>
-          <w:p>
-            <w:r/>
-            <w:r>
-              <w:rPr>
-                <w:b w:val="0"/>
+            <w:tcW w:w="1481" w:type="dxa"/>
+          </w:tcPr>
+          <w:p>
+            <w:r>
+              <w:rPr>
                 <w:sz w:val="16"/>
               </w:rPr>
               <w:t>42.9%</w:t>
@@ -3998,13 +3727,11 @@
         </w:tc>
         <w:tc>
           <w:tcPr>
-            <w:tcW w:type="dxa" w:w="1481"/>
-          </w:tcPr>
-          <w:p>
-            <w:r/>
-            <w:r>
-              <w:rPr>
-                <w:b w:val="0"/>
+            <w:tcW w:w="1481" w:type="dxa"/>
+          </w:tcPr>
+          <w:p>
+            <w:r>
+              <w:rPr>
                 <w:sz w:val="16"/>
               </w:rPr>
               <w:t>1.25</w:t>
@@ -4013,13 +3740,11 @@
         </w:tc>
         <w:tc>
           <w:tcPr>
-            <w:tcW w:type="dxa" w:w="1481"/>
-          </w:tcPr>
-          <w:p>
-            <w:r/>
-            <w:r>
-              <w:rPr>
-                <w:b w:val="0"/>
+            <w:tcW w:w="1481" w:type="dxa"/>
+          </w:tcPr>
+          <w:p>
+            <w:r>
+              <w:rPr>
                 <w:sz w:val="16"/>
               </w:rPr>
               <w:t>757.4</w:t>
@@ -4028,13 +3753,11 @@
         </w:tc>
         <w:tc>
           <w:tcPr>
-            <w:tcW w:type="dxa" w:w="1481"/>
-          </w:tcPr>
-          <w:p>
-            <w:r/>
-            <w:r>
-              <w:rPr>
-                <w:b w:val="0"/>
+            <w:tcW w:w="1481" w:type="dxa"/>
+          </w:tcPr>
+          <w:p>
+            <w:r>
+              <w:rPr>
                 <w:sz w:val="16"/>
               </w:rPr>
               <w:t>27,265</w:t>
@@ -4045,13 +3768,11 @@
       <w:tr>
         <w:tc>
           <w:tcPr>
-            <w:tcW w:type="dxa" w:w="1481"/>
-          </w:tcPr>
-          <w:p>
-            <w:r/>
-            <w:r>
-              <w:rPr>
-                <w:b w:val="0"/>
+            <w:tcW w:w="1481" w:type="dxa"/>
+          </w:tcPr>
+          <w:p>
+            <w:r>
+              <w:rPr>
                 <w:sz w:val="16"/>
               </w:rPr>
               <w:t>Uniform local</w:t>
@@ -4060,13 +3781,11 @@
         </w:tc>
         <w:tc>
           <w:tcPr>
-            <w:tcW w:type="dxa" w:w="1481"/>
-          </w:tcPr>
-          <w:p>
-            <w:r/>
-            <w:r>
-              <w:rPr>
-                <w:b w:val="0"/>
+            <w:tcW w:w="1481" w:type="dxa"/>
+          </w:tcPr>
+          <w:p>
+            <w:r>
+              <w:rPr>
                 <w:sz w:val="16"/>
               </w:rPr>
               <w:t>86.1%</w:t>
@@ -4075,13 +3794,11 @@
         </w:tc>
         <w:tc>
           <w:tcPr>
-            <w:tcW w:type="dxa" w:w="1481"/>
-          </w:tcPr>
-          <w:p>
-            <w:r/>
-            <w:r>
-              <w:rPr>
-                <w:b w:val="0"/>
+            <w:tcW w:w="1481" w:type="dxa"/>
+          </w:tcPr>
+          <w:p>
+            <w:r>
+              <w:rPr>
                 <w:sz w:val="16"/>
               </w:rPr>
               <w:t>83.3%</w:t>
@@ -4090,13 +3807,11 @@
         </w:tc>
         <w:tc>
           <w:tcPr>
-            <w:tcW w:type="dxa" w:w="1481"/>
-          </w:tcPr>
-          <w:p>
-            <w:r/>
-            <w:r>
-              <w:rPr>
-                <w:b w:val="0"/>
+            <w:tcW w:w="1481" w:type="dxa"/>
+          </w:tcPr>
+          <w:p>
+            <w:r>
+              <w:rPr>
                 <w:sz w:val="16"/>
               </w:rPr>
               <w:t>14.3%</w:t>
@@ -4105,13 +3820,11 @@
         </w:tc>
         <w:tc>
           <w:tcPr>
-            <w:tcW w:type="dxa" w:w="1481"/>
-          </w:tcPr>
-          <w:p>
-            <w:r/>
-            <w:r>
-              <w:rPr>
-                <w:b w:val="0"/>
+            <w:tcW w:w="1481" w:type="dxa"/>
+          </w:tcPr>
+          <w:p>
+            <w:r>
+              <w:rPr>
                 <w:sz w:val="16"/>
               </w:rPr>
               <w:t>1.25</w:t>
@@ -4120,13 +3833,11 @@
         </w:tc>
         <w:tc>
           <w:tcPr>
-            <w:tcW w:type="dxa" w:w="1481"/>
-          </w:tcPr>
-          <w:p>
-            <w:r/>
-            <w:r>
-              <w:rPr>
-                <w:b w:val="0"/>
+            <w:tcW w:w="1481" w:type="dxa"/>
+          </w:tcPr>
+          <w:p>
+            <w:r>
+              <w:rPr>
                 <w:sz w:val="16"/>
               </w:rPr>
               <w:t>772.1</w:t>
@@ -4135,13 +3846,11 @@
         </w:tc>
         <w:tc>
           <w:tcPr>
-            <w:tcW w:type="dxa" w:w="1481"/>
-          </w:tcPr>
-          <w:p>
-            <w:r/>
-            <w:r>
-              <w:rPr>
-                <w:b w:val="0"/>
+            <w:tcW w:w="1481" w:type="dxa"/>
+          </w:tcPr>
+          <w:p>
+            <w:r>
+              <w:rPr>
                 <w:sz w:val="16"/>
               </w:rPr>
               <w:t>27,796</w:t>
@@ -4152,28 +3861,25 @@
       <w:tr>
         <w:tc>
           <w:tcPr>
-            <w:tcW w:type="dxa" w:w="1481"/>
-          </w:tcPr>
-          <w:p>
-            <w:r/>
-            <w:r>
-              <w:rPr>
-                <w:b w:val="0"/>
-                <w:sz w:val="16"/>
-              </w:rPr>
+            <w:tcW w:w="1481" w:type="dxa"/>
+          </w:tcPr>
+          <w:p>
+            <w:r>
+              <w:rPr>
+                <w:sz w:val="16"/>
+              </w:rPr>
+              <w:lastRenderedPageBreak/>
               <w:t>Adaptive local</w:t>
             </w:r>
           </w:p>
         </w:tc>
         <w:tc>
           <w:tcPr>
-            <w:tcW w:type="dxa" w:w="1481"/>
-          </w:tcPr>
-          <w:p>
-            <w:r/>
-            <w:r>
-              <w:rPr>
-                <w:b w:val="0"/>
+            <w:tcW w:w="1481" w:type="dxa"/>
+          </w:tcPr>
+          <w:p>
+            <w:r>
+              <w:rPr>
                 <w:sz w:val="16"/>
               </w:rPr>
               <w:t>86.1%</w:t>
@@ -4182,13 +3888,11 @@
         </w:tc>
         <w:tc>
           <w:tcPr>
-            <w:tcW w:type="dxa" w:w="1481"/>
-          </w:tcPr>
-          <w:p>
-            <w:r/>
-            <w:r>
-              <w:rPr>
-                <w:b w:val="0"/>
+            <w:tcW w:w="1481" w:type="dxa"/>
+          </w:tcPr>
+          <w:p>
+            <w:r>
+              <w:rPr>
                 <w:sz w:val="16"/>
               </w:rPr>
               <w:t>86.1%</w:t>
@@ -4197,13 +3901,11 @@
         </w:tc>
         <w:tc>
           <w:tcPr>
-            <w:tcW w:type="dxa" w:w="1481"/>
-          </w:tcPr>
-          <w:p>
-            <w:r/>
-            <w:r>
-              <w:rPr>
-                <w:b w:val="0"/>
+            <w:tcW w:w="1481" w:type="dxa"/>
+          </w:tcPr>
+          <w:p>
+            <w:r>
+              <w:rPr>
                 <w:sz w:val="16"/>
               </w:rPr>
               <w:t>28.6%</w:t>
@@ -4212,13 +3914,11 @@
         </w:tc>
         <w:tc>
           <w:tcPr>
-            <w:tcW w:type="dxa" w:w="1481"/>
-          </w:tcPr>
-          <w:p>
-            <w:r/>
-            <w:r>
-              <w:rPr>
-                <w:b w:val="0"/>
+            <w:tcW w:w="1481" w:type="dxa"/>
+          </w:tcPr>
+          <w:p>
+            <w:r>
+              <w:rPr>
                 <w:sz w:val="16"/>
               </w:rPr>
               <w:t>1.17</w:t>
@@ -4227,13 +3927,11 @@
         </w:tc>
         <w:tc>
           <w:tcPr>
-            <w:tcW w:type="dxa" w:w="1481"/>
-          </w:tcPr>
-          <w:p>
-            <w:r/>
-            <w:r>
-              <w:rPr>
-                <w:b w:val="0"/>
+            <w:tcW w:w="1481" w:type="dxa"/>
+          </w:tcPr>
+          <w:p>
+            <w:r>
+              <w:rPr>
                 <w:sz w:val="16"/>
               </w:rPr>
               <w:t>721.5</w:t>
@@ -4242,13 +3940,11 @@
         </w:tc>
         <w:tc>
           <w:tcPr>
-            <w:tcW w:type="dxa" w:w="1481"/>
-          </w:tcPr>
-          <w:p>
-            <w:r/>
-            <w:r>
-              <w:rPr>
-                <w:b w:val="0"/>
+            <w:tcW w:w="1481" w:type="dxa"/>
+          </w:tcPr>
+          <w:p>
+            <w:r>
+              <w:rPr>
                 <w:sz w:val="16"/>
               </w:rPr>
               <w:t>25,975</w:t>
@@ -4286,24 +3982,23 @@
     <w:tbl>
       <w:tblPr>
         <w:tblStyle w:val="TableGrid"/>
-        <w:tblW w:type="auto" w:w="0"/>
-        <w:tblLook w:firstColumn="1" w:firstRow="1" w:lastColumn="0" w:lastRow="0" w:noHBand="0" w:noVBand="1" w:val="04A0"/>
+        <w:tblW w:w="0" w:type="auto"/>
+        <w:tblLook w:val="04A0" w:firstRow="1" w:lastRow="0" w:firstColumn="1" w:lastColumn="0" w:noHBand="0" w:noVBand="1"/>
       </w:tblPr>
       <w:tblGrid>
-        <w:gridCol w:w="1728"/>
-        <w:gridCol w:w="1728"/>
-        <w:gridCol w:w="1728"/>
-        <w:gridCol w:w="1728"/>
-        <w:gridCol w:w="1728"/>
-        <w:gridCol w:w="1728"/>
+        <w:gridCol w:w="1632"/>
+        <w:gridCol w:w="1992"/>
+        <w:gridCol w:w="2144"/>
+        <w:gridCol w:w="1601"/>
+        <w:gridCol w:w="1579"/>
+        <w:gridCol w:w="1636"/>
       </w:tblGrid>
       <w:tr>
         <w:tc>
           <w:tcPr>
-            <w:tcW w:type="dxa" w:w="1728"/>
-          </w:tcPr>
-          <w:p>
-            <w:r/>
+            <w:tcW w:w="1728" w:type="dxa"/>
+          </w:tcPr>
+          <w:p>
             <w:r>
               <w:rPr>
                 <w:b/>
@@ -4315,10 +4010,9 @@
         </w:tc>
         <w:tc>
           <w:tcPr>
-            <w:tcW w:type="dxa" w:w="1728"/>
-          </w:tcPr>
-          <w:p>
-            <w:r/>
+            <w:tcW w:w="1728" w:type="dxa"/>
+          </w:tcPr>
+          <w:p>
             <w:r>
               <w:rPr>
                 <w:b/>
@@ -4330,10 +4024,9 @@
         </w:tc>
         <w:tc>
           <w:tcPr>
-            <w:tcW w:type="dxa" w:w="1728"/>
-          </w:tcPr>
-          <w:p>
-            <w:r/>
+            <w:tcW w:w="1728" w:type="dxa"/>
+          </w:tcPr>
+          <w:p>
             <w:r>
               <w:rPr>
                 <w:b/>
@@ -4345,10 +4038,9 @@
         </w:tc>
         <w:tc>
           <w:tcPr>
-            <w:tcW w:type="dxa" w:w="1728"/>
-          </w:tcPr>
-          <w:p>
-            <w:r/>
+            <w:tcW w:w="1728" w:type="dxa"/>
+          </w:tcPr>
+          <w:p>
             <w:r>
               <w:rPr>
                 <w:b/>
@@ -4360,10 +4052,9 @@
         </w:tc>
         <w:tc>
           <w:tcPr>
-            <w:tcW w:type="dxa" w:w="1728"/>
-          </w:tcPr>
-          <w:p>
-            <w:r/>
+            <w:tcW w:w="1728" w:type="dxa"/>
+          </w:tcPr>
+          <w:p>
             <w:r>
               <w:rPr>
                 <w:b/>
@@ -4375,10 +4066,9 @@
         </w:tc>
         <w:tc>
           <w:tcPr>
-            <w:tcW w:type="dxa" w:w="1728"/>
-          </w:tcPr>
-          <w:p>
-            <w:r/>
+            <w:tcW w:w="1728" w:type="dxa"/>
+          </w:tcPr>
+          <w:p>
             <w:r>
               <w:rPr>
                 <w:b/>
@@ -4392,13 +4082,11 @@
       <w:tr>
         <w:tc>
           <w:tcPr>
-            <w:tcW w:type="dxa" w:w="1728"/>
-          </w:tcPr>
-          <w:p>
-            <w:r/>
-            <w:r>
-              <w:rPr>
-                <w:b w:val="0"/>
+            <w:tcW w:w="1728" w:type="dxa"/>
+          </w:tcPr>
+          <w:p>
+            <w:r>
+              <w:rPr>
                 <w:sz w:val="16"/>
               </w:rPr>
               <w:t>qwen2-math:1.5b</w:t>
@@ -4407,13 +4095,11 @@
         </w:tc>
         <w:tc>
           <w:tcPr>
-            <w:tcW w:type="dxa" w:w="1728"/>
-          </w:tcPr>
-          <w:p>
-            <w:r/>
-            <w:r>
-              <w:rPr>
-                <w:b w:val="0"/>
+            <w:tcW w:w="1728" w:type="dxa"/>
+          </w:tcPr>
+          <w:p>
+            <w:r>
+              <w:rPr>
                 <w:sz w:val="16"/>
               </w:rPr>
               <w:t>equation_json_default_v1</w:t>
@@ -4422,13 +4108,11 @@
         </w:tc>
         <w:tc>
           <w:tcPr>
-            <w:tcW w:type="dxa" w:w="1728"/>
-          </w:tcPr>
-          <w:p>
-            <w:r/>
-            <w:r>
-              <w:rPr>
-                <w:b w:val="0"/>
+            <w:tcW w:w="1728" w:type="dxa"/>
+          </w:tcPr>
+          <w:p>
+            <w:r>
+              <w:rPr>
                 <w:sz w:val="16"/>
               </w:rPr>
               <w:t>equation_parser_default_v1</w:t>
@@ -4437,13 +4121,11 @@
         </w:tc>
         <w:tc>
           <w:tcPr>
-            <w:tcW w:type="dxa" w:w="1728"/>
-          </w:tcPr>
-          <w:p>
-            <w:r/>
-            <w:r>
-              <w:rPr>
-                <w:b w:val="0"/>
+            <w:tcW w:w="1728" w:type="dxa"/>
+          </w:tcPr>
+          <w:p>
+            <w:r>
+              <w:rPr>
                 <w:sz w:val="16"/>
               </w:rPr>
               <w:t>0/108</w:t>
@@ -4452,13 +4134,11 @@
         </w:tc>
         <w:tc>
           <w:tcPr>
-            <w:tcW w:type="dxa" w:w="1728"/>
-          </w:tcPr>
-          <w:p>
-            <w:r/>
-            <w:r>
-              <w:rPr>
-                <w:b w:val="0"/>
+            <w:tcW w:w="1728" w:type="dxa"/>
+          </w:tcPr>
+          <w:p>
+            <w:r>
+              <w:rPr>
                 <w:sz w:val="16"/>
               </w:rPr>
               <w:t>90.7%</w:t>
@@ -4467,13 +4147,11 @@
         </w:tc>
         <w:tc>
           <w:tcPr>
-            <w:tcW w:type="dxa" w:w="1728"/>
-          </w:tcPr>
-          <w:p>
-            <w:r/>
-            <w:r>
-              <w:rPr>
-                <w:b w:val="0"/>
+            <w:tcW w:w="1728" w:type="dxa"/>
+          </w:tcPr>
+          <w:p>
+            <w:r>
+              <w:rPr>
                 <w:sz w:val="16"/>
               </w:rPr>
               <w:t>90.7%</w:t>
@@ -4484,13 +4162,11 @@
       <w:tr>
         <w:tc>
           <w:tcPr>
-            <w:tcW w:type="dxa" w:w="1728"/>
-          </w:tcPr>
-          <w:p>
-            <w:r/>
-            <w:r>
-              <w:rPr>
-                <w:b w:val="0"/>
+            <w:tcW w:w="1728" w:type="dxa"/>
+          </w:tcPr>
+          <w:p>
+            <w:r>
+              <w:rPr>
                 <w:sz w:val="16"/>
               </w:rPr>
               <w:t>qwen2.5:3b</w:t>
@@ -4499,13 +4175,11 @@
         </w:tc>
         <w:tc>
           <w:tcPr>
-            <w:tcW w:type="dxa" w:w="1728"/>
-          </w:tcPr>
-          <w:p>
-            <w:r/>
-            <w:r>
-              <w:rPr>
-                <w:b w:val="0"/>
+            <w:tcW w:w="1728" w:type="dxa"/>
+          </w:tcPr>
+          <w:p>
+            <w:r>
+              <w:rPr>
                 <w:sz w:val="16"/>
               </w:rPr>
               <w:t>equation_json_default_v1</w:t>
@@ -4514,13 +4188,11 @@
         </w:tc>
         <w:tc>
           <w:tcPr>
-            <w:tcW w:type="dxa" w:w="1728"/>
-          </w:tcPr>
-          <w:p>
-            <w:r/>
-            <w:r>
-              <w:rPr>
-                <w:b w:val="0"/>
+            <w:tcW w:w="1728" w:type="dxa"/>
+          </w:tcPr>
+          <w:p>
+            <w:r>
+              <w:rPr>
                 <w:sz w:val="16"/>
               </w:rPr>
               <w:t>equation_parser_default_v1</w:t>
@@ -4529,13 +4201,11 @@
         </w:tc>
         <w:tc>
           <w:tcPr>
-            <w:tcW w:type="dxa" w:w="1728"/>
-          </w:tcPr>
-          <w:p>
-            <w:r/>
-            <w:r>
-              <w:rPr>
-                <w:b w:val="0"/>
+            <w:tcW w:w="1728" w:type="dxa"/>
+          </w:tcPr>
+          <w:p>
+            <w:r>
+              <w:rPr>
                 <w:sz w:val="16"/>
               </w:rPr>
               <w:t>24/108</w:t>
@@ -4544,13 +4214,11 @@
         </w:tc>
         <w:tc>
           <w:tcPr>
-            <w:tcW w:type="dxa" w:w="1728"/>
-          </w:tcPr>
-          <w:p>
-            <w:r/>
-            <w:r>
-              <w:rPr>
-                <w:b w:val="0"/>
+            <w:tcW w:w="1728" w:type="dxa"/>
+          </w:tcPr>
+          <w:p>
+            <w:r>
+              <w:rPr>
                 <w:sz w:val="16"/>
               </w:rPr>
               <w:t>47.2%</w:t>
@@ -4559,13 +4227,11 @@
         </w:tc>
         <w:tc>
           <w:tcPr>
-            <w:tcW w:type="dxa" w:w="1728"/>
-          </w:tcPr>
-          <w:p>
-            <w:r/>
-            <w:r>
-              <w:rPr>
-                <w:b w:val="0"/>
+            <w:tcW w:w="1728" w:type="dxa"/>
+          </w:tcPr>
+          <w:p>
+            <w:r>
+              <w:rPr>
                 <w:sz w:val="16"/>
               </w:rPr>
               <w:t>59.3%</w:t>
@@ -4576,13 +4242,11 @@
       <w:tr>
         <w:tc>
           <w:tcPr>
-            <w:tcW w:type="dxa" w:w="1728"/>
-          </w:tcPr>
-          <w:p>
-            <w:r/>
-            <w:r>
-              <w:rPr>
-                <w:b w:val="0"/>
+            <w:tcW w:w="1728" w:type="dxa"/>
+          </w:tcPr>
+          <w:p>
+            <w:r>
+              <w:rPr>
                 <w:sz w:val="16"/>
               </w:rPr>
               <w:t>qwen2-math:7b</w:t>
@@ -4591,13 +4255,11 @@
         </w:tc>
         <w:tc>
           <w:tcPr>
-            <w:tcW w:type="dxa" w:w="1728"/>
-          </w:tcPr>
-          <w:p>
-            <w:r/>
-            <w:r>
-              <w:rPr>
-                <w:b w:val="0"/>
+            <w:tcW w:w="1728" w:type="dxa"/>
+          </w:tcPr>
+          <w:p>
+            <w:r>
+              <w:rPr>
                 <w:sz w:val="16"/>
               </w:rPr>
               <w:t>equation_json_default_v1</w:t>
@@ -4606,13 +4268,11 @@
         </w:tc>
         <w:tc>
           <w:tcPr>
-            <w:tcW w:type="dxa" w:w="1728"/>
-          </w:tcPr>
-          <w:p>
-            <w:r/>
-            <w:r>
-              <w:rPr>
-                <w:b w:val="0"/>
+            <w:tcW w:w="1728" w:type="dxa"/>
+          </w:tcPr>
+          <w:p>
+            <w:r>
+              <w:rPr>
                 <w:sz w:val="16"/>
               </w:rPr>
               <w:t>equation_parser_default_v1</w:t>
@@ -4621,13 +4281,11 @@
         </w:tc>
         <w:tc>
           <w:tcPr>
-            <w:tcW w:type="dxa" w:w="1728"/>
-          </w:tcPr>
-          <w:p>
-            <w:r/>
-            <w:r>
-              <w:rPr>
-                <w:b w:val="0"/>
+            <w:tcW w:w="1728" w:type="dxa"/>
+          </w:tcPr>
+          <w:p>
+            <w:r>
+              <w:rPr>
                 <w:sz w:val="16"/>
               </w:rPr>
               <w:t>91/108</w:t>
@@ -4636,13 +4294,11 @@
         </w:tc>
         <w:tc>
           <w:tcPr>
-            <w:tcW w:type="dxa" w:w="1728"/>
-          </w:tcPr>
-          <w:p>
-            <w:r/>
-            <w:r>
-              <w:rPr>
-                <w:b w:val="0"/>
+            <w:tcW w:w="1728" w:type="dxa"/>
+          </w:tcPr>
+          <w:p>
+            <w:r>
+              <w:rPr>
                 <w:sz w:val="16"/>
               </w:rPr>
               <w:t>13.0%</w:t>
@@ -4651,13 +4307,11 @@
         </w:tc>
         <w:tc>
           <w:tcPr>
-            <w:tcW w:type="dxa" w:w="1728"/>
-          </w:tcPr>
-          <w:p>
-            <w:r/>
-            <w:r>
-              <w:rPr>
-                <w:b w:val="0"/>
+            <w:tcW w:w="1728" w:type="dxa"/>
+          </w:tcPr>
+          <w:p>
+            <w:r>
+              <w:rPr>
                 <w:sz w:val="16"/>
               </w:rPr>
               <w:t>41.7%</w:t>
@@ -4668,13 +4322,11 @@
       <w:tr>
         <w:tc>
           <w:tcPr>
-            <w:tcW w:type="dxa" w:w="1728"/>
-          </w:tcPr>
-          <w:p>
-            <w:r/>
-            <w:r>
-              <w:rPr>
-                <w:b w:val="0"/>
+            <w:tcW w:w="1728" w:type="dxa"/>
+          </w:tcPr>
+          <w:p>
+            <w:r>
+              <w:rPr>
                 <w:sz w:val="16"/>
               </w:rPr>
               <w:t>qwen2-math:7b</w:t>
@@ -4683,13 +4335,11 @@
         </w:tc>
         <w:tc>
           <w:tcPr>
-            <w:tcW w:type="dxa" w:w="1728"/>
-          </w:tcPr>
-          <w:p>
-            <w:r/>
-            <w:r>
-              <w:rPr>
-                <w:b w:val="0"/>
+            <w:tcW w:w="1728" w:type="dxa"/>
+          </w:tcPr>
+          <w:p>
+            <w:r>
+              <w:rPr>
                 <w:sz w:val="16"/>
               </w:rPr>
               <w:t>equation_json_qwen2_v1</w:t>
@@ -4698,13 +4348,11 @@
         </w:tc>
         <w:tc>
           <w:tcPr>
-            <w:tcW w:type="dxa" w:w="1728"/>
-          </w:tcPr>
-          <w:p>
-            <w:r/>
-            <w:r>
-              <w:rPr>
-                <w:b w:val="0"/>
+            <w:tcW w:w="1728" w:type="dxa"/>
+          </w:tcPr>
+          <w:p>
+            <w:r>
+              <w:rPr>
                 <w:sz w:val="16"/>
               </w:rPr>
               <w:t>equation_parser_qwen2_v1</w:t>
@@ -4713,13 +4361,11 @@
         </w:tc>
         <w:tc>
           <w:tcPr>
-            <w:tcW w:type="dxa" w:w="1728"/>
-          </w:tcPr>
-          <w:p>
-            <w:r/>
-            <w:r>
-              <w:rPr>
-                <w:b w:val="0"/>
+            <w:tcW w:w="1728" w:type="dxa"/>
+          </w:tcPr>
+          <w:p>
+            <w:r>
+              <w:rPr>
                 <w:sz w:val="16"/>
               </w:rPr>
               <w:t>10/108</w:t>
@@ -4728,13 +4374,11 @@
         </w:tc>
         <w:tc>
           <w:tcPr>
-            <w:tcW w:type="dxa" w:w="1728"/>
-          </w:tcPr>
-          <w:p>
-            <w:r/>
-            <w:r>
-              <w:rPr>
-                <w:b w:val="0"/>
+            <w:tcW w:w="1728" w:type="dxa"/>
+          </w:tcPr>
+          <w:p>
+            <w:r>
+              <w:rPr>
                 <w:sz w:val="16"/>
               </w:rPr>
               <w:t>75.0%</w:t>
@@ -4743,13 +4387,11 @@
         </w:tc>
         <w:tc>
           <w:tcPr>
-            <w:tcW w:type="dxa" w:w="1728"/>
-          </w:tcPr>
-          <w:p>
-            <w:r/>
-            <w:r>
-              <w:rPr>
-                <w:b w:val="0"/>
+            <w:tcW w:w="1728" w:type="dxa"/>
+          </w:tcPr>
+          <w:p>
+            <w:r>
+              <w:rPr>
                 <w:sz w:val="16"/>
               </w:rPr>
               <w:t>79.6%</w:t>

</xml_diff>